<commit_message>
Audit bundled 2.8.9 manuals and update recent navigation workflows
</commit_message>
<xml_diff>
--- a/docs/v2/output/Celestial_Navigation_Manual_v2.docx
+++ b/docs/v2/output/Celestial_Navigation_Manual_v2.docx
@@ -41,7 +41,7 @@
         <w:rPr>
           <w:rStyle w:val="Strong"/>
         </w:rPr>
-        <w:t>Experimental v2 documentation</w:t>
+        <w:t>User manual</w:t>
       </w:r>
     </w:p>
     <w:p>
@@ -54,9 +54,9 @@
       </w:pPr>
       <w:r>
         <w:rPr/>
-        <w:t>Celestial Navigation plugin 2.8.5.4</w:t>
+        <w:t>Celestial Navigation plugin 2.8.9</w:t>
         <w:br/>
-        <w:t>Documentation revision 11 September 2026</w:t>
+        <w:t>Documentation revision 20 September 2026</w:t>
       </w:r>
     </w:p>
     <w:p>
@@ -144,7 +144,7 @@
         <w:rPr>
           <w:shd w:fill="FFF0F0" w:val="clear"/>
         </w:rPr>
-        <w:t xml:space="preserve"> This is experimental software and instructional material, not an approved primary means of navigation. Maintain an independent position, a proper dead-reckoning plot and all equipment and publications required for the voyage. Check results for plausibility. Never allow an attractive plot or numerical answer to override contrary navigational evidence.</w:t>
+        <w:t xml:space="preserve"> The plugin and this manual support celestial navigation and instruction. Maintain an independent position, a proper dead-reckoning plot and all equipment and publications required for the voyage. Check results for plausibility. Never allow an attractive plot or numerical answer to override contrary navigational evidence.</w:t>
       </w:r>
     </w:p>
     <w:p>
@@ -223,6 +223,23 @@
         <w:rPr>
           <w:rStyle w:val="Strong"/>
         </w:rPr>
+        <w:t>Current release:</w:t>
+      </w:r>
+      <w:r>
+        <w:rPr/>
+        <w:t xml:space="preserve"> this edition covers the per-sight DR-shift running fix, Find position sources, measured lunar-pair guidance and corrected Horizon Event display. The descriptions below match the 2.8.9 controls.</w:t>
+      </w:r>
+    </w:p>
+    <w:p>
+      <w:pPr>
+        <w:pStyle w:val="BodyText"/>
+        <w:bidi w:val="0"/>
+        <w:rPr/>
+      </w:pPr>
+      <w:r>
+        <w:rPr>
+          <w:rStyle w:val="Strong"/>
+        </w:rPr>
         <w:t>2.8.5.4 Find popup:</w:t>
       </w:r>
       <w:r>
@@ -316,6 +333,67 @@
       <w:r>
         <w:rPr/>
         <w:t>, below Hc, shows the reduced observed altitude in the same angle format as Hc. In a lunar Moon/body Find popup it is that body's reduced altitude, not the lunar distance. Copy estimated Hs is beside its estimate; Reset position is beside the coordinate controls. Neither Find Cancel nor Close writes the sights XML file directly.</w:t>
+      </w:r>
+    </w:p>
+    <w:p>
+      <w:pPr>
+        <w:pStyle w:val="BodyText"/>
+        <w:bidi w:val="0"/>
+        <w:rPr/>
+      </w:pPr>
+      <w:r>
+        <w:rPr/>
+        <w:t xml:space="preserve">The Find position selector offers </w:t>
+      </w:r>
+      <w:r>
+        <w:rPr>
+          <w:rStyle w:val="Strong"/>
+        </w:rPr>
+        <w:t>Manual</w:t>
+      </w:r>
+      <w:r>
+        <w:rPr/>
+        <w:t xml:space="preserve">, </w:t>
+      </w:r>
+      <w:r>
+        <w:rPr>
+          <w:rStyle w:val="Strong"/>
+        </w:rPr>
+        <w:t>Current boat position (live)</w:t>
+      </w:r>
+      <w:r>
+        <w:rPr/>
+        <w:t xml:space="preserve">, </w:t>
+      </w:r>
+      <w:r>
+        <w:rPr>
+          <w:rStyle w:val="Strong"/>
+        </w:rPr>
+        <w:t>Chart cursor</w:t>
+      </w:r>
+      <w:r>
+        <w:rPr/>
+        <w:t xml:space="preserve">, </w:t>
+      </w:r>
+      <w:r>
+        <w:rPr>
+          <w:rStyle w:val="Strong"/>
+        </w:rPr>
+        <w:t>Last calculated fix</w:t>
+      </w:r>
+      <w:r>
+        <w:rPr/>
+        <w:t xml:space="preserve"> and </w:t>
+      </w:r>
+      <w:r>
+        <w:rPr>
+          <w:rStyle w:val="Strong"/>
+        </w:rPr>
+        <w:t>Waypoint or place...</w:t>
+      </w:r>
+      <w:r>
+        <w:rPr/>
+        <w:t>. Chart cursor and waypoint choices capture coordinates; only the live boat choice follows subsequent boat updates. The last-fix source shows its epoch when known. Select Manual to edit coordinates. An unavailable source or a cancelled waypoint selection preserves the previous position. These are position aids: always check that the position is appropriate to the sight's recorded UTC.</w:t>
       </w:r>
     </w:p>
     <w:p>
@@ -2953,7 +3031,7 @@
         <w:rPr/>
         <w:drawing>
           <wp:inline distT="0" distB="0" distL="0" distR="0">
-            <wp:extent cx="5850000" cy="2992880"/>
+            <wp:extent cx="5850000" cy="2991302"/>
             <wp:effectExtent l="0" t="0" r="0" b="0"/>
             <wp:docPr id="6" name="Image6" title="Two globes comparing the predicted geographic position with correct UTC and a watch twenty minutes slow."/>
             <wp:cNvGraphicFramePr>
@@ -2977,7 +3055,7 @@
                   <pic:spPr bwMode="auto">
                     <a:xfrm>
                       <a:off x="0" y="0"/>
-                      <a:ext cx="5850000" cy="2992880"/>
+                      <a:ext cx="5850000" cy="2991302"/>
                     </a:xfrm>
                     <a:prstGeom prst="rect">
                       <a:avLst/>
@@ -5599,7 +5677,7 @@
       </w:pPr>
       <w:r>
         <w:rPr/>
-        <w:t xml:space="preserve">Preserve each observation's actual timestamp. </w:t>
+        <w:t xml:space="preserve">Preserve each observation's actual timestamp and show the sights to include. </w:t>
       </w:r>
     </w:p>
     <w:p>
@@ -5620,7 +5698,27 @@
       </w:pPr>
       <w:r>
         <w:rPr/>
-        <w:t xml:space="preserve">Choose the fix reference epoch, normally the latest observation. </w:t>
+        <w:t xml:space="preserve">Open </w:t>
+      </w:r>
+      <w:r>
+        <w:rPr>
+          <w:rStyle w:val="Strong"/>
+        </w:rPr>
+        <w:t>Fix…</w:t>
+      </w:r>
+      <w:r>
+        <w:rPr/>
+        <w:t xml:space="preserve"> and enable </w:t>
+      </w:r>
+      <w:r>
+        <w:rPr>
+          <w:rStyle w:val="Strong"/>
+        </w:rPr>
+        <w:t>Propagate every sight to a common epoch</w:t>
+      </w:r>
+      <w:r>
+        <w:rPr/>
+        <w:t xml:space="preserve">. </w:t>
       </w:r>
     </w:p>
     <w:p>
@@ -5641,7 +5739,7 @@
       </w:pPr>
       <w:r>
         <w:rPr/>
-        <w:t xml:space="preserve">Enter the best available true COG and SOG or equivalent displacement model. </w:t>
+        <w:t xml:space="preserve">Choose the reference epoch with its date, time and UTC or computer-local time basis. Normally this is the latest observation's corrected UTC. </w:t>
       </w:r>
     </w:p>
     <w:p>
@@ -5656,12 +5754,95 @@
           <w:tab w:val="left" w:pos="709" w:leader="none"/>
         </w:tabs>
         <w:bidi w:val="0"/>
+        <w:spacing w:before="0" w:after="0"/>
         <w:ind w:hanging="283" w:start="709"/>
         <w:rPr/>
       </w:pPr>
       <w:r>
         <w:rPr/>
-        <w:t xml:space="preserve">Solve, then examine residuals and whether the assumed motion was credible. </w:t>
+        <w:t xml:space="preserve">Select </w:t>
+      </w:r>
+      <w:r>
+        <w:rPr>
+          <w:rStyle w:val="Strong"/>
+        </w:rPr>
+        <w:t>One COG and SOG</w:t>
+      </w:r>
+      <w:r>
+        <w:rPr/>
+        <w:t xml:space="preserve"> for constant vessel motion, or </w:t>
+      </w:r>
+      <w:r>
+        <w:rPr>
+          <w:rStyle w:val="Strong"/>
+        </w:rPr>
+        <w:t>Each sight's DR Shift</w:t>
+      </w:r>
+      <w:r>
+        <w:rPr/>
+        <w:t xml:space="preserve"> for individually recorded displacements. </w:t>
+      </w:r>
+    </w:p>
+    <w:p>
+      <w:pPr>
+        <w:pStyle w:val="BodyText"/>
+        <w:numPr>
+          <w:ilvl w:val="0"/>
+          <w:numId w:val="11"/>
+        </w:numPr>
+        <w:tabs>
+          <w:tab w:val="clear" w:pos="1134"/>
+          <w:tab w:val="left" w:pos="709" w:leader="none"/>
+        </w:tabs>
+        <w:bidi w:val="0"/>
+        <w:ind w:hanging="283" w:start="709"/>
+        <w:rPr/>
+      </w:pPr>
+      <w:r>
+        <w:rPr/>
+        <w:t xml:space="preserve">Solve and inspect the included inputs, residuals, RMS and formal uncertainty ellipse. </w:t>
+      </w:r>
+    </w:p>
+    <w:p>
+      <w:pPr>
+        <w:pStyle w:val="BodyText"/>
+        <w:bidi w:val="0"/>
+        <w:rPr/>
+      </w:pPr>
+      <w:r>
+        <w:rPr/>
+        <w:t xml:space="preserve">With </w:t>
+      </w:r>
+      <w:r>
+        <w:rPr>
+          <w:rStyle w:val="Strong"/>
+        </w:rPr>
+        <w:t>One COG and SOG</w:t>
+      </w:r>
+      <w:r>
+        <w:rPr/>
+        <w:t xml:space="preserve">, enter the best available true course and speed; the solver ignores saved per-sight shifts. With </w:t>
+      </w:r>
+      <w:r>
+        <w:rPr>
+          <w:rStyle w:val="Strong"/>
+        </w:rPr>
+        <w:t>Each sight's DR Shift</w:t>
+      </w:r>
+      <w:r>
+        <w:rPr/>
+        <w:t>, enter each sight's distance and bearing travelled from that observation to the chosen epoch, using its DR Shift tab. The latest sight normally has zero shift. This supports changes of course or speed; the common COG/SOG controls are disabled and are not added again.</w:t>
+      </w:r>
+    </w:p>
+    <w:p>
+      <w:pPr>
+        <w:pStyle w:val="BodyText"/>
+        <w:bidi w:val="0"/>
+        <w:rPr/>
+      </w:pPr>
+      <w:r>
+        <w:rPr/>
+        <w:t>If any visible altitude or horizon sight has a non-zero saved shift, opening Fix automatically selects the per-sight mode and the latest visible sight's corrected UTC. Confirm that all shifts actually refer to that epoch, especially after changing the epoch. The results table shows the saved distance, whether the bearing is magnetic or true, and the true bearing used. These inputs stay visible even if the solution fails. With no saved shifts, the dialog retains its stationary default. Stationary plane/sphere/cone algorithms exclude shifted sights and report that exclusion; enable the running-fix option to use them.</w:t>
       </w:r>
     </w:p>
     <w:p>
@@ -6700,7 +6881,7 @@
       </w:r>
       <w:r>
         <w:rPr/>
-        <w:t xml:space="preserve"> ranks the offline body catalogue for a selected UTC and position. It displays Moon and body altitude, centre separation, distance rate in arcminutes per hour and the approximate time change corresponding to 0.1′ of distance. A small time value means useful time sensitivity. The quality text also penalises hidden/low bodies, awkward sextant angles, very unequal altitudes and faint stars.</w:t>
+        <w:t xml:space="preserve"> orders pairs by the approximate UTC change corresponding to 0.1′ of lunar distance, shortest first, with below-horizon pairs last. It shows centre separation, signed distance rate in arcminutes per hour, Moon/body altitude and true azimuth, Moon illumination, body magnitude and which body is below the geometric horizon. A small time value indicates greater timing sensitivity. There is no combined quality score: use the measured quantities to assess visibility, sextant range and whether the pair is practical to observe.</w:t>
       </w:r>
     </w:p>
     <w:p>
@@ -6770,28 +6951,48 @@
       </w:r>
       <w:r>
         <w:rPr/>
-        <w:t xml:space="preserve"> predicts the topocentric, refracted, apparent distance between two selected bodies for a stated UTC, position, pressure and temperature. Select centre-to-centre, near contact or far contact to match what was actually observed; limb contacts include the applicable semidiameters. Record repeated sextant readings, their uncertainty and any shade/note. The displayed correction is </w:t>
+        <w:t xml:space="preserve"> predicts the topocentric, refracted, apparent distance between two selected bodies for a stated UTC, position, pressure and temperature. Select centre-to-centre, near contact or far contact to match what was actually observed; limb contacts include the applicable semidiameters. Record repeated raw sextant readings, their independently measured index error, uncertainty and any shade/note. The displayed residual is </w:t>
       </w:r>
       <w:r>
         <w:rPr>
           <w:rStyle w:val="Emphasis"/>
         </w:rPr>
-        <w:t>predicted minus observed</w:t>
-      </w:r>
-      <w:r>
-        <w:rPr/>
-        <w:t>: add it to the raw reading.</w:t>
-      </w:r>
-    </w:p>
-    <w:p>
-      <w:pPr>
-        <w:pStyle w:val="BodyText"/>
-        <w:bidi w:val="0"/>
-        <w:rPr/>
-      </w:pPr>
-      <w:r>
-        <w:rPr/>
-        <w:t>The current sight index-error default is displayed for comparison but is not applied to this check. Applying a pre-existing correction while measuring the instrument's correction would make the calibration circular.</w:t>
+        <w:t>predicted apparent minus index-corrected observed</w:t>
+      </w:r>
+      <w:r>
+        <w:rPr/>
+        <w:t>: add it only after applying index error.</w:t>
+      </w:r>
+    </w:p>
+    <w:p>
+      <w:pPr>
+        <w:pStyle w:val="BodyText"/>
+        <w:bidi w:val="0"/>
+        <w:rPr/>
+      </w:pPr>
+      <w:r>
+        <w:rPr/>
+        <w:t xml:space="preserve">The editable </w:t>
+      </w:r>
+      <w:r>
+        <w:rPr>
+          <w:rStyle w:val="Strong"/>
+        </w:rPr>
+        <w:t>Measured IE (on arc +)</w:t>
+      </w:r>
+      <w:r>
+        <w:rPr/>
+        <w:t xml:space="preserve"> field starts with the current sight default. Enter an independently measured index error for the session. The raw observation is retained and the index-corrected apparent angle is </w:t>
+      </w:r>
+      <w:r>
+        <w:rPr>
+          <w:rStyle w:val="Emphasis"/>
+        </w:rPr>
+        <w:t>raw minus IE</w:t>
+      </w:r>
+      <w:r>
+        <w:rPr/>
+        <w:t>. The residual shown and saved in a new profile therefore describes scale/centering behaviour after index error, preventing the same index correction from being applied twice.</w:t>
       </w:r>
     </w:p>
     <w:p>
@@ -6819,7 +7020,7 @@
       </w:r>
       <w:r>
         <w:rPr/>
-        <w:t xml:space="preserve"> groups repeated checks by angular range and stores correction points, uncertainty, repeatability, instrument name and serial number in the plugin configuration. Select a saved profile to display its interpolated correction at the currently entered observed angle. Between tested angles the plugin uses straight-line interpolation; beyond the tested range it clearly marks the nearest endpoint rather than inventing a polynomial trend. The table is advisory and does not alter saved sights automatically, preserving the raw record and its provenance.</w:t>
+        <w:t xml:space="preserve"> groups repeated checks by angular range and stores residual correction points, uncertainty, repeatability, instrument name and serial number in the plugin configuration. Select a saved profile to display its interpolated correction after the entered index error. Between tested angles the plugin uses straight-line interpolation; beyond the tested range it clearly marks the nearest endpoint rather than inventing a polynomial trend. The table is advisory and does not alter saved sights automatically, preserving the raw record and its provenance. Profiles saved by older versions remain labelled as legacy total corrections: apply those directly to raw readings and do not apply index error separately.</w:t>
       </w:r>
     </w:p>
     <w:p>
@@ -7002,6 +7203,69 @@
       <w:r>
         <w:rPr/>
         <w:t xml:space="preserve">Read the estimated result and retain its stated limitations. </w:t>
+      </w:r>
+    </w:p>
+    <w:p>
+      <w:pPr>
+        <w:pStyle w:val="BodyText"/>
+        <w:bidi w:val="0"/>
+        <w:rPr/>
+      </w:pPr>
+      <w:r>
+        <w:rPr>
+          <w:rStyle w:val="Strong"/>
+        </w:rPr>
+        <w:t>Reading the chart:</w:t>
+      </w:r>
+      <w:r>
+        <w:rPr/>
+        <w:t xml:space="preserve"> the event time supplies an altitude line of position (LOP), with a band for the entered time and horizon uncertainty. An optional bearing adds nominal candidate markers along that LOP. There can be two valid positions, often in different hemispheres: use dead reckoning or other sights to distinguish them. Neither marker is a fix or a confidence area. The Fix dialog uses the time-based altitude constraint, not the optional bearing. A bearing uncertainty in degrees cannot be converted into a fixed nautical-mile radius; near weak geometry, small bearing changes can move a candidate hundreds of miles. The former filled circular estimate has been removed because it did not represent that uncertainty.</w:t>
+      </w:r>
+    </w:p>
+    <w:p>
+      <w:pPr>
+        <w:pStyle w:val="BodyText"/>
+        <w:bidi w:val="0"/>
+        <w:rPr/>
+      </w:pPr>
+      <w:r>
+        <w:rPr>
+          <w:rStyle w:val="Strong"/>
+        </w:rPr>
+        <w:t>UTC dates and a moving vessel:</w:t>
+      </w:r>
+      <w:r>
+        <w:rPr/>
+        <w:t xml:space="preserve"> order observations by their full UTC date and time. Near Hawaii, a sunset at 05:55 UTC on 16 July is the previous local evening, before a sunrise at 16:51 UTC on 16 July. The sunset after that sunrise normally has the next UTC date. When combining events on a moving vessel, enable a running fix and enter the vessel's course and speed to propagate each observation to a common epoch. The observed Sun bearing is an azimuth constraint to a distant celestial body, not a straight terrestrial bearing line drawn through an assumed boat position.</w:t>
+      </w:r>
+    </w:p>
+    <w:p>
+      <w:pPr>
+        <w:pStyle w:val="BodyText"/>
+        <w:bidi w:val="0"/>
+        <w:rPr/>
+      </w:pPr>
+      <w:r>
+        <w:rPr>
+          <w:rStyle w:val="Strong"/>
+        </w:rPr>
+        <w:t>Basis of the method:</w:t>
+      </w:r>
+      <w:r>
+        <w:rPr/>
+        <w:t xml:space="preserve"> this is an equal-altitude observation at upper-limb contact with the visible sea horizon. It uses the usual astronomical triangle with dip, refraction, solar semidiameter and parallax corrections. It is not a separate precision-fix method. The </w:t>
+      </w:r>
+      <w:hyperlink r:id="rId11">
+        <w:r>
+          <w:rPr>
+            <w:rStyle w:val="Hyperlink"/>
+          </w:rPr>
+          <w:t>US Naval Observatory's rise/set definitions</w:t>
+        </w:r>
+      </w:hyperlink>
+      <w:r>
+        <w:rPr/>
+        <w:t xml:space="preserve"> explain upper-limb contact and the conventional near-horizon refraction. Actual refraction varies; a sub-arcminute horizon uncertainty is usually too optimistic.</w:t>
       </w:r>
     </w:p>
     <w:p>
@@ -7055,7 +7319,7 @@
                     </pic:cNvPicPr>
                   </pic:nvPicPr>
                   <pic:blipFill>
-                    <a:blip r:embed="rId11"/>
+                    <a:blip r:embed="rId12"/>
                     <a:stretch>
                       <a:fillRect/>
                     </a:stretch>
@@ -13450,7 +13714,7 @@
         <w:rPr/>
         <w:t xml:space="preserve">, 2019/maintained digital edition, especially Chapters 14–20. </w:t>
       </w:r>
-      <w:hyperlink r:id="rId12">
+      <w:hyperlink r:id="rId13">
         <w:r>
           <w:rPr>
             <w:rStyle w:val="Hyperlink"/>
@@ -13493,7 +13757,7 @@
         <w:rPr/>
         <w:t xml:space="preserve">. </w:t>
       </w:r>
-      <w:hyperlink r:id="rId13">
+      <w:hyperlink r:id="rId14">
         <w:r>
           <w:rPr>
             <w:rStyle w:val="Hyperlink"/>
@@ -13536,7 +13800,7 @@
         <w:rPr/>
         <w:t xml:space="preserve">. </w:t>
       </w:r>
-      <w:hyperlink r:id="rId14">
+      <w:hyperlink r:id="rId15">
         <w:r>
           <w:rPr>
             <w:rStyle w:val="Hyperlink"/>
@@ -13579,7 +13843,7 @@
         <w:rPr/>
         <w:t xml:space="preserve">. </w:t>
       </w:r>
-      <w:hyperlink r:id="rId15">
+      <w:hyperlink r:id="rId16">
         <w:r>
           <w:rPr>
             <w:rStyle w:val="Hyperlink"/>
@@ -13612,7 +13876,7 @@
         <w:rPr/>
         <w:t xml:space="preserve">His Majesty's Nautical Almanac Office, overview and astronomical navigation services. </w:t>
       </w:r>
-      <w:hyperlink r:id="rId16">
+      <w:hyperlink r:id="rId17">
         <w:r>
           <w:rPr>
             <w:rStyle w:val="Hyperlink"/>

</xml_diff>

<commit_message>
Refresh local 2.9.0 manuals for planner and sight-log workflows
</commit_message>
<xml_diff>
--- a/docs/v2/output/Celestial_Navigation_Manual_v2.docx
+++ b/docs/v2/output/Celestial_Navigation_Manual_v2.docx
@@ -41,7 +41,7 @@
         <w:rPr>
           <w:rStyle w:val="Strong"/>
         </w:rPr>
-        <w:t>Experimental v2 documentation</w:t>
+        <w:t>User manual</w:t>
       </w:r>
     </w:p>
     <w:p>
@@ -54,9 +54,9 @@
       </w:pPr>
       <w:r>
         <w:rPr/>
-        <w:t>Celestial Navigation plugin 2.8.5.4</w:t>
+        <w:t>Celestial Navigation plugin 2.9.0</w:t>
         <w:br/>
-        <w:t>Documentation revision 11 September 2026</w:t>
+        <w:t>Documentation revision 20 September 2026</w:t>
       </w:r>
     </w:p>
     <w:p>
@@ -144,7 +144,7 @@
         <w:rPr>
           <w:shd w:fill="FFF0F0" w:val="clear"/>
         </w:rPr>
-        <w:t xml:space="preserve"> This is experimental software and instructional material, not an approved primary means of navigation. Maintain an independent position, a proper dead-reckoning plot and all equipment and publications required for the voyage. Check results for plausibility. Never allow an attractive plot or numerical answer to override contrary navigational evidence.</w:t>
+        <w:t xml:space="preserve"> The plugin and this manual support celestial navigation and instruction. Maintain an independent position, a proper dead-reckoning plot and all equipment and publications required for the voyage. Check results for plausibility. Never allow an attractive plot or numerical answer to override contrary navigational evidence.</w:t>
       </w:r>
     </w:p>
     <w:p>
@@ -223,6 +223,23 @@
         <w:rPr>
           <w:rStyle w:val="Strong"/>
         </w:rPr>
+        <w:t>This edition:</w:t>
+      </w:r>
+      <w:r>
+        <w:rPr/>
+        <w:t xml:space="preserve"> the manual covers the per-sight DR-shift running fix, Find position sources, measured lunar-pair guidance and corrected Horizon Event display, together with 2.9.0 planning modes, sky overlays, per-sight remarks and sight-log management.</w:t>
+      </w:r>
+    </w:p>
+    <w:p>
+      <w:pPr>
+        <w:pStyle w:val="BodyText"/>
+        <w:bidi w:val="0"/>
+        <w:rPr/>
+      </w:pPr>
+      <w:r>
+        <w:rPr>
+          <w:rStyle w:val="Strong"/>
+        </w:rPr>
         <w:t>2.8.5.4 Find popup:</w:t>
       </w:r>
       <w:r>
@@ -316,6 +333,67 @@
       <w:r>
         <w:rPr/>
         <w:t>, below Hc, shows the reduced observed altitude in the same angle format as Hc. In a lunar Moon/body Find popup it is that body's reduced altitude, not the lunar distance. Copy estimated Hs is beside its estimate; Reset position is beside the coordinate controls. Neither Find Cancel nor Close writes the sights XML file directly.</w:t>
+      </w:r>
+    </w:p>
+    <w:p>
+      <w:pPr>
+        <w:pStyle w:val="BodyText"/>
+        <w:bidi w:val="0"/>
+        <w:rPr/>
+      </w:pPr>
+      <w:r>
+        <w:rPr/>
+        <w:t xml:space="preserve">The Find position selector offers </w:t>
+      </w:r>
+      <w:r>
+        <w:rPr>
+          <w:rStyle w:val="Strong"/>
+        </w:rPr>
+        <w:t>Manual</w:t>
+      </w:r>
+      <w:r>
+        <w:rPr/>
+        <w:t xml:space="preserve">, </w:t>
+      </w:r>
+      <w:r>
+        <w:rPr>
+          <w:rStyle w:val="Strong"/>
+        </w:rPr>
+        <w:t>Current boat position (live)</w:t>
+      </w:r>
+      <w:r>
+        <w:rPr/>
+        <w:t xml:space="preserve">, </w:t>
+      </w:r>
+      <w:r>
+        <w:rPr>
+          <w:rStyle w:val="Strong"/>
+        </w:rPr>
+        <w:t>Chart cursor</w:t>
+      </w:r>
+      <w:r>
+        <w:rPr/>
+        <w:t xml:space="preserve">, </w:t>
+      </w:r>
+      <w:r>
+        <w:rPr>
+          <w:rStyle w:val="Strong"/>
+        </w:rPr>
+        <w:t>Last calculated fix</w:t>
+      </w:r>
+      <w:r>
+        <w:rPr/>
+        <w:t xml:space="preserve"> and </w:t>
+      </w:r>
+      <w:r>
+        <w:rPr>
+          <w:rStyle w:val="Strong"/>
+        </w:rPr>
+        <w:t>Waypoint or place...</w:t>
+      </w:r>
+      <w:r>
+        <w:rPr/>
+        <w:t>. Chart cursor and waypoint choices capture coordinates; only the live boat choice follows subsequent boat updates. The last-fix source shows its epoch when known. Select Manual to edit coordinates. An unavailable source or a cancelled waypoint selection preserves the previous position. These are position aids: always check that the position is appropriate to the sight's recorded UTC.</w:t>
       </w:r>
     </w:p>
     <w:p>
@@ -438,7 +516,7 @@
     </w:p>
     <w:tbl>
       <w:tblPr>
-        <w:tblW w:w="13080" w:type="dxa"/>
+        <w:tblW w:w="9752" w:type="dxa"/>
         <w:jc w:val="start"/>
         <w:tblInd w:w="0" w:type="dxa"/>
         <w:tblLayout w:type="fixed"/>
@@ -450,14 +528,14 @@
         </w:tblCellMar>
       </w:tblPr>
       <w:tblGrid>
-        <w:gridCol w:w="1123"/>
-        <w:gridCol w:w="11957"/>
+        <w:gridCol w:w="837"/>
+        <w:gridCol w:w="8915"/>
       </w:tblGrid>
       <w:tr>
         <w:trPr/>
         <w:tc>
           <w:tcPr>
-            <w:tcW w:w="1123" w:type="dxa"/>
+            <w:tcW w:w="837" w:type="dxa"/>
             <w:tcBorders/>
             <w:vAlign w:val="center"/>
           </w:tcPr>
@@ -479,7 +557,7 @@
         </w:tc>
         <w:tc>
           <w:tcPr>
-            <w:tcW w:w="11957" w:type="dxa"/>
+            <w:tcW w:w="8915" w:type="dxa"/>
             <w:tcBorders/>
             <w:vAlign w:val="center"/>
           </w:tcPr>
@@ -504,7 +582,7 @@
         <w:trPr/>
         <w:tc>
           <w:tcPr>
-            <w:tcW w:w="1123" w:type="dxa"/>
+            <w:tcW w:w="837" w:type="dxa"/>
             <w:tcBorders/>
             <w:vAlign w:val="center"/>
           </w:tcPr>
@@ -523,7 +601,7 @@
         </w:tc>
         <w:tc>
           <w:tcPr>
-            <w:tcW w:w="11957" w:type="dxa"/>
+            <w:tcW w:w="8915" w:type="dxa"/>
             <w:tcBorders/>
             <w:vAlign w:val="center"/>
           </w:tcPr>
@@ -545,7 +623,7 @@
         <w:trPr/>
         <w:tc>
           <w:tcPr>
-            <w:tcW w:w="1123" w:type="dxa"/>
+            <w:tcW w:w="837" w:type="dxa"/>
             <w:tcBorders/>
             <w:vAlign w:val="center"/>
           </w:tcPr>
@@ -564,7 +642,7 @@
         </w:tc>
         <w:tc>
           <w:tcPr>
-            <w:tcW w:w="11957" w:type="dxa"/>
+            <w:tcW w:w="8915" w:type="dxa"/>
             <w:tcBorders/>
             <w:vAlign w:val="center"/>
           </w:tcPr>
@@ -586,7 +664,7 @@
         <w:trPr/>
         <w:tc>
           <w:tcPr>
-            <w:tcW w:w="1123" w:type="dxa"/>
+            <w:tcW w:w="837" w:type="dxa"/>
             <w:tcBorders/>
             <w:vAlign w:val="center"/>
           </w:tcPr>
@@ -605,7 +683,7 @@
         </w:tc>
         <w:tc>
           <w:tcPr>
-            <w:tcW w:w="11957" w:type="dxa"/>
+            <w:tcW w:w="8915" w:type="dxa"/>
             <w:tcBorders/>
             <w:vAlign w:val="center"/>
           </w:tcPr>
@@ -627,7 +705,7 @@
         <w:trPr/>
         <w:tc>
           <w:tcPr>
-            <w:tcW w:w="1123" w:type="dxa"/>
+            <w:tcW w:w="837" w:type="dxa"/>
             <w:tcBorders/>
             <w:vAlign w:val="center"/>
           </w:tcPr>
@@ -646,7 +724,7 @@
         </w:tc>
         <w:tc>
           <w:tcPr>
-            <w:tcW w:w="11957" w:type="dxa"/>
+            <w:tcW w:w="8915" w:type="dxa"/>
             <w:tcBorders/>
             <w:vAlign w:val="center"/>
           </w:tcPr>
@@ -668,7 +746,7 @@
         <w:trPr/>
         <w:tc>
           <w:tcPr>
-            <w:tcW w:w="1123" w:type="dxa"/>
+            <w:tcW w:w="837" w:type="dxa"/>
             <w:tcBorders/>
             <w:vAlign w:val="center"/>
           </w:tcPr>
@@ -687,7 +765,7 @@
         </w:tc>
         <w:tc>
           <w:tcPr>
-            <w:tcW w:w="11957" w:type="dxa"/>
+            <w:tcW w:w="8915" w:type="dxa"/>
             <w:tcBorders/>
             <w:vAlign w:val="center"/>
           </w:tcPr>
@@ -709,7 +787,7 @@
         <w:trPr/>
         <w:tc>
           <w:tcPr>
-            <w:tcW w:w="1123" w:type="dxa"/>
+            <w:tcW w:w="837" w:type="dxa"/>
             <w:tcBorders/>
             <w:vAlign w:val="center"/>
           </w:tcPr>
@@ -728,7 +806,7 @@
         </w:tc>
         <w:tc>
           <w:tcPr>
-            <w:tcW w:w="11957" w:type="dxa"/>
+            <w:tcW w:w="8915" w:type="dxa"/>
             <w:tcBorders/>
             <w:vAlign w:val="center"/>
           </w:tcPr>
@@ -750,7 +828,7 @@
         <w:trPr/>
         <w:tc>
           <w:tcPr>
-            <w:tcW w:w="1123" w:type="dxa"/>
+            <w:tcW w:w="837" w:type="dxa"/>
             <w:tcBorders/>
             <w:vAlign w:val="center"/>
           </w:tcPr>
@@ -769,7 +847,7 @@
         </w:tc>
         <w:tc>
           <w:tcPr>
-            <w:tcW w:w="11957" w:type="dxa"/>
+            <w:tcW w:w="8915" w:type="dxa"/>
             <w:tcBorders/>
             <w:vAlign w:val="center"/>
           </w:tcPr>
@@ -791,7 +869,7 @@
         <w:trPr/>
         <w:tc>
           <w:tcPr>
-            <w:tcW w:w="1123" w:type="dxa"/>
+            <w:tcW w:w="837" w:type="dxa"/>
             <w:tcBorders/>
             <w:vAlign w:val="center"/>
           </w:tcPr>
@@ -810,7 +888,7 @@
         </w:tc>
         <w:tc>
           <w:tcPr>
-            <w:tcW w:w="11957" w:type="dxa"/>
+            <w:tcW w:w="8915" w:type="dxa"/>
             <w:tcBorders/>
             <w:vAlign w:val="center"/>
           </w:tcPr>
@@ -832,7 +910,7 @@
         <w:trPr/>
         <w:tc>
           <w:tcPr>
-            <w:tcW w:w="1123" w:type="dxa"/>
+            <w:tcW w:w="837" w:type="dxa"/>
             <w:tcBorders/>
             <w:vAlign w:val="center"/>
           </w:tcPr>
@@ -851,7 +929,7 @@
         </w:tc>
         <w:tc>
           <w:tcPr>
-            <w:tcW w:w="11957" w:type="dxa"/>
+            <w:tcW w:w="8915" w:type="dxa"/>
             <w:tcBorders/>
             <w:vAlign w:val="center"/>
           </w:tcPr>
@@ -873,7 +951,7 @@
         <w:trPr/>
         <w:tc>
           <w:tcPr>
-            <w:tcW w:w="1123" w:type="dxa"/>
+            <w:tcW w:w="837" w:type="dxa"/>
             <w:tcBorders/>
             <w:vAlign w:val="center"/>
           </w:tcPr>
@@ -892,7 +970,7 @@
         </w:tc>
         <w:tc>
           <w:tcPr>
-            <w:tcW w:w="11957" w:type="dxa"/>
+            <w:tcW w:w="8915" w:type="dxa"/>
             <w:tcBorders/>
             <w:vAlign w:val="center"/>
           </w:tcPr>
@@ -914,7 +992,7 @@
         <w:trPr/>
         <w:tc>
           <w:tcPr>
-            <w:tcW w:w="1123" w:type="dxa"/>
+            <w:tcW w:w="837" w:type="dxa"/>
             <w:tcBorders/>
             <w:vAlign w:val="center"/>
           </w:tcPr>
@@ -933,7 +1011,7 @@
         </w:tc>
         <w:tc>
           <w:tcPr>
-            <w:tcW w:w="11957" w:type="dxa"/>
+            <w:tcW w:w="8915" w:type="dxa"/>
             <w:tcBorders/>
             <w:vAlign w:val="center"/>
           </w:tcPr>
@@ -955,7 +1033,7 @@
         <w:trPr/>
         <w:tc>
           <w:tcPr>
-            <w:tcW w:w="1123" w:type="dxa"/>
+            <w:tcW w:w="837" w:type="dxa"/>
             <w:tcBorders/>
             <w:vAlign w:val="center"/>
           </w:tcPr>
@@ -974,7 +1052,7 @@
         </w:tc>
         <w:tc>
           <w:tcPr>
-            <w:tcW w:w="11957" w:type="dxa"/>
+            <w:tcW w:w="8915" w:type="dxa"/>
             <w:tcBorders/>
             <w:vAlign w:val="center"/>
           </w:tcPr>
@@ -996,7 +1074,7 @@
         <w:trPr/>
         <w:tc>
           <w:tcPr>
-            <w:tcW w:w="1123" w:type="dxa"/>
+            <w:tcW w:w="837" w:type="dxa"/>
             <w:tcBorders/>
             <w:vAlign w:val="center"/>
           </w:tcPr>
@@ -1015,7 +1093,7 @@
         </w:tc>
         <w:tc>
           <w:tcPr>
-            <w:tcW w:w="11957" w:type="dxa"/>
+            <w:tcW w:w="8915" w:type="dxa"/>
             <w:tcBorders/>
             <w:vAlign w:val="center"/>
           </w:tcPr>
@@ -2457,7 +2535,7 @@
     </w:p>
     <w:tbl>
       <w:tblPr>
-        <w:tblW w:w="13596" w:type="dxa"/>
+        <w:tblW w:w="9752" w:type="dxa"/>
         <w:jc w:val="start"/>
         <w:tblInd w:w="0" w:type="dxa"/>
         <w:tblLayout w:type="fixed"/>
@@ -2469,14 +2547,14 @@
         </w:tblCellMar>
       </w:tblPr>
       <w:tblGrid>
-        <w:gridCol w:w="1835"/>
-        <w:gridCol w:w="11761"/>
+        <w:gridCol w:w="1316"/>
+        <w:gridCol w:w="8436"/>
       </w:tblGrid>
       <w:tr>
         <w:trPr/>
         <w:tc>
           <w:tcPr>
-            <w:tcW w:w="1835" w:type="dxa"/>
+            <w:tcW w:w="1316" w:type="dxa"/>
             <w:tcBorders/>
             <w:vAlign w:val="center"/>
           </w:tcPr>
@@ -2498,7 +2576,7 @@
         </w:tc>
         <w:tc>
           <w:tcPr>
-            <w:tcW w:w="11761" w:type="dxa"/>
+            <w:tcW w:w="8436" w:type="dxa"/>
             <w:tcBorders/>
             <w:vAlign w:val="center"/>
           </w:tcPr>
@@ -2523,7 +2601,7 @@
         <w:trPr/>
         <w:tc>
           <w:tcPr>
-            <w:tcW w:w="1835" w:type="dxa"/>
+            <w:tcW w:w="1316" w:type="dxa"/>
             <w:tcBorders/>
             <w:vAlign w:val="center"/>
           </w:tcPr>
@@ -2542,7 +2620,7 @@
         </w:tc>
         <w:tc>
           <w:tcPr>
-            <w:tcW w:w="11761" w:type="dxa"/>
+            <w:tcW w:w="8436" w:type="dxa"/>
             <w:tcBorders/>
             <w:vAlign w:val="center"/>
           </w:tcPr>
@@ -2564,7 +2642,7 @@
         <w:trPr/>
         <w:tc>
           <w:tcPr>
-            <w:tcW w:w="1835" w:type="dxa"/>
+            <w:tcW w:w="1316" w:type="dxa"/>
             <w:tcBorders/>
             <w:vAlign w:val="center"/>
           </w:tcPr>
@@ -2583,7 +2661,7 @@
         </w:tc>
         <w:tc>
           <w:tcPr>
-            <w:tcW w:w="11761" w:type="dxa"/>
+            <w:tcW w:w="8436" w:type="dxa"/>
             <w:tcBorders/>
             <w:vAlign w:val="center"/>
           </w:tcPr>
@@ -2605,7 +2683,7 @@
         <w:trPr/>
         <w:tc>
           <w:tcPr>
-            <w:tcW w:w="1835" w:type="dxa"/>
+            <w:tcW w:w="1316" w:type="dxa"/>
             <w:tcBorders/>
             <w:vAlign w:val="center"/>
           </w:tcPr>
@@ -2624,7 +2702,7 @@
         </w:tc>
         <w:tc>
           <w:tcPr>
-            <w:tcW w:w="11761" w:type="dxa"/>
+            <w:tcW w:w="8436" w:type="dxa"/>
             <w:tcBorders/>
             <w:vAlign w:val="center"/>
           </w:tcPr>
@@ -2646,7 +2724,7 @@
         <w:trPr/>
         <w:tc>
           <w:tcPr>
-            <w:tcW w:w="1835" w:type="dxa"/>
+            <w:tcW w:w="1316" w:type="dxa"/>
             <w:tcBorders/>
             <w:vAlign w:val="center"/>
           </w:tcPr>
@@ -2665,7 +2743,7 @@
         </w:tc>
         <w:tc>
           <w:tcPr>
-            <w:tcW w:w="11761" w:type="dxa"/>
+            <w:tcW w:w="8436" w:type="dxa"/>
             <w:tcBorders/>
             <w:vAlign w:val="center"/>
           </w:tcPr>
@@ -2687,7 +2765,7 @@
         <w:trPr/>
         <w:tc>
           <w:tcPr>
-            <w:tcW w:w="1835" w:type="dxa"/>
+            <w:tcW w:w="1316" w:type="dxa"/>
             <w:tcBorders/>
             <w:vAlign w:val="center"/>
           </w:tcPr>
@@ -2706,7 +2784,7 @@
         </w:tc>
         <w:tc>
           <w:tcPr>
-            <w:tcW w:w="11761" w:type="dxa"/>
+            <w:tcW w:w="8436" w:type="dxa"/>
             <w:tcBorders/>
             <w:vAlign w:val="center"/>
           </w:tcPr>
@@ -2953,7 +3031,7 @@
         <w:rPr/>
         <w:drawing>
           <wp:inline distT="0" distB="0" distL="0" distR="0">
-            <wp:extent cx="5850000" cy="2992880"/>
+            <wp:extent cx="5850000" cy="2991302"/>
             <wp:effectExtent l="0" t="0" r="0" b="0"/>
             <wp:docPr id="6" name="Image6" title="Two globes comparing the predicted geographic position with correct UTC and a watch twenty minutes slow."/>
             <wp:cNvGraphicFramePr>
@@ -2977,7 +3055,7 @@
                   <pic:spPr bwMode="auto">
                     <a:xfrm>
                       <a:off x="0" y="0"/>
-                      <a:ext cx="5850000" cy="2992880"/>
+                      <a:ext cx="5850000" cy="2991302"/>
                     </a:xfrm>
                     <a:prstGeom prst="rect">
                       <a:avLst/>
@@ -3161,12 +3239,12 @@
       </w:pPr>
       <w:r>
         <w:rPr/>
-        <w:t>The main list contains stored observations. Its columns show sight type, body, UTC time, measurement and colour. The eye symbol controls whether a sight is plotted and included where a workflow uses visible sights.</w:t>
+        <w:t>The main list contains stored observations. Its columns show sight type, body, UTC time, measurement, colour and remarks. The eye symbol controls whether a sight is plotted and included where a workflow uses visible sights.</w:t>
       </w:r>
     </w:p>
     <w:tbl>
       <w:tblPr>
-        <w:tblW w:w="16471" w:type="dxa"/>
+        <w:tblW w:w="9752" w:type="dxa"/>
         <w:jc w:val="start"/>
         <w:tblInd w:w="0" w:type="dxa"/>
         <w:tblLayout w:type="fixed"/>
@@ -3178,14 +3256,14 @@
         </w:tblCellMar>
       </w:tblPr>
       <w:tblGrid>
-        <w:gridCol w:w="2533"/>
-        <w:gridCol w:w="13938"/>
+        <w:gridCol w:w="1500"/>
+        <w:gridCol w:w="8252"/>
       </w:tblGrid>
       <w:tr>
         <w:trPr/>
         <w:tc>
           <w:tcPr>
-            <w:tcW w:w="2533" w:type="dxa"/>
+            <w:tcW w:w="1500" w:type="dxa"/>
             <w:tcBorders/>
             <w:vAlign w:val="center"/>
           </w:tcPr>
@@ -3207,7 +3285,7 @@
         </w:tc>
         <w:tc>
           <w:tcPr>
-            <w:tcW w:w="13938" w:type="dxa"/>
+            <w:tcW w:w="8252" w:type="dxa"/>
             <w:tcBorders/>
             <w:vAlign w:val="center"/>
           </w:tcPr>
@@ -3232,7 +3310,7 @@
         <w:trPr/>
         <w:tc>
           <w:tcPr>
-            <w:tcW w:w="2533" w:type="dxa"/>
+            <w:tcW w:w="1500" w:type="dxa"/>
             <w:tcBorders/>
             <w:vAlign w:val="center"/>
           </w:tcPr>
@@ -3251,7 +3329,7 @@
         </w:tc>
         <w:tc>
           <w:tcPr>
-            <w:tcW w:w="13938" w:type="dxa"/>
+            <w:tcW w:w="8252" w:type="dxa"/>
             <w:tcBorders/>
             <w:vAlign w:val="center"/>
           </w:tcPr>
@@ -3273,7 +3351,7 @@
         <w:trPr/>
         <w:tc>
           <w:tcPr>
-            <w:tcW w:w="2533" w:type="dxa"/>
+            <w:tcW w:w="1500" w:type="dxa"/>
             <w:tcBorders/>
             <w:vAlign w:val="center"/>
           </w:tcPr>
@@ -3292,7 +3370,7 @@
         </w:tc>
         <w:tc>
           <w:tcPr>
-            <w:tcW w:w="13938" w:type="dxa"/>
+            <w:tcW w:w="8252" w:type="dxa"/>
             <w:tcBorders/>
             <w:vAlign w:val="center"/>
           </w:tcPr>
@@ -3314,7 +3392,7 @@
         <w:trPr/>
         <w:tc>
           <w:tcPr>
-            <w:tcW w:w="2533" w:type="dxa"/>
+            <w:tcW w:w="1500" w:type="dxa"/>
             <w:tcBorders/>
             <w:vAlign w:val="center"/>
           </w:tcPr>
@@ -3333,7 +3411,7 @@
         </w:tc>
         <w:tc>
           <w:tcPr>
-            <w:tcW w:w="13938" w:type="dxa"/>
+            <w:tcW w:w="8252" w:type="dxa"/>
             <w:tcBorders/>
             <w:vAlign w:val="center"/>
           </w:tcPr>
@@ -3355,7 +3433,7 @@
         <w:trPr/>
         <w:tc>
           <w:tcPr>
-            <w:tcW w:w="2533" w:type="dxa"/>
+            <w:tcW w:w="1500" w:type="dxa"/>
             <w:tcBorders/>
             <w:vAlign w:val="center"/>
           </w:tcPr>
@@ -3374,7 +3452,7 @@
         </w:tc>
         <w:tc>
           <w:tcPr>
-            <w:tcW w:w="13938" w:type="dxa"/>
+            <w:tcW w:w="8252" w:type="dxa"/>
             <w:tcBorders/>
             <w:vAlign w:val="center"/>
           </w:tcPr>
@@ -3396,7 +3474,7 @@
         <w:trPr/>
         <w:tc>
           <w:tcPr>
-            <w:tcW w:w="2533" w:type="dxa"/>
+            <w:tcW w:w="1500" w:type="dxa"/>
             <w:tcBorders/>
             <w:vAlign w:val="center"/>
           </w:tcPr>
@@ -3415,7 +3493,7 @@
         </w:tc>
         <w:tc>
           <w:tcPr>
-            <w:tcW w:w="13938" w:type="dxa"/>
+            <w:tcW w:w="8252" w:type="dxa"/>
             <w:tcBorders/>
             <w:vAlign w:val="center"/>
           </w:tcPr>
@@ -3437,7 +3515,7 @@
         <w:trPr/>
         <w:tc>
           <w:tcPr>
-            <w:tcW w:w="2533" w:type="dxa"/>
+            <w:tcW w:w="1500" w:type="dxa"/>
             <w:tcBorders/>
             <w:vAlign w:val="center"/>
           </w:tcPr>
@@ -3456,7 +3534,7 @@
         </w:tc>
         <w:tc>
           <w:tcPr>
-            <w:tcW w:w="13938" w:type="dxa"/>
+            <w:tcW w:w="8252" w:type="dxa"/>
             <w:tcBorders/>
             <w:vAlign w:val="center"/>
           </w:tcPr>
@@ -3478,7 +3556,7 @@
         <w:trPr/>
         <w:tc>
           <w:tcPr>
-            <w:tcW w:w="2533" w:type="dxa"/>
+            <w:tcW w:w="1500" w:type="dxa"/>
             <w:tcBorders/>
             <w:vAlign w:val="center"/>
           </w:tcPr>
@@ -3497,7 +3575,7 @@
         </w:tc>
         <w:tc>
           <w:tcPr>
-            <w:tcW w:w="13938" w:type="dxa"/>
+            <w:tcW w:w="8252" w:type="dxa"/>
             <w:tcBorders/>
             <w:vAlign w:val="center"/>
           </w:tcPr>
@@ -3519,7 +3597,7 @@
         <w:trPr/>
         <w:tc>
           <w:tcPr>
-            <w:tcW w:w="2533" w:type="dxa"/>
+            <w:tcW w:w="1500" w:type="dxa"/>
             <w:tcBorders/>
             <w:vAlign w:val="center"/>
           </w:tcPr>
@@ -3538,7 +3616,7 @@
         </w:tc>
         <w:tc>
           <w:tcPr>
-            <w:tcW w:w="13938" w:type="dxa"/>
+            <w:tcW w:w="8252" w:type="dxa"/>
             <w:tcBorders/>
             <w:vAlign w:val="center"/>
           </w:tcPr>
@@ -3560,7 +3638,7 @@
         <w:trPr/>
         <w:tc>
           <w:tcPr>
-            <w:tcW w:w="2533" w:type="dxa"/>
+            <w:tcW w:w="1500" w:type="dxa"/>
             <w:tcBorders/>
             <w:vAlign w:val="center"/>
           </w:tcPr>
@@ -3579,7 +3657,7 @@
         </w:tc>
         <w:tc>
           <w:tcPr>
-            <w:tcW w:w="13938" w:type="dxa"/>
+            <w:tcW w:w="8252" w:type="dxa"/>
             <w:tcBorders/>
             <w:vAlign w:val="center"/>
           </w:tcPr>
@@ -3601,7 +3679,7 @@
         <w:trPr/>
         <w:tc>
           <w:tcPr>
-            <w:tcW w:w="2533" w:type="dxa"/>
+            <w:tcW w:w="1500" w:type="dxa"/>
             <w:tcBorders/>
             <w:vAlign w:val="center"/>
           </w:tcPr>
@@ -3620,7 +3698,7 @@
         </w:tc>
         <w:tc>
           <w:tcPr>
-            <w:tcW w:w="13938" w:type="dxa"/>
+            <w:tcW w:w="8252" w:type="dxa"/>
             <w:tcBorders/>
             <w:vAlign w:val="center"/>
           </w:tcPr>
@@ -3642,39 +3720,39 @@
         <w:trPr/>
         <w:tc>
           <w:tcPr>
-            <w:tcW w:w="2533" w:type="dxa"/>
-            <w:tcBorders/>
-            <w:vAlign w:val="center"/>
-          </w:tcPr>
-          <w:p>
-            <w:pPr>
-              <w:pStyle w:val="TableContents"/>
-              <w:bidi w:val="0"/>
-              <w:spacing w:before="0" w:after="283"/>
-              <w:rPr/>
-            </w:pPr>
-            <w:r>
-              <w:rPr/>
-              <w:t>Clock Offset</w:t>
-            </w:r>
-          </w:p>
-        </w:tc>
-        <w:tc>
-          <w:tcPr>
-            <w:tcW w:w="13938" w:type="dxa"/>
-            <w:tcBorders/>
-            <w:vAlign w:val="center"/>
-          </w:tcPr>
-          <w:p>
-            <w:pPr>
-              <w:pStyle w:val="TableContents"/>
-              <w:bidi w:val="0"/>
-              <w:spacing w:before="0" w:after="283"/>
-              <w:rPr/>
-            </w:pPr>
-            <w:r>
-              <w:rPr/>
-              <w:t>Apply a common correction to stored sight times.</w:t>
+            <w:tcW w:w="1500" w:type="dxa"/>
+            <w:tcBorders/>
+            <w:vAlign w:val="center"/>
+          </w:tcPr>
+          <w:p>
+            <w:pPr>
+              <w:pStyle w:val="TableContents"/>
+              <w:bidi w:val="0"/>
+              <w:spacing w:before="0" w:after="283"/>
+              <w:rPr/>
+            </w:pPr>
+            <w:r>
+              <w:rPr/>
+              <w:t>Manage Sights…</w:t>
+            </w:r>
+          </w:p>
+        </w:tc>
+        <w:tc>
+          <w:tcPr>
+            <w:tcW w:w="8252" w:type="dxa"/>
+            <w:tcBorders/>
+            <w:vAlign w:val="center"/>
+          </w:tcPr>
+          <w:p>
+            <w:pPr>
+              <w:pStyle w:val="TableContents"/>
+              <w:bidi w:val="0"/>
+              <w:spacing w:before="0" w:after="283"/>
+              <w:rPr/>
+            </w:pPr>
+            <w:r>
+              <w:rPr/>
+              <w:t>Save a dated XML backup, add sights from another log, or restore a complete log.</w:t>
             </w:r>
           </w:p>
         </w:tc>
@@ -3683,39 +3761,39 @@
         <w:trPr/>
         <w:tc>
           <w:tcPr>
-            <w:tcW w:w="2533" w:type="dxa"/>
-            <w:tcBorders/>
-            <w:vAlign w:val="center"/>
-          </w:tcPr>
-          <w:p>
-            <w:pPr>
-              <w:pStyle w:val="TableContents"/>
-              <w:bidi w:val="0"/>
-              <w:spacing w:before="0" w:after="283"/>
-              <w:rPr/>
-            </w:pPr>
-            <w:r>
-              <w:rPr/>
-              <w:t>Hide Sights / Show Sights</w:t>
-            </w:r>
-          </w:p>
-        </w:tc>
-        <w:tc>
-          <w:tcPr>
-            <w:tcW w:w="13938" w:type="dxa"/>
-            <w:tcBorders/>
-            <w:vAlign w:val="center"/>
-          </w:tcPr>
-          <w:p>
-            <w:pPr>
-              <w:pStyle w:val="TableContents"/>
-              <w:bidi w:val="0"/>
-              <w:spacing w:before="0" w:after="283"/>
-              <w:rPr/>
-            </w:pPr>
-            <w:r>
-              <w:rPr/>
-              <w:t>Collapse or restore the sight list and controls.</w:t>
+            <w:tcW w:w="1500" w:type="dxa"/>
+            <w:tcBorders/>
+            <w:vAlign w:val="center"/>
+          </w:tcPr>
+          <w:p>
+            <w:pPr>
+              <w:pStyle w:val="TableContents"/>
+              <w:bidi w:val="0"/>
+              <w:spacing w:before="0" w:after="283"/>
+              <w:rPr/>
+            </w:pPr>
+            <w:r>
+              <w:rPr/>
+              <w:t>Clock Offset</w:t>
+            </w:r>
+          </w:p>
+        </w:tc>
+        <w:tc>
+          <w:tcPr>
+            <w:tcW w:w="8252" w:type="dxa"/>
+            <w:tcBorders/>
+            <w:vAlign w:val="center"/>
+          </w:tcPr>
+          <w:p>
+            <w:pPr>
+              <w:pStyle w:val="TableContents"/>
+              <w:bidi w:val="0"/>
+              <w:spacing w:before="0" w:after="283"/>
+              <w:rPr/>
+            </w:pPr>
+            <w:r>
+              <w:rPr/>
+              <w:t>Apply a common correction to stored sight times.</w:t>
             </w:r>
           </w:p>
         </w:tc>
@@ -3724,39 +3802,39 @@
         <w:trPr/>
         <w:tc>
           <w:tcPr>
-            <w:tcW w:w="2533" w:type="dxa"/>
-            <w:tcBorders/>
-            <w:vAlign w:val="center"/>
-          </w:tcPr>
-          <w:p>
-            <w:pPr>
-              <w:pStyle w:val="TableContents"/>
-              <w:bidi w:val="0"/>
-              <w:spacing w:before="0" w:after="283"/>
-              <w:rPr/>
-            </w:pPr>
-            <w:r>
-              <w:rPr/>
-              <w:t>Documentation</w:t>
-            </w:r>
-          </w:p>
-        </w:tc>
-        <w:tc>
-          <w:tcPr>
-            <w:tcW w:w="13938" w:type="dxa"/>
-            <w:tcBorders/>
-            <w:vAlign w:val="center"/>
-          </w:tcPr>
-          <w:p>
-            <w:pPr>
-              <w:pStyle w:val="TableContents"/>
-              <w:bidi w:val="0"/>
-              <w:spacing w:before="0" w:after="283"/>
-              <w:rPr/>
-            </w:pPr>
-            <w:r>
-              <w:rPr/>
-              <w:t>Open this completely offline manual in the plugin's internal viewer.</w:t>
+            <w:tcW w:w="1500" w:type="dxa"/>
+            <w:tcBorders/>
+            <w:vAlign w:val="center"/>
+          </w:tcPr>
+          <w:p>
+            <w:pPr>
+              <w:pStyle w:val="TableContents"/>
+              <w:bidi w:val="0"/>
+              <w:spacing w:before="0" w:after="283"/>
+              <w:rPr/>
+            </w:pPr>
+            <w:r>
+              <w:rPr/>
+              <w:t>Hide Sights / Show Sights</w:t>
+            </w:r>
+          </w:p>
+        </w:tc>
+        <w:tc>
+          <w:tcPr>
+            <w:tcW w:w="8252" w:type="dxa"/>
+            <w:tcBorders/>
+            <w:vAlign w:val="center"/>
+          </w:tcPr>
+          <w:p>
+            <w:pPr>
+              <w:pStyle w:val="TableContents"/>
+              <w:bidi w:val="0"/>
+              <w:spacing w:before="0" w:after="283"/>
+              <w:rPr/>
+            </w:pPr>
+            <w:r>
+              <w:rPr/>
+              <w:t>Collapse or restore the sight list and controls.</w:t>
             </w:r>
           </w:p>
         </w:tc>
@@ -3765,7 +3843,48 @@
         <w:trPr/>
         <w:tc>
           <w:tcPr>
-            <w:tcW w:w="2533" w:type="dxa"/>
+            <w:tcW w:w="1500" w:type="dxa"/>
+            <w:tcBorders/>
+            <w:vAlign w:val="center"/>
+          </w:tcPr>
+          <w:p>
+            <w:pPr>
+              <w:pStyle w:val="TableContents"/>
+              <w:bidi w:val="0"/>
+              <w:spacing w:before="0" w:after="283"/>
+              <w:rPr/>
+            </w:pPr>
+            <w:r>
+              <w:rPr/>
+              <w:t>Documentation</w:t>
+            </w:r>
+          </w:p>
+        </w:tc>
+        <w:tc>
+          <w:tcPr>
+            <w:tcW w:w="8252" w:type="dxa"/>
+            <w:tcBorders/>
+            <w:vAlign w:val="center"/>
+          </w:tcPr>
+          <w:p>
+            <w:pPr>
+              <w:pStyle w:val="TableContents"/>
+              <w:bidi w:val="0"/>
+              <w:spacing w:before="0" w:after="283"/>
+              <w:rPr/>
+            </w:pPr>
+            <w:r>
+              <w:rPr/>
+              <w:t>Open this completely offline manual in the plugin's internal viewer.</w:t>
+            </w:r>
+          </w:p>
+        </w:tc>
+      </w:tr>
+      <w:tr>
+        <w:trPr/>
+        <w:tc>
+          <w:tcPr>
+            <w:tcW w:w="1500" w:type="dxa"/>
             <w:tcBorders/>
             <w:vAlign w:val="center"/>
           </w:tcPr>
@@ -3784,7 +3903,7 @@
         </w:tc>
         <w:tc>
           <w:tcPr>
-            <w:tcW w:w="13938" w:type="dxa"/>
+            <w:tcW w:w="8252" w:type="dxa"/>
             <w:tcBorders/>
             <w:vAlign w:val="center"/>
           </w:tcPr>
@@ -3873,6 +3992,74 @@
       <w:r>
         <w:rPr/>
         <w:t>Creating a sight selects it and clears the previous selection. Deleting a selected sight moves the selection to an adjacent sight when one remains, so there is deliberately no unselected state while the list is non-empty.</w:t>
+      </w:r>
+    </w:p>
+    <w:p>
+      <w:pPr>
+        <w:pStyle w:val="BodyText"/>
+        <w:bidi w:val="0"/>
+        <w:rPr/>
+      </w:pPr>
+      <w:r>
+        <w:rPr>
+          <w:rStyle w:val="Strong"/>
+        </w:rPr>
+        <w:t>Remarks</w:t>
+      </w:r>
+      <w:r>
+        <w:rPr/>
+        <w:t xml:space="preserve"> stores a short note with an observation without altering its calculation. Enter it on the Sight Properties Parameters tab or in the Horizon Event editor. It is also shown in the main list.</w:t>
+      </w:r>
+    </w:p>
+    <w:p>
+      <w:pPr>
+        <w:pStyle w:val="BodyText"/>
+        <w:bidi w:val="0"/>
+        <w:rPr/>
+      </w:pPr>
+      <w:r>
+        <w:rPr/>
+        <w:t xml:space="preserve">The current log is saved automatically in </w:t>
+      </w:r>
+      <w:r>
+        <w:rPr>
+          <w:rStyle w:val="SourceText"/>
+        </w:rPr>
+        <w:t>Sights.xml</w:t>
+      </w:r>
+      <w:r>
+        <w:rPr/>
+        <w:t xml:space="preserve">. </w:t>
+      </w:r>
+      <w:r>
+        <w:rPr>
+          <w:rStyle w:val="Strong"/>
+        </w:rPr>
+        <w:t>Manage Sights… → Save backup of all sights...</w:t>
+      </w:r>
+      <w:r>
+        <w:rPr/>
+        <w:t xml:space="preserve"> offers a dated XML copy, initially in Downloads; choose another location if preferred. </w:t>
+      </w:r>
+      <w:r>
+        <w:rPr>
+          <w:rStyle w:val="Strong"/>
+        </w:rPr>
+        <w:t>Import sights (add to current log)...</w:t>
+      </w:r>
+      <w:r>
+        <w:rPr/>
+        <w:t xml:space="preserve"> adds sights and saved lunar solutions from another log and requires the same global clock correction. </w:t>
+      </w:r>
+      <w:r>
+        <w:rPr>
+          <w:rStyle w:val="Strong"/>
+        </w:rPr>
+        <w:t>Restore sights (replace current log)...</w:t>
+      </w:r>
+      <w:r>
+        <w:rPr/>
+        <w:t xml:space="preserve"> replaces both the log and its clock correction. Both operations validate the file and save a dated safety backup before changing the current log. Older files open with empty Remarks; older plugin versions may discard remarks when rewriting a newer file, so retain a backup before returning to an older version.</w:t>
       </w:r>
     </w:p>
     <w:p>
@@ -4675,7 +4862,68 @@
       </w:pPr>
       <w:r>
         <w:rPr/>
-        <w:t xml:space="preserve">The body list shows every catalogued body whose geometric Hc is at or above the horizon. Click any column heading to sort the table; click it again to reverse the order. </w:t>
+        <w:t xml:space="preserve">Choose a planning mode: </w:t>
+      </w:r>
+      <w:r>
+        <w:rPr>
+          <w:rStyle w:val="Strong"/>
+        </w:rPr>
+        <w:t>Practical Fix</w:t>
+      </w:r>
+      <w:r>
+        <w:rPr/>
+        <w:t xml:space="preserve"> favours observable bodies and pair/triad geometry; </w:t>
+      </w:r>
+      <w:r>
+        <w:rPr>
+          <w:rStyle w:val="Strong"/>
+        </w:rPr>
+        <w:t>Bright Bodies</w:t>
+      </w:r>
+      <w:r>
+        <w:rPr/>
+        <w:t xml:space="preserve"> puts brightness first; </w:t>
+      </w:r>
+      <w:r>
+        <w:rPr>
+          <w:rStyle w:val="Strong"/>
+        </w:rPr>
+        <w:t>Lunar Candidates</w:t>
+      </w:r>
+      <w:r>
+        <w:rPr/>
+        <w:t xml:space="preserve"> compares potential companions with the Moon; </w:t>
+      </w:r>
+      <w:r>
+        <w:rPr>
+          <w:rStyle w:val="Strong"/>
+        </w:rPr>
+        <w:t>Show All</w:t>
+      </w:r>
+      <w:r>
+        <w:rPr/>
+        <w:t xml:space="preserve"> lists bodies alphabetically.</w:t>
+      </w:r>
+    </w:p>
+    <w:p>
+      <w:pPr>
+        <w:pStyle w:val="BodyText"/>
+        <w:bidi w:val="0"/>
+        <w:rPr/>
+      </w:pPr>
+      <w:r>
+        <w:rPr/>
+        <w:t xml:space="preserve">The full body list remains available in each mode. It includes bodies above the geometric horizon; </w:t>
+      </w:r>
+      <w:r>
+        <w:rPr>
+          <w:rStyle w:val="Strong"/>
+        </w:rPr>
+        <w:t>Include below-horizon bodies</w:t>
+      </w:r>
+      <w:r>
+        <w:rPr/>
+        <w:t xml:space="preserve"> adds the rest. Click a column heading to sort it and again to reverse the order. </w:t>
       </w:r>
       <w:r>
         <w:rPr>
@@ -4695,6 +4943,23 @@
         <w:rPr/>
       </w:pPr>
       <w:r>
+        <w:rPr>
+          <w:rStyle w:val="Strong"/>
+        </w:rPr>
+        <w:t>Lunar Candidates</w:t>
+      </w:r>
+      <w:r>
+        <w:rPr/>
+        <w:t xml:space="preserve"> shows predicted geocentric Moon-body distance, signed distance rate, the seconds represented by 0.1′, companion ecliptic latitude, both altitudes and bearings, illumination and guidance. A positive rate means increasing distance. The suitability ordering combines timing rate, distance, ecliptic proximity, altitude and brightness. Read the flags for faint, low, daylight or awkward-distance pairs; the ordering is a planning aid. This differs from the separate Lunar Tools pair table, which orders by 0.1′ timing sensitivity with below-horizon pairs last.</w:t>
+      </w:r>
+    </w:p>
+    <w:p>
+      <w:pPr>
+        <w:pStyle w:val="BodyText"/>
+        <w:bidi w:val="0"/>
+        <w:rPr/>
+      </w:pPr>
+      <w:r>
         <w:rPr/>
         <w:t>The individual score gives 65% weight to altitude near 40° and 35% to brightness, with a daylight/twilight penalty for stars. Planets currently receive no equivalent twilight penalty, so the score is not by itself a guarantee that Mercury or another planet is practically observable. Suggested pairs additionally favour a crossing angle near 90°; triads rank their two-dimensional bearing geometry separately.</w:t>
       </w:r>
@@ -4708,6 +4973,53 @@
       <w:r>
         <w:rPr/>
         <w:t>The polar sky plot has independent magnitude limits of 1, 2 or 3 and can optionally show bodies below the horizon. Sun symbols are yellow, the Moon is blue, planets are red, stars rendered during daylight are grey, and below-horizon bodies are hollow. Labels favour the brightest bodies and share the available label allowance across the four compass quadrants. The allowance adapts to the plot size, and labels are still suppressed when they would overlap; an unlabeled dot does not mean the body is absent from the catalogue.</w:t>
+      </w:r>
+    </w:p>
+    <w:p>
+      <w:pPr>
+        <w:pStyle w:val="BodyText"/>
+        <w:bidi w:val="0"/>
+        <w:rPr/>
+      </w:pPr>
+      <w:r>
+        <w:rPr>
+          <w:rStyle w:val="Strong"/>
+        </w:rPr>
+        <w:t>Show ecliptic</w:t>
+      </w:r>
+      <w:r>
+        <w:rPr/>
+        <w:t xml:space="preserve"> and </w:t>
+      </w:r>
+      <w:r>
+        <w:rPr>
+          <w:rStyle w:val="Strong"/>
+        </w:rPr>
+        <w:t>Show Moon path</w:t>
+      </w:r>
+      <w:r>
+        <w:rPr/>
+        <w:t xml:space="preserve"> are independent overlays. The ecliptic defaults on and the Moon path off; the path can span ±3, ±6 or ±12 hours around the planning instant. </w:t>
+      </w:r>
+      <w:r>
+        <w:rPr>
+          <w:rStyle w:val="Strong"/>
+        </w:rPr>
+        <w:t>Local sky</w:t>
+      </w:r>
+      <w:r>
+        <w:rPr/>
+        <w:t xml:space="preserve"> shows altitude and true bearing at the planning position. </w:t>
+      </w:r>
+      <w:r>
+        <w:rPr>
+          <w:rStyle w:val="Strong"/>
+        </w:rPr>
+        <w:t>SHA / Declination</w:t>
+      </w:r>
+      <w:r>
+        <w:rPr/>
+        <w:t xml:space="preserve"> shows celestial coordinates and is useful for a longer Moon track. The ecliptic follows the date's obliquity and the Moon path follows the selected ephemeris. Neither replaces a visibility check.</w:t>
       </w:r>
     </w:p>
     <w:p>
@@ -5599,7 +5911,7 @@
       </w:pPr>
       <w:r>
         <w:rPr/>
-        <w:t xml:space="preserve">Preserve each observation's actual timestamp. </w:t>
+        <w:t xml:space="preserve">Preserve each observation's actual timestamp and show the sights to include. </w:t>
       </w:r>
     </w:p>
     <w:p>
@@ -5620,7 +5932,27 @@
       </w:pPr>
       <w:r>
         <w:rPr/>
-        <w:t xml:space="preserve">Choose the fix reference epoch, normally the latest observation. </w:t>
+        <w:t xml:space="preserve">Open </w:t>
+      </w:r>
+      <w:r>
+        <w:rPr>
+          <w:rStyle w:val="Strong"/>
+        </w:rPr>
+        <w:t>Fix…</w:t>
+      </w:r>
+      <w:r>
+        <w:rPr/>
+        <w:t xml:space="preserve"> and enable </w:t>
+      </w:r>
+      <w:r>
+        <w:rPr>
+          <w:rStyle w:val="Strong"/>
+        </w:rPr>
+        <w:t>Propagate every sight to a common epoch</w:t>
+      </w:r>
+      <w:r>
+        <w:rPr/>
+        <w:t xml:space="preserve">. </w:t>
       </w:r>
     </w:p>
     <w:p>
@@ -5641,7 +5973,7 @@
       </w:pPr>
       <w:r>
         <w:rPr/>
-        <w:t xml:space="preserve">Enter the best available true COG and SOG or equivalent displacement model. </w:t>
+        <w:t xml:space="preserve">Choose the reference epoch with its date, time and UTC or computer-local time basis. Normally this is the latest observation's corrected UTC. </w:t>
       </w:r>
     </w:p>
     <w:p>
@@ -5656,12 +5988,95 @@
           <w:tab w:val="left" w:pos="709" w:leader="none"/>
         </w:tabs>
         <w:bidi w:val="0"/>
+        <w:spacing w:before="0" w:after="0"/>
         <w:ind w:hanging="283" w:start="709"/>
         <w:rPr/>
       </w:pPr>
       <w:r>
         <w:rPr/>
-        <w:t xml:space="preserve">Solve, then examine residuals and whether the assumed motion was credible. </w:t>
+        <w:t xml:space="preserve">Select </w:t>
+      </w:r>
+      <w:r>
+        <w:rPr>
+          <w:rStyle w:val="Strong"/>
+        </w:rPr>
+        <w:t>One COG and SOG</w:t>
+      </w:r>
+      <w:r>
+        <w:rPr/>
+        <w:t xml:space="preserve"> for constant vessel motion, or </w:t>
+      </w:r>
+      <w:r>
+        <w:rPr>
+          <w:rStyle w:val="Strong"/>
+        </w:rPr>
+        <w:t>Each sight's DR Shift</w:t>
+      </w:r>
+      <w:r>
+        <w:rPr/>
+        <w:t xml:space="preserve"> for individually recorded displacements. </w:t>
+      </w:r>
+    </w:p>
+    <w:p>
+      <w:pPr>
+        <w:pStyle w:val="BodyText"/>
+        <w:numPr>
+          <w:ilvl w:val="0"/>
+          <w:numId w:val="11"/>
+        </w:numPr>
+        <w:tabs>
+          <w:tab w:val="clear" w:pos="1134"/>
+          <w:tab w:val="left" w:pos="709" w:leader="none"/>
+        </w:tabs>
+        <w:bidi w:val="0"/>
+        <w:ind w:hanging="283" w:start="709"/>
+        <w:rPr/>
+      </w:pPr>
+      <w:r>
+        <w:rPr/>
+        <w:t xml:space="preserve">Solve and inspect the included inputs, residuals, RMS and formal uncertainty ellipse. </w:t>
+      </w:r>
+    </w:p>
+    <w:p>
+      <w:pPr>
+        <w:pStyle w:val="BodyText"/>
+        <w:bidi w:val="0"/>
+        <w:rPr/>
+      </w:pPr>
+      <w:r>
+        <w:rPr/>
+        <w:t xml:space="preserve">With </w:t>
+      </w:r>
+      <w:r>
+        <w:rPr>
+          <w:rStyle w:val="Strong"/>
+        </w:rPr>
+        <w:t>One COG and SOG</w:t>
+      </w:r>
+      <w:r>
+        <w:rPr/>
+        <w:t xml:space="preserve">, enter the best available true course and speed; the solver ignores saved per-sight shifts. With </w:t>
+      </w:r>
+      <w:r>
+        <w:rPr>
+          <w:rStyle w:val="Strong"/>
+        </w:rPr>
+        <w:t>Each sight's DR Shift</w:t>
+      </w:r>
+      <w:r>
+        <w:rPr/>
+        <w:t>, enter each sight's distance and bearing travelled from that observation to the chosen epoch, using its DR Shift tab. The latest sight normally has zero shift. This supports changes of course or speed; the common COG/SOG controls are disabled and are not added again.</w:t>
+      </w:r>
+    </w:p>
+    <w:p>
+      <w:pPr>
+        <w:pStyle w:val="BodyText"/>
+        <w:bidi w:val="0"/>
+        <w:rPr/>
+      </w:pPr>
+      <w:r>
+        <w:rPr/>
+        <w:t>If any visible altitude or horizon sight has a non-zero saved shift, opening Fix automatically selects the per-sight mode and the latest visible sight's corrected UTC. Confirm that all shifts actually refer to that epoch, especially after changing the epoch. The results table shows the saved distance, whether the bearing is magnetic or true, and the true bearing used. These inputs stay visible even if the solution fails. With no saved shifts, the dialog retains its stationary default. Stationary plane/sphere/cone algorithms exclude shifted sights and report that exclusion; enable the running-fix option to use them.</w:t>
       </w:r>
     </w:p>
     <w:p>
@@ -5829,7 +6244,7 @@
       </w:pPr>
       <w:r>
         <w:rPr/>
-        <w:t>For a Moon–Sun calculation, the solver uses the checksum-verified local JPL DE440s kernel when it has already been imported for the eclipse module. A Moon–planet or Moon–star calculation, or any installation without DE440s, uses the bundled analytical ephemeris. The result identifies the ephemeris source used. DE440s is optional for ordinary navigation, no calculation downloads data, and LOLA terrain is unrelated to lunar-distance clearing.</w:t>
+        <w:t>When its checksum-verified local JPL DE440s kernel is installed and covers the sight date, Moon–Sun, Moon–Mercury and Moon–Venus calculations use it. Moon–star and other Moon–planet calculations, or any sight outside the compact kernel's range, use the bundled analytical ephemeris. The result identifies the source used. DE440s is optional for navigation, no calculation downloads data, and LOLA terrain is unrelated to lunar-distance clearing.</w:t>
       </w:r>
     </w:p>
     <w:p>
@@ -6700,7 +7115,18 @@
       </w:r>
       <w:r>
         <w:rPr/>
-        <w:t xml:space="preserve"> ranks the offline body catalogue for a selected UTC and position. It displays Moon and body altitude, centre separation, distance rate in arcminutes per hour and the approximate time change corresponding to 0.1′ of distance. A small time value means useful time sensitivity. The quality text also penalises hidden/low bodies, awkward sextant angles, very unequal altitudes and faint stars.</w:t>
+        <w:t xml:space="preserve"> orders pairs by the approximate UTC change corresponding to 0.1′ of lunar distance, shortest first, with below-horizon pairs last. It shows centre separation, signed distance rate in arcminutes per hour, Moon/body altitude and true azimuth, Moon illumination, body magnitude and which body is below the geometric horizon. A small time value indicates greater timing sensitivity. There is no combined quality score: use the measured quantities to assess visibility, sextant range and whether the pair is practical to observe.</w:t>
+      </w:r>
+    </w:p>
+    <w:p>
+      <w:pPr>
+        <w:pStyle w:val="BodyText"/>
+        <w:bidi w:val="0"/>
+        <w:rPr/>
+      </w:pPr>
+      <w:r>
+        <w:rPr/>
+        <w:t>In 2.9.0 this table also shows the companion's signed ecliptic latitude and guidance derived from the same planning model as the main planner. Its ordering still uses timing sensitivity, not the main planner's combined suitability score.</w:t>
       </w:r>
     </w:p>
     <w:p>
@@ -6770,28 +7196,48 @@
       </w:r>
       <w:r>
         <w:rPr/>
-        <w:t xml:space="preserve"> predicts the topocentric, refracted, apparent distance between two selected bodies for a stated UTC, position, pressure and temperature. Select centre-to-centre, near contact or far contact to match what was actually observed; limb contacts include the applicable semidiameters. Record repeated sextant readings, their uncertainty and any shade/note. The displayed correction is </w:t>
+        <w:t xml:space="preserve"> predicts the topocentric, refracted, apparent distance between two selected bodies for a stated UTC, position, pressure and temperature. Select centre-to-centre, near contact or far contact to match what was actually observed; limb contacts include the applicable semidiameters. Record repeated raw sextant readings, their independently measured index error, uncertainty and any shade/note. The displayed residual is </w:t>
       </w:r>
       <w:r>
         <w:rPr>
           <w:rStyle w:val="Emphasis"/>
         </w:rPr>
-        <w:t>predicted minus observed</w:t>
-      </w:r>
-      <w:r>
-        <w:rPr/>
-        <w:t>: add it to the raw reading.</w:t>
-      </w:r>
-    </w:p>
-    <w:p>
-      <w:pPr>
-        <w:pStyle w:val="BodyText"/>
-        <w:bidi w:val="0"/>
-        <w:rPr/>
-      </w:pPr>
-      <w:r>
-        <w:rPr/>
-        <w:t>The current sight index-error default is displayed for comparison but is not applied to this check. Applying a pre-existing correction while measuring the instrument's correction would make the calibration circular.</w:t>
+        <w:t>predicted apparent minus index-corrected observed</w:t>
+      </w:r>
+      <w:r>
+        <w:rPr/>
+        <w:t>: add it only after applying index error.</w:t>
+      </w:r>
+    </w:p>
+    <w:p>
+      <w:pPr>
+        <w:pStyle w:val="BodyText"/>
+        <w:bidi w:val="0"/>
+        <w:rPr/>
+      </w:pPr>
+      <w:r>
+        <w:rPr/>
+        <w:t xml:space="preserve">The editable </w:t>
+      </w:r>
+      <w:r>
+        <w:rPr>
+          <w:rStyle w:val="Strong"/>
+        </w:rPr>
+        <w:t>Measured IE (on arc +)</w:t>
+      </w:r>
+      <w:r>
+        <w:rPr/>
+        <w:t xml:space="preserve"> field starts with the current sight default. Enter an independently measured index error for the session. The raw observation is retained and the index-corrected apparent angle is </w:t>
+      </w:r>
+      <w:r>
+        <w:rPr>
+          <w:rStyle w:val="Emphasis"/>
+        </w:rPr>
+        <w:t>raw minus IE</w:t>
+      </w:r>
+      <w:r>
+        <w:rPr/>
+        <w:t>. The residual shown and saved in a new profile therefore describes scale/centering behaviour after index error, preventing the same index correction from being applied twice.</w:t>
       </w:r>
     </w:p>
     <w:p>
@@ -6819,7 +7265,7 @@
       </w:r>
       <w:r>
         <w:rPr/>
-        <w:t xml:space="preserve"> groups repeated checks by angular range and stores correction points, uncertainty, repeatability, instrument name and serial number in the plugin configuration. Select a saved profile to display its interpolated correction at the currently entered observed angle. Between tested angles the plugin uses straight-line interpolation; beyond the tested range it clearly marks the nearest endpoint rather than inventing a polynomial trend. The table is advisory and does not alter saved sights automatically, preserving the raw record and its provenance.</w:t>
+        <w:t xml:space="preserve"> groups repeated checks by angular range and stores residual correction points, uncertainty, repeatability, instrument name and serial number in the plugin configuration. Select a saved profile to display its interpolated correction after the entered index error. Between tested angles the plugin uses straight-line interpolation; beyond the tested range it clearly marks the nearest endpoint rather than inventing a polynomial trend. The table is advisory and does not alter saved sights automatically, preserving the raw record and its provenance. Profiles saved by older versions remain labelled as legacy total corrections: apply those directly to raw readings and do not apply index error separately.</w:t>
       </w:r>
     </w:p>
     <w:p>
@@ -7002,6 +7448,69 @@
       <w:r>
         <w:rPr/>
         <w:t xml:space="preserve">Read the estimated result and retain its stated limitations. </w:t>
+      </w:r>
+    </w:p>
+    <w:p>
+      <w:pPr>
+        <w:pStyle w:val="BodyText"/>
+        <w:bidi w:val="0"/>
+        <w:rPr/>
+      </w:pPr>
+      <w:r>
+        <w:rPr>
+          <w:rStyle w:val="Strong"/>
+        </w:rPr>
+        <w:t>Reading the chart:</w:t>
+      </w:r>
+      <w:r>
+        <w:rPr/>
+        <w:t xml:space="preserve"> the event time supplies an altitude line of position (LOP), with a band for the entered time and horizon uncertainty. An optional bearing adds nominal candidate markers along that LOP. There can be two valid positions, often in different hemispheres: use dead reckoning or other sights to distinguish them. Neither marker is a fix or a confidence area. The Fix dialog uses the time-based altitude constraint, not the optional bearing. A bearing uncertainty in degrees cannot be converted into a fixed nautical-mile radius; near weak geometry, small bearing changes can move a candidate hundreds of miles. The former filled circular estimate has been removed because it did not represent that uncertainty.</w:t>
+      </w:r>
+    </w:p>
+    <w:p>
+      <w:pPr>
+        <w:pStyle w:val="BodyText"/>
+        <w:bidi w:val="0"/>
+        <w:rPr/>
+      </w:pPr>
+      <w:r>
+        <w:rPr>
+          <w:rStyle w:val="Strong"/>
+        </w:rPr>
+        <w:t>UTC dates and a moving vessel:</w:t>
+      </w:r>
+      <w:r>
+        <w:rPr/>
+        <w:t xml:space="preserve"> order observations by their full UTC date and time. Near Hawaii, a sunset at 05:55 UTC on 16 July is the previous local evening, before a sunrise at 16:51 UTC on 16 July. The sunset after that sunrise normally has the next UTC date. When combining events on a moving vessel, enable a running fix and enter the vessel's course and speed to propagate each observation to a common epoch. The observed Sun bearing is an azimuth constraint to a distant celestial body, not a straight terrestrial bearing line drawn through an assumed boat position.</w:t>
+      </w:r>
+    </w:p>
+    <w:p>
+      <w:pPr>
+        <w:pStyle w:val="BodyText"/>
+        <w:bidi w:val="0"/>
+        <w:rPr/>
+      </w:pPr>
+      <w:r>
+        <w:rPr>
+          <w:rStyle w:val="Strong"/>
+        </w:rPr>
+        <w:t>Basis of the method:</w:t>
+      </w:r>
+      <w:r>
+        <w:rPr/>
+        <w:t xml:space="preserve"> this is an equal-altitude observation at upper-limb contact with the visible sea horizon. It uses the usual astronomical triangle with dip, refraction, solar semidiameter and parallax corrections. It is not a separate precision-fix method. The </w:t>
+      </w:r>
+      <w:hyperlink r:id="rId11">
+        <w:r>
+          <w:rPr>
+            <w:rStyle w:val="Hyperlink"/>
+          </w:rPr>
+          <w:t>US Naval Observatory's rise/set definitions</w:t>
+        </w:r>
+      </w:hyperlink>
+      <w:r>
+        <w:rPr/>
+        <w:t xml:space="preserve"> explain upper-limb contact and the conventional near-horizon refraction. Actual refraction varies; a sub-arcminute horizon uncertainty is usually too optimistic.</w:t>
       </w:r>
     </w:p>
     <w:p>
@@ -7055,7 +7564,7 @@
                     </pic:cNvPicPr>
                   </pic:nvPicPr>
                   <pic:blipFill>
-                    <a:blip r:embed="rId11"/>
+                    <a:blip r:embed="rId12"/>
                     <a:stretch>
                       <a:fillRect/>
                     </a:stretch>
@@ -8688,7 +9197,7 @@
     </w:p>
     <w:tbl>
       <w:tblPr>
-        <w:tblW w:w="12160" w:type="dxa"/>
+        <w:tblW w:w="9752" w:type="dxa"/>
         <w:jc w:val="start"/>
         <w:tblInd w:w="0" w:type="dxa"/>
         <w:tblLayout w:type="fixed"/>
@@ -8700,14 +9209,14 @@
         </w:tblCellMar>
       </w:tblPr>
       <w:tblGrid>
-        <w:gridCol w:w="1684"/>
-        <w:gridCol w:w="10476"/>
+        <w:gridCol w:w="1351"/>
+        <w:gridCol w:w="8401"/>
       </w:tblGrid>
       <w:tr>
         <w:trPr/>
         <w:tc>
           <w:tcPr>
-            <w:tcW w:w="1684" w:type="dxa"/>
+            <w:tcW w:w="1351" w:type="dxa"/>
             <w:tcBorders/>
             <w:vAlign w:val="center"/>
           </w:tcPr>
@@ -8729,7 +9238,7 @@
         </w:tc>
         <w:tc>
           <w:tcPr>
-            <w:tcW w:w="10476" w:type="dxa"/>
+            <w:tcW w:w="8401" w:type="dxa"/>
             <w:tcBorders/>
             <w:vAlign w:val="center"/>
           </w:tcPr>
@@ -8754,7 +9263,7 @@
         <w:trPr/>
         <w:tc>
           <w:tcPr>
-            <w:tcW w:w="1684" w:type="dxa"/>
+            <w:tcW w:w="1351" w:type="dxa"/>
             <w:tcBorders/>
             <w:vAlign w:val="center"/>
           </w:tcPr>
@@ -8773,7 +9282,7 @@
         </w:tc>
         <w:tc>
           <w:tcPr>
-            <w:tcW w:w="10476" w:type="dxa"/>
+            <w:tcW w:w="8401" w:type="dxa"/>
             <w:tcBorders/>
             <w:vAlign w:val="center"/>
           </w:tcPr>
@@ -8795,7 +9304,7 @@
         <w:trPr/>
         <w:tc>
           <w:tcPr>
-            <w:tcW w:w="1684" w:type="dxa"/>
+            <w:tcW w:w="1351" w:type="dxa"/>
             <w:tcBorders/>
             <w:vAlign w:val="center"/>
           </w:tcPr>
@@ -8814,7 +9323,7 @@
         </w:tc>
         <w:tc>
           <w:tcPr>
-            <w:tcW w:w="10476" w:type="dxa"/>
+            <w:tcW w:w="8401" w:type="dxa"/>
             <w:tcBorders/>
             <w:vAlign w:val="center"/>
           </w:tcPr>
@@ -8836,7 +9345,7 @@
         <w:trPr/>
         <w:tc>
           <w:tcPr>
-            <w:tcW w:w="1684" w:type="dxa"/>
+            <w:tcW w:w="1351" w:type="dxa"/>
             <w:tcBorders/>
             <w:vAlign w:val="center"/>
           </w:tcPr>
@@ -8855,7 +9364,7 @@
         </w:tc>
         <w:tc>
           <w:tcPr>
-            <w:tcW w:w="10476" w:type="dxa"/>
+            <w:tcW w:w="8401" w:type="dxa"/>
             <w:tcBorders/>
             <w:vAlign w:val="center"/>
           </w:tcPr>
@@ -8877,7 +9386,7 @@
         <w:trPr/>
         <w:tc>
           <w:tcPr>
-            <w:tcW w:w="1684" w:type="dxa"/>
+            <w:tcW w:w="1351" w:type="dxa"/>
             <w:tcBorders/>
             <w:vAlign w:val="center"/>
           </w:tcPr>
@@ -8896,7 +9405,7 @@
         </w:tc>
         <w:tc>
           <w:tcPr>
-            <w:tcW w:w="10476" w:type="dxa"/>
+            <w:tcW w:w="8401" w:type="dxa"/>
             <w:tcBorders/>
             <w:vAlign w:val="center"/>
           </w:tcPr>
@@ -8918,7 +9427,7 @@
         <w:trPr/>
         <w:tc>
           <w:tcPr>
-            <w:tcW w:w="1684" w:type="dxa"/>
+            <w:tcW w:w="1351" w:type="dxa"/>
             <w:tcBorders/>
             <w:vAlign w:val="center"/>
           </w:tcPr>
@@ -8937,7 +9446,7 @@
         </w:tc>
         <w:tc>
           <w:tcPr>
-            <w:tcW w:w="10476" w:type="dxa"/>
+            <w:tcW w:w="8401" w:type="dxa"/>
             <w:tcBorders/>
             <w:vAlign w:val="center"/>
           </w:tcPr>
@@ -8959,7 +9468,7 @@
         <w:trPr/>
         <w:tc>
           <w:tcPr>
-            <w:tcW w:w="1684" w:type="dxa"/>
+            <w:tcW w:w="1351" w:type="dxa"/>
             <w:tcBorders/>
             <w:vAlign w:val="center"/>
           </w:tcPr>
@@ -8978,7 +9487,7 @@
         </w:tc>
         <w:tc>
           <w:tcPr>
-            <w:tcW w:w="10476" w:type="dxa"/>
+            <w:tcW w:w="8401" w:type="dxa"/>
             <w:tcBorders/>
             <w:vAlign w:val="center"/>
           </w:tcPr>
@@ -9000,7 +9509,7 @@
         <w:trPr/>
         <w:tc>
           <w:tcPr>
-            <w:tcW w:w="1684" w:type="dxa"/>
+            <w:tcW w:w="1351" w:type="dxa"/>
             <w:tcBorders/>
             <w:vAlign w:val="center"/>
           </w:tcPr>
@@ -9019,7 +9528,7 @@
         </w:tc>
         <w:tc>
           <w:tcPr>
-            <w:tcW w:w="10476" w:type="dxa"/>
+            <w:tcW w:w="8401" w:type="dxa"/>
             <w:tcBorders/>
             <w:vAlign w:val="center"/>
           </w:tcPr>
@@ -9041,7 +9550,7 @@
         <w:trPr/>
         <w:tc>
           <w:tcPr>
-            <w:tcW w:w="1684" w:type="dxa"/>
+            <w:tcW w:w="1351" w:type="dxa"/>
             <w:tcBorders/>
             <w:vAlign w:val="center"/>
           </w:tcPr>
@@ -9060,7 +9569,7 @@
         </w:tc>
         <w:tc>
           <w:tcPr>
-            <w:tcW w:w="10476" w:type="dxa"/>
+            <w:tcW w:w="8401" w:type="dxa"/>
             <w:tcBorders/>
             <w:vAlign w:val="center"/>
           </w:tcPr>
@@ -9082,7 +9591,7 @@
         <w:trPr/>
         <w:tc>
           <w:tcPr>
-            <w:tcW w:w="1684" w:type="dxa"/>
+            <w:tcW w:w="1351" w:type="dxa"/>
             <w:tcBorders/>
             <w:vAlign w:val="center"/>
           </w:tcPr>
@@ -9101,7 +9610,7 @@
         </w:tc>
         <w:tc>
           <w:tcPr>
-            <w:tcW w:w="10476" w:type="dxa"/>
+            <w:tcW w:w="8401" w:type="dxa"/>
             <w:tcBorders/>
             <w:vAlign w:val="center"/>
           </w:tcPr>
@@ -9123,7 +9632,7 @@
         <w:trPr/>
         <w:tc>
           <w:tcPr>
-            <w:tcW w:w="1684" w:type="dxa"/>
+            <w:tcW w:w="1351" w:type="dxa"/>
             <w:tcBorders/>
             <w:vAlign w:val="center"/>
           </w:tcPr>
@@ -9142,7 +9651,7 @@
         </w:tc>
         <w:tc>
           <w:tcPr>
-            <w:tcW w:w="10476" w:type="dxa"/>
+            <w:tcW w:w="8401" w:type="dxa"/>
             <w:tcBorders/>
             <w:vAlign w:val="center"/>
           </w:tcPr>
@@ -9164,7 +9673,7 @@
         <w:trPr/>
         <w:tc>
           <w:tcPr>
-            <w:tcW w:w="1684" w:type="dxa"/>
+            <w:tcW w:w="1351" w:type="dxa"/>
             <w:tcBorders/>
             <w:vAlign w:val="center"/>
           </w:tcPr>
@@ -9183,7 +9692,7 @@
         </w:tc>
         <w:tc>
           <w:tcPr>
-            <w:tcW w:w="10476" w:type="dxa"/>
+            <w:tcW w:w="8401" w:type="dxa"/>
             <w:tcBorders/>
             <w:vAlign w:val="center"/>
           </w:tcPr>
@@ -9205,7 +9714,7 @@
         <w:trPr/>
         <w:tc>
           <w:tcPr>
-            <w:tcW w:w="1684" w:type="dxa"/>
+            <w:tcW w:w="1351" w:type="dxa"/>
             <w:tcBorders/>
             <w:vAlign w:val="center"/>
           </w:tcPr>
@@ -9224,7 +9733,7 @@
         </w:tc>
         <w:tc>
           <w:tcPr>
-            <w:tcW w:w="10476" w:type="dxa"/>
+            <w:tcW w:w="8401" w:type="dxa"/>
             <w:tcBorders/>
             <w:vAlign w:val="center"/>
           </w:tcPr>
@@ -9246,7 +9755,7 @@
         <w:trPr/>
         <w:tc>
           <w:tcPr>
-            <w:tcW w:w="1684" w:type="dxa"/>
+            <w:tcW w:w="1351" w:type="dxa"/>
             <w:tcBorders/>
             <w:vAlign w:val="center"/>
           </w:tcPr>
@@ -9265,7 +9774,7 @@
         </w:tc>
         <w:tc>
           <w:tcPr>
-            <w:tcW w:w="10476" w:type="dxa"/>
+            <w:tcW w:w="8401" w:type="dxa"/>
             <w:tcBorders/>
             <w:vAlign w:val="center"/>
           </w:tcPr>
@@ -9287,7 +9796,7 @@
         <w:trPr/>
         <w:tc>
           <w:tcPr>
-            <w:tcW w:w="1684" w:type="dxa"/>
+            <w:tcW w:w="1351" w:type="dxa"/>
             <w:tcBorders/>
             <w:vAlign w:val="center"/>
           </w:tcPr>
@@ -9306,7 +9815,7 @@
         </w:tc>
         <w:tc>
           <w:tcPr>
-            <w:tcW w:w="10476" w:type="dxa"/>
+            <w:tcW w:w="8401" w:type="dxa"/>
             <w:tcBorders/>
             <w:vAlign w:val="center"/>
           </w:tcPr>
@@ -9328,7 +9837,7 @@
         <w:trPr/>
         <w:tc>
           <w:tcPr>
-            <w:tcW w:w="1684" w:type="dxa"/>
+            <w:tcW w:w="1351" w:type="dxa"/>
             <w:tcBorders/>
             <w:vAlign w:val="center"/>
           </w:tcPr>
@@ -9347,7 +9856,7 @@
         </w:tc>
         <w:tc>
           <w:tcPr>
-            <w:tcW w:w="10476" w:type="dxa"/>
+            <w:tcW w:w="8401" w:type="dxa"/>
             <w:tcBorders/>
             <w:vAlign w:val="center"/>
           </w:tcPr>
@@ -9369,7 +9878,7 @@
         <w:trPr/>
         <w:tc>
           <w:tcPr>
-            <w:tcW w:w="1684" w:type="dxa"/>
+            <w:tcW w:w="1351" w:type="dxa"/>
             <w:tcBorders/>
             <w:vAlign w:val="center"/>
           </w:tcPr>
@@ -9388,7 +9897,7 @@
         </w:tc>
         <w:tc>
           <w:tcPr>
-            <w:tcW w:w="10476" w:type="dxa"/>
+            <w:tcW w:w="8401" w:type="dxa"/>
             <w:tcBorders/>
             <w:vAlign w:val="center"/>
           </w:tcPr>
@@ -9410,7 +9919,7 @@
         <w:trPr/>
         <w:tc>
           <w:tcPr>
-            <w:tcW w:w="1684" w:type="dxa"/>
+            <w:tcW w:w="1351" w:type="dxa"/>
             <w:tcBorders/>
             <w:vAlign w:val="center"/>
           </w:tcPr>
@@ -9429,7 +9938,7 @@
         </w:tc>
         <w:tc>
           <w:tcPr>
-            <w:tcW w:w="10476" w:type="dxa"/>
+            <w:tcW w:w="8401" w:type="dxa"/>
             <w:tcBorders/>
             <w:vAlign w:val="center"/>
           </w:tcPr>
@@ -9451,7 +9960,7 @@
         <w:trPr/>
         <w:tc>
           <w:tcPr>
-            <w:tcW w:w="1684" w:type="dxa"/>
+            <w:tcW w:w="1351" w:type="dxa"/>
             <w:tcBorders/>
             <w:vAlign w:val="center"/>
           </w:tcPr>
@@ -9470,7 +9979,7 @@
         </w:tc>
         <w:tc>
           <w:tcPr>
-            <w:tcW w:w="10476" w:type="dxa"/>
+            <w:tcW w:w="8401" w:type="dxa"/>
             <w:tcBorders/>
             <w:vAlign w:val="center"/>
           </w:tcPr>
@@ -9492,7 +10001,7 @@
         <w:trPr/>
         <w:tc>
           <w:tcPr>
-            <w:tcW w:w="1684" w:type="dxa"/>
+            <w:tcW w:w="1351" w:type="dxa"/>
             <w:tcBorders/>
             <w:vAlign w:val="center"/>
           </w:tcPr>
@@ -9511,7 +10020,7 @@
         </w:tc>
         <w:tc>
           <w:tcPr>
-            <w:tcW w:w="10476" w:type="dxa"/>
+            <w:tcW w:w="8401" w:type="dxa"/>
             <w:tcBorders/>
             <w:vAlign w:val="center"/>
           </w:tcPr>
@@ -9533,7 +10042,7 @@
         <w:trPr/>
         <w:tc>
           <w:tcPr>
-            <w:tcW w:w="1684" w:type="dxa"/>
+            <w:tcW w:w="1351" w:type="dxa"/>
             <w:tcBorders/>
             <w:vAlign w:val="center"/>
           </w:tcPr>
@@ -9552,7 +10061,7 @@
         </w:tc>
         <w:tc>
           <w:tcPr>
-            <w:tcW w:w="10476" w:type="dxa"/>
+            <w:tcW w:w="8401" w:type="dxa"/>
             <w:tcBorders/>
             <w:vAlign w:val="center"/>
           </w:tcPr>
@@ -9574,7 +10083,7 @@
         <w:trPr/>
         <w:tc>
           <w:tcPr>
-            <w:tcW w:w="1684" w:type="dxa"/>
+            <w:tcW w:w="1351" w:type="dxa"/>
             <w:tcBorders/>
             <w:vAlign w:val="center"/>
           </w:tcPr>
@@ -9593,7 +10102,7 @@
         </w:tc>
         <w:tc>
           <w:tcPr>
-            <w:tcW w:w="10476" w:type="dxa"/>
+            <w:tcW w:w="8401" w:type="dxa"/>
             <w:tcBorders/>
             <w:vAlign w:val="center"/>
           </w:tcPr>
@@ -9615,7 +10124,7 @@
         <w:trPr/>
         <w:tc>
           <w:tcPr>
-            <w:tcW w:w="1684" w:type="dxa"/>
+            <w:tcW w:w="1351" w:type="dxa"/>
             <w:tcBorders/>
             <w:vAlign w:val="center"/>
           </w:tcPr>
@@ -9634,7 +10143,7 @@
         </w:tc>
         <w:tc>
           <w:tcPr>
-            <w:tcW w:w="10476" w:type="dxa"/>
+            <w:tcW w:w="8401" w:type="dxa"/>
             <w:tcBorders/>
             <w:vAlign w:val="center"/>
           </w:tcPr>
@@ -9656,7 +10165,7 @@
         <w:trPr/>
         <w:tc>
           <w:tcPr>
-            <w:tcW w:w="1684" w:type="dxa"/>
+            <w:tcW w:w="1351" w:type="dxa"/>
             <w:tcBorders/>
             <w:vAlign w:val="center"/>
           </w:tcPr>
@@ -9675,7 +10184,7 @@
         </w:tc>
         <w:tc>
           <w:tcPr>
-            <w:tcW w:w="10476" w:type="dxa"/>
+            <w:tcW w:w="8401" w:type="dxa"/>
             <w:tcBorders/>
             <w:vAlign w:val="center"/>
           </w:tcPr>
@@ -9697,7 +10206,7 @@
         <w:trPr/>
         <w:tc>
           <w:tcPr>
-            <w:tcW w:w="1684" w:type="dxa"/>
+            <w:tcW w:w="1351" w:type="dxa"/>
             <w:tcBorders/>
             <w:vAlign w:val="center"/>
           </w:tcPr>
@@ -9716,7 +10225,7 @@
         </w:tc>
         <w:tc>
           <w:tcPr>
-            <w:tcW w:w="10476" w:type="dxa"/>
+            <w:tcW w:w="8401" w:type="dxa"/>
             <w:tcBorders/>
             <w:vAlign w:val="center"/>
           </w:tcPr>
@@ -9738,7 +10247,7 @@
         <w:trPr/>
         <w:tc>
           <w:tcPr>
-            <w:tcW w:w="1684" w:type="dxa"/>
+            <w:tcW w:w="1351" w:type="dxa"/>
             <w:tcBorders/>
             <w:vAlign w:val="center"/>
           </w:tcPr>
@@ -9757,7 +10266,7 @@
         </w:tc>
         <w:tc>
           <w:tcPr>
-            <w:tcW w:w="10476" w:type="dxa"/>
+            <w:tcW w:w="8401" w:type="dxa"/>
             <w:tcBorders/>
             <w:vAlign w:val="center"/>
           </w:tcPr>
@@ -9779,7 +10288,7 @@
         <w:trPr/>
         <w:tc>
           <w:tcPr>
-            <w:tcW w:w="1684" w:type="dxa"/>
+            <w:tcW w:w="1351" w:type="dxa"/>
             <w:tcBorders/>
             <w:vAlign w:val="center"/>
           </w:tcPr>
@@ -9798,7 +10307,7 @@
         </w:tc>
         <w:tc>
           <w:tcPr>
-            <w:tcW w:w="10476" w:type="dxa"/>
+            <w:tcW w:w="8401" w:type="dxa"/>
             <w:tcBorders/>
             <w:vAlign w:val="center"/>
           </w:tcPr>
@@ -9820,7 +10329,7 @@
         <w:trPr/>
         <w:tc>
           <w:tcPr>
-            <w:tcW w:w="1684" w:type="dxa"/>
+            <w:tcW w:w="1351" w:type="dxa"/>
             <w:tcBorders/>
             <w:vAlign w:val="center"/>
           </w:tcPr>
@@ -9839,7 +10348,7 @@
         </w:tc>
         <w:tc>
           <w:tcPr>
-            <w:tcW w:w="10476" w:type="dxa"/>
+            <w:tcW w:w="8401" w:type="dxa"/>
             <w:tcBorders/>
             <w:vAlign w:val="center"/>
           </w:tcPr>
@@ -9861,7 +10370,7 @@
         <w:trPr/>
         <w:tc>
           <w:tcPr>
-            <w:tcW w:w="1684" w:type="dxa"/>
+            <w:tcW w:w="1351" w:type="dxa"/>
             <w:tcBorders/>
             <w:vAlign w:val="center"/>
           </w:tcPr>
@@ -9880,7 +10389,7 @@
         </w:tc>
         <w:tc>
           <w:tcPr>
-            <w:tcW w:w="10476" w:type="dxa"/>
+            <w:tcW w:w="8401" w:type="dxa"/>
             <w:tcBorders/>
             <w:vAlign w:val="center"/>
           </w:tcPr>
@@ -9902,7 +10411,7 @@
         <w:trPr/>
         <w:tc>
           <w:tcPr>
-            <w:tcW w:w="1684" w:type="dxa"/>
+            <w:tcW w:w="1351" w:type="dxa"/>
             <w:tcBorders/>
             <w:vAlign w:val="center"/>
           </w:tcPr>
@@ -9921,7 +10430,7 @@
         </w:tc>
         <w:tc>
           <w:tcPr>
-            <w:tcW w:w="10476" w:type="dxa"/>
+            <w:tcW w:w="8401" w:type="dxa"/>
             <w:tcBorders/>
             <w:vAlign w:val="center"/>
           </w:tcPr>
@@ -9943,7 +10452,7 @@
         <w:trPr/>
         <w:tc>
           <w:tcPr>
-            <w:tcW w:w="1684" w:type="dxa"/>
+            <w:tcW w:w="1351" w:type="dxa"/>
             <w:tcBorders/>
             <w:vAlign w:val="center"/>
           </w:tcPr>
@@ -9962,7 +10471,7 @@
         </w:tc>
         <w:tc>
           <w:tcPr>
-            <w:tcW w:w="10476" w:type="dxa"/>
+            <w:tcW w:w="8401" w:type="dxa"/>
             <w:tcBorders/>
             <w:vAlign w:val="center"/>
           </w:tcPr>
@@ -9984,7 +10493,7 @@
         <w:trPr/>
         <w:tc>
           <w:tcPr>
-            <w:tcW w:w="1684" w:type="dxa"/>
+            <w:tcW w:w="1351" w:type="dxa"/>
             <w:tcBorders/>
             <w:vAlign w:val="center"/>
           </w:tcPr>
@@ -10003,7 +10512,7 @@
         </w:tc>
         <w:tc>
           <w:tcPr>
-            <w:tcW w:w="10476" w:type="dxa"/>
+            <w:tcW w:w="8401" w:type="dxa"/>
             <w:tcBorders/>
             <w:vAlign w:val="center"/>
           </w:tcPr>
@@ -10025,7 +10534,7 @@
         <w:trPr/>
         <w:tc>
           <w:tcPr>
-            <w:tcW w:w="1684" w:type="dxa"/>
+            <w:tcW w:w="1351" w:type="dxa"/>
             <w:tcBorders/>
             <w:vAlign w:val="center"/>
           </w:tcPr>
@@ -10044,7 +10553,7 @@
         </w:tc>
         <w:tc>
           <w:tcPr>
-            <w:tcW w:w="10476" w:type="dxa"/>
+            <w:tcW w:w="8401" w:type="dxa"/>
             <w:tcBorders/>
             <w:vAlign w:val="center"/>
           </w:tcPr>
@@ -10066,7 +10575,7 @@
         <w:trPr/>
         <w:tc>
           <w:tcPr>
-            <w:tcW w:w="1684" w:type="dxa"/>
+            <w:tcW w:w="1351" w:type="dxa"/>
             <w:tcBorders/>
             <w:vAlign w:val="center"/>
           </w:tcPr>
@@ -10085,7 +10594,7 @@
         </w:tc>
         <w:tc>
           <w:tcPr>
-            <w:tcW w:w="10476" w:type="dxa"/>
+            <w:tcW w:w="8401" w:type="dxa"/>
             <w:tcBorders/>
             <w:vAlign w:val="center"/>
           </w:tcPr>
@@ -10107,7 +10616,7 @@
         <w:trPr/>
         <w:tc>
           <w:tcPr>
-            <w:tcW w:w="1684" w:type="dxa"/>
+            <w:tcW w:w="1351" w:type="dxa"/>
             <w:tcBorders/>
             <w:vAlign w:val="center"/>
           </w:tcPr>
@@ -10126,7 +10635,7 @@
         </w:tc>
         <w:tc>
           <w:tcPr>
-            <w:tcW w:w="10476" w:type="dxa"/>
+            <w:tcW w:w="8401" w:type="dxa"/>
             <w:tcBorders/>
             <w:vAlign w:val="center"/>
           </w:tcPr>
@@ -10148,7 +10657,7 @@
         <w:trPr/>
         <w:tc>
           <w:tcPr>
-            <w:tcW w:w="1684" w:type="dxa"/>
+            <w:tcW w:w="1351" w:type="dxa"/>
             <w:tcBorders/>
             <w:vAlign w:val="center"/>
           </w:tcPr>
@@ -10167,7 +10676,7 @@
         </w:tc>
         <w:tc>
           <w:tcPr>
-            <w:tcW w:w="10476" w:type="dxa"/>
+            <w:tcW w:w="8401" w:type="dxa"/>
             <w:tcBorders/>
             <w:vAlign w:val="center"/>
           </w:tcPr>
@@ -10189,7 +10698,7 @@
         <w:trPr/>
         <w:tc>
           <w:tcPr>
-            <w:tcW w:w="1684" w:type="dxa"/>
+            <w:tcW w:w="1351" w:type="dxa"/>
             <w:tcBorders/>
             <w:vAlign w:val="center"/>
           </w:tcPr>
@@ -10208,7 +10717,7 @@
         </w:tc>
         <w:tc>
           <w:tcPr>
-            <w:tcW w:w="10476" w:type="dxa"/>
+            <w:tcW w:w="8401" w:type="dxa"/>
             <w:tcBorders/>
             <w:vAlign w:val="center"/>
           </w:tcPr>
@@ -10230,7 +10739,7 @@
         <w:trPr/>
         <w:tc>
           <w:tcPr>
-            <w:tcW w:w="1684" w:type="dxa"/>
+            <w:tcW w:w="1351" w:type="dxa"/>
             <w:tcBorders/>
             <w:vAlign w:val="center"/>
           </w:tcPr>
@@ -10249,7 +10758,7 @@
         </w:tc>
         <w:tc>
           <w:tcPr>
-            <w:tcW w:w="10476" w:type="dxa"/>
+            <w:tcW w:w="8401" w:type="dxa"/>
             <w:tcBorders/>
             <w:vAlign w:val="center"/>
           </w:tcPr>
@@ -10271,7 +10780,7 @@
         <w:trPr/>
         <w:tc>
           <w:tcPr>
-            <w:tcW w:w="1684" w:type="dxa"/>
+            <w:tcW w:w="1351" w:type="dxa"/>
             <w:tcBorders/>
             <w:vAlign w:val="center"/>
           </w:tcPr>
@@ -10290,7 +10799,7 @@
         </w:tc>
         <w:tc>
           <w:tcPr>
-            <w:tcW w:w="10476" w:type="dxa"/>
+            <w:tcW w:w="8401" w:type="dxa"/>
             <w:tcBorders/>
             <w:vAlign w:val="center"/>
           </w:tcPr>
@@ -10312,7 +10821,7 @@
         <w:trPr/>
         <w:tc>
           <w:tcPr>
-            <w:tcW w:w="1684" w:type="dxa"/>
+            <w:tcW w:w="1351" w:type="dxa"/>
             <w:tcBorders/>
             <w:vAlign w:val="center"/>
           </w:tcPr>
@@ -10331,7 +10840,7 @@
         </w:tc>
         <w:tc>
           <w:tcPr>
-            <w:tcW w:w="10476" w:type="dxa"/>
+            <w:tcW w:w="8401" w:type="dxa"/>
             <w:tcBorders/>
             <w:vAlign w:val="center"/>
           </w:tcPr>
@@ -10353,7 +10862,7 @@
         <w:trPr/>
         <w:tc>
           <w:tcPr>
-            <w:tcW w:w="1684" w:type="dxa"/>
+            <w:tcW w:w="1351" w:type="dxa"/>
             <w:tcBorders/>
             <w:vAlign w:val="center"/>
           </w:tcPr>
@@ -10372,7 +10881,7 @@
         </w:tc>
         <w:tc>
           <w:tcPr>
-            <w:tcW w:w="10476" w:type="dxa"/>
+            <w:tcW w:w="8401" w:type="dxa"/>
             <w:tcBorders/>
             <w:vAlign w:val="center"/>
           </w:tcPr>
@@ -10394,7 +10903,7 @@
         <w:trPr/>
         <w:tc>
           <w:tcPr>
-            <w:tcW w:w="1684" w:type="dxa"/>
+            <w:tcW w:w="1351" w:type="dxa"/>
             <w:tcBorders/>
             <w:vAlign w:val="center"/>
           </w:tcPr>
@@ -10413,7 +10922,7 @@
         </w:tc>
         <w:tc>
           <w:tcPr>
-            <w:tcW w:w="10476" w:type="dxa"/>
+            <w:tcW w:w="8401" w:type="dxa"/>
             <w:tcBorders/>
             <w:vAlign w:val="center"/>
           </w:tcPr>
@@ -10435,7 +10944,7 @@
         <w:trPr/>
         <w:tc>
           <w:tcPr>
-            <w:tcW w:w="1684" w:type="dxa"/>
+            <w:tcW w:w="1351" w:type="dxa"/>
             <w:tcBorders/>
             <w:vAlign w:val="center"/>
           </w:tcPr>
@@ -10454,7 +10963,7 @@
         </w:tc>
         <w:tc>
           <w:tcPr>
-            <w:tcW w:w="10476" w:type="dxa"/>
+            <w:tcW w:w="8401" w:type="dxa"/>
             <w:tcBorders/>
             <w:vAlign w:val="center"/>
           </w:tcPr>
@@ -10476,7 +10985,7 @@
         <w:trPr/>
         <w:tc>
           <w:tcPr>
-            <w:tcW w:w="1684" w:type="dxa"/>
+            <w:tcW w:w="1351" w:type="dxa"/>
             <w:tcBorders/>
             <w:vAlign w:val="center"/>
           </w:tcPr>
@@ -10495,7 +11004,7 @@
         </w:tc>
         <w:tc>
           <w:tcPr>
-            <w:tcW w:w="10476" w:type="dxa"/>
+            <w:tcW w:w="8401" w:type="dxa"/>
             <w:tcBorders/>
             <w:vAlign w:val="center"/>
           </w:tcPr>
@@ -10517,7 +11026,7 @@
         <w:trPr/>
         <w:tc>
           <w:tcPr>
-            <w:tcW w:w="1684" w:type="dxa"/>
+            <w:tcW w:w="1351" w:type="dxa"/>
             <w:tcBorders/>
             <w:vAlign w:val="center"/>
           </w:tcPr>
@@ -10536,7 +11045,7 @@
         </w:tc>
         <w:tc>
           <w:tcPr>
-            <w:tcW w:w="10476" w:type="dxa"/>
+            <w:tcW w:w="8401" w:type="dxa"/>
             <w:tcBorders/>
             <w:vAlign w:val="center"/>
           </w:tcPr>
@@ -10558,7 +11067,7 @@
         <w:trPr/>
         <w:tc>
           <w:tcPr>
-            <w:tcW w:w="1684" w:type="dxa"/>
+            <w:tcW w:w="1351" w:type="dxa"/>
             <w:tcBorders/>
             <w:vAlign w:val="center"/>
           </w:tcPr>
@@ -10577,7 +11086,7 @@
         </w:tc>
         <w:tc>
           <w:tcPr>
-            <w:tcW w:w="10476" w:type="dxa"/>
+            <w:tcW w:w="8401" w:type="dxa"/>
             <w:tcBorders/>
             <w:vAlign w:val="center"/>
           </w:tcPr>
@@ -10599,7 +11108,7 @@
         <w:trPr/>
         <w:tc>
           <w:tcPr>
-            <w:tcW w:w="1684" w:type="dxa"/>
+            <w:tcW w:w="1351" w:type="dxa"/>
             <w:tcBorders/>
             <w:vAlign w:val="center"/>
           </w:tcPr>
@@ -10618,7 +11127,7 @@
         </w:tc>
         <w:tc>
           <w:tcPr>
-            <w:tcW w:w="10476" w:type="dxa"/>
+            <w:tcW w:w="8401" w:type="dxa"/>
             <w:tcBorders/>
             <w:vAlign w:val="center"/>
           </w:tcPr>
@@ -10640,7 +11149,7 @@
         <w:trPr/>
         <w:tc>
           <w:tcPr>
-            <w:tcW w:w="1684" w:type="dxa"/>
+            <w:tcW w:w="1351" w:type="dxa"/>
             <w:tcBorders/>
             <w:vAlign w:val="center"/>
           </w:tcPr>
@@ -10659,7 +11168,7 @@
         </w:tc>
         <w:tc>
           <w:tcPr>
-            <w:tcW w:w="10476" w:type="dxa"/>
+            <w:tcW w:w="8401" w:type="dxa"/>
             <w:tcBorders/>
             <w:vAlign w:val="center"/>
           </w:tcPr>
@@ -10681,7 +11190,7 @@
         <w:trPr/>
         <w:tc>
           <w:tcPr>
-            <w:tcW w:w="1684" w:type="dxa"/>
+            <w:tcW w:w="1351" w:type="dxa"/>
             <w:tcBorders/>
             <w:vAlign w:val="center"/>
           </w:tcPr>
@@ -10700,7 +11209,7 @@
         </w:tc>
         <w:tc>
           <w:tcPr>
-            <w:tcW w:w="10476" w:type="dxa"/>
+            <w:tcW w:w="8401" w:type="dxa"/>
             <w:tcBorders/>
             <w:vAlign w:val="center"/>
           </w:tcPr>
@@ -10722,7 +11231,7 @@
         <w:trPr/>
         <w:tc>
           <w:tcPr>
-            <w:tcW w:w="1684" w:type="dxa"/>
+            <w:tcW w:w="1351" w:type="dxa"/>
             <w:tcBorders/>
             <w:vAlign w:val="center"/>
           </w:tcPr>
@@ -10741,7 +11250,7 @@
         </w:tc>
         <w:tc>
           <w:tcPr>
-            <w:tcW w:w="10476" w:type="dxa"/>
+            <w:tcW w:w="8401" w:type="dxa"/>
             <w:tcBorders/>
             <w:vAlign w:val="center"/>
           </w:tcPr>
@@ -10763,7 +11272,7 @@
         <w:trPr/>
         <w:tc>
           <w:tcPr>
-            <w:tcW w:w="1684" w:type="dxa"/>
+            <w:tcW w:w="1351" w:type="dxa"/>
             <w:tcBorders/>
             <w:vAlign w:val="center"/>
           </w:tcPr>
@@ -10782,7 +11291,7 @@
         </w:tc>
         <w:tc>
           <w:tcPr>
-            <w:tcW w:w="10476" w:type="dxa"/>
+            <w:tcW w:w="8401" w:type="dxa"/>
             <w:tcBorders/>
             <w:vAlign w:val="center"/>
           </w:tcPr>
@@ -10804,7 +11313,7 @@
         <w:trPr/>
         <w:tc>
           <w:tcPr>
-            <w:tcW w:w="1684" w:type="dxa"/>
+            <w:tcW w:w="1351" w:type="dxa"/>
             <w:tcBorders/>
             <w:vAlign w:val="center"/>
           </w:tcPr>
@@ -10823,7 +11332,7 @@
         </w:tc>
         <w:tc>
           <w:tcPr>
-            <w:tcW w:w="10476" w:type="dxa"/>
+            <w:tcW w:w="8401" w:type="dxa"/>
             <w:tcBorders/>
             <w:vAlign w:val="center"/>
           </w:tcPr>
@@ -10845,7 +11354,7 @@
         <w:trPr/>
         <w:tc>
           <w:tcPr>
-            <w:tcW w:w="1684" w:type="dxa"/>
+            <w:tcW w:w="1351" w:type="dxa"/>
             <w:tcBorders/>
             <w:vAlign w:val="center"/>
           </w:tcPr>
@@ -10864,7 +11373,7 @@
         </w:tc>
         <w:tc>
           <w:tcPr>
-            <w:tcW w:w="10476" w:type="dxa"/>
+            <w:tcW w:w="8401" w:type="dxa"/>
             <w:tcBorders/>
             <w:vAlign w:val="center"/>
           </w:tcPr>
@@ -10886,7 +11395,7 @@
         <w:trPr/>
         <w:tc>
           <w:tcPr>
-            <w:tcW w:w="1684" w:type="dxa"/>
+            <w:tcW w:w="1351" w:type="dxa"/>
             <w:tcBorders/>
             <w:vAlign w:val="center"/>
           </w:tcPr>
@@ -10905,7 +11414,7 @@
         </w:tc>
         <w:tc>
           <w:tcPr>
-            <w:tcW w:w="10476" w:type="dxa"/>
+            <w:tcW w:w="8401" w:type="dxa"/>
             <w:tcBorders/>
             <w:vAlign w:val="center"/>
           </w:tcPr>
@@ -10927,7 +11436,7 @@
         <w:trPr/>
         <w:tc>
           <w:tcPr>
-            <w:tcW w:w="1684" w:type="dxa"/>
+            <w:tcW w:w="1351" w:type="dxa"/>
             <w:tcBorders/>
             <w:vAlign w:val="center"/>
           </w:tcPr>
@@ -10946,7 +11455,7 @@
         </w:tc>
         <w:tc>
           <w:tcPr>
-            <w:tcW w:w="10476" w:type="dxa"/>
+            <w:tcW w:w="8401" w:type="dxa"/>
             <w:tcBorders/>
             <w:vAlign w:val="center"/>
           </w:tcPr>
@@ -10968,7 +11477,7 @@
         <w:trPr/>
         <w:tc>
           <w:tcPr>
-            <w:tcW w:w="1684" w:type="dxa"/>
+            <w:tcW w:w="1351" w:type="dxa"/>
             <w:tcBorders/>
             <w:vAlign w:val="center"/>
           </w:tcPr>
@@ -10987,7 +11496,7 @@
         </w:tc>
         <w:tc>
           <w:tcPr>
-            <w:tcW w:w="10476" w:type="dxa"/>
+            <w:tcW w:w="8401" w:type="dxa"/>
             <w:tcBorders/>
             <w:vAlign w:val="center"/>
           </w:tcPr>
@@ -11009,7 +11518,7 @@
         <w:trPr/>
         <w:tc>
           <w:tcPr>
-            <w:tcW w:w="1684" w:type="dxa"/>
+            <w:tcW w:w="1351" w:type="dxa"/>
             <w:tcBorders/>
             <w:vAlign w:val="center"/>
           </w:tcPr>
@@ -11028,7 +11537,7 @@
         </w:tc>
         <w:tc>
           <w:tcPr>
-            <w:tcW w:w="10476" w:type="dxa"/>
+            <w:tcW w:w="8401" w:type="dxa"/>
             <w:tcBorders/>
             <w:vAlign w:val="center"/>
           </w:tcPr>
@@ -11050,7 +11559,7 @@
         <w:trPr/>
         <w:tc>
           <w:tcPr>
-            <w:tcW w:w="1684" w:type="dxa"/>
+            <w:tcW w:w="1351" w:type="dxa"/>
             <w:tcBorders/>
             <w:vAlign w:val="center"/>
           </w:tcPr>
@@ -11069,7 +11578,7 @@
         </w:tc>
         <w:tc>
           <w:tcPr>
-            <w:tcW w:w="10476" w:type="dxa"/>
+            <w:tcW w:w="8401" w:type="dxa"/>
             <w:tcBorders/>
             <w:vAlign w:val="center"/>
           </w:tcPr>
@@ -13158,7 +13667,7 @@
     </w:p>
     <w:tbl>
       <w:tblPr>
-        <w:tblW w:w="10275" w:type="dxa"/>
+        <w:tblW w:w="9752" w:type="dxa"/>
         <w:jc w:val="start"/>
         <w:tblInd w:w="0" w:type="dxa"/>
         <w:tblLayout w:type="fixed"/>
@@ -13170,14 +13679,14 @@
         </w:tblCellMar>
       </w:tblPr>
       <w:tblGrid>
-        <w:gridCol w:w="669"/>
-        <w:gridCol w:w="9606"/>
+        <w:gridCol w:w="635"/>
+        <w:gridCol w:w="9117"/>
       </w:tblGrid>
       <w:tr>
         <w:trPr/>
         <w:tc>
           <w:tcPr>
-            <w:tcW w:w="669" w:type="dxa"/>
+            <w:tcW w:w="635" w:type="dxa"/>
             <w:tcBorders/>
             <w:vAlign w:val="center"/>
           </w:tcPr>
@@ -13199,7 +13708,7 @@
         </w:tc>
         <w:tc>
           <w:tcPr>
-            <w:tcW w:w="9606" w:type="dxa"/>
+            <w:tcW w:w="9117" w:type="dxa"/>
             <w:tcBorders/>
             <w:vAlign w:val="center"/>
           </w:tcPr>
@@ -13224,7 +13733,7 @@
         <w:trPr/>
         <w:tc>
           <w:tcPr>
-            <w:tcW w:w="669" w:type="dxa"/>
+            <w:tcW w:w="635" w:type="dxa"/>
             <w:tcBorders/>
             <w:vAlign w:val="center"/>
           </w:tcPr>
@@ -13243,7 +13752,7 @@
         </w:tc>
         <w:tc>
           <w:tcPr>
-            <w:tcW w:w="9606" w:type="dxa"/>
+            <w:tcW w:w="9117" w:type="dxa"/>
             <w:tcBorders/>
             <w:vAlign w:val="center"/>
           </w:tcPr>
@@ -13265,7 +13774,7 @@
         <w:trPr/>
         <w:tc>
           <w:tcPr>
-            <w:tcW w:w="669" w:type="dxa"/>
+            <w:tcW w:w="635" w:type="dxa"/>
             <w:tcBorders/>
             <w:vAlign w:val="center"/>
           </w:tcPr>
@@ -13284,7 +13793,7 @@
         </w:tc>
         <w:tc>
           <w:tcPr>
-            <w:tcW w:w="9606" w:type="dxa"/>
+            <w:tcW w:w="9117" w:type="dxa"/>
             <w:tcBorders/>
             <w:vAlign w:val="center"/>
           </w:tcPr>
@@ -13306,7 +13815,7 @@
         <w:trPr/>
         <w:tc>
           <w:tcPr>
-            <w:tcW w:w="669" w:type="dxa"/>
+            <w:tcW w:w="635" w:type="dxa"/>
             <w:tcBorders/>
             <w:vAlign w:val="center"/>
           </w:tcPr>
@@ -13325,7 +13834,7 @@
         </w:tc>
         <w:tc>
           <w:tcPr>
-            <w:tcW w:w="9606" w:type="dxa"/>
+            <w:tcW w:w="9117" w:type="dxa"/>
             <w:tcBorders/>
             <w:vAlign w:val="center"/>
           </w:tcPr>
@@ -13347,7 +13856,7 @@
         <w:trPr/>
         <w:tc>
           <w:tcPr>
-            <w:tcW w:w="669" w:type="dxa"/>
+            <w:tcW w:w="635" w:type="dxa"/>
             <w:tcBorders/>
             <w:vAlign w:val="center"/>
           </w:tcPr>
@@ -13366,7 +13875,7 @@
         </w:tc>
         <w:tc>
           <w:tcPr>
-            <w:tcW w:w="9606" w:type="dxa"/>
+            <w:tcW w:w="9117" w:type="dxa"/>
             <w:tcBorders/>
             <w:vAlign w:val="center"/>
           </w:tcPr>
@@ -13450,7 +13959,7 @@
         <w:rPr/>
         <w:t xml:space="preserve">, 2019/maintained digital edition, especially Chapters 14–20. </w:t>
       </w:r>
-      <w:hyperlink r:id="rId12">
+      <w:hyperlink r:id="rId13">
         <w:r>
           <w:rPr>
             <w:rStyle w:val="Hyperlink"/>
@@ -13493,7 +14002,7 @@
         <w:rPr/>
         <w:t xml:space="preserve">. </w:t>
       </w:r>
-      <w:hyperlink r:id="rId13">
+      <w:hyperlink r:id="rId14">
         <w:r>
           <w:rPr>
             <w:rStyle w:val="Hyperlink"/>
@@ -13536,7 +14045,7 @@
         <w:rPr/>
         <w:t xml:space="preserve">. </w:t>
       </w:r>
-      <w:hyperlink r:id="rId14">
+      <w:hyperlink r:id="rId15">
         <w:r>
           <w:rPr>
             <w:rStyle w:val="Hyperlink"/>
@@ -13579,7 +14088,7 @@
         <w:rPr/>
         <w:t xml:space="preserve">. </w:t>
       </w:r>
-      <w:hyperlink r:id="rId15">
+      <w:hyperlink r:id="rId16">
         <w:r>
           <w:rPr>
             <w:rStyle w:val="Hyperlink"/>
@@ -13612,7 +14121,7 @@
         <w:rPr/>
         <w:t xml:space="preserve">His Majesty's Nautical Almanac Office, overview and astronomical navigation services. </w:t>
       </w:r>
-      <w:hyperlink r:id="rId16">
+      <w:hyperlink r:id="rId17">
         <w:r>
           <w:rPr>
             <w:rStyle w:val="Hyperlink"/>

</xml_diff>

<commit_message>
Prevent clipped tables in bundled navigation manuals
</commit_message>
<xml_diff>
--- a/docs/v2/output/Celestial_Navigation_Manual_v2.docx
+++ b/docs/v2/output/Celestial_Navigation_Manual_v2.docx
@@ -516,7 +516,7 @@
     </w:p>
     <w:tbl>
       <w:tblPr>
-        <w:tblW w:w="13080" w:type="dxa"/>
+        <w:tblW w:w="9752" w:type="dxa"/>
         <w:jc w:val="start"/>
         <w:tblInd w:w="0" w:type="dxa"/>
         <w:tblLayout w:type="fixed"/>
@@ -528,14 +528,14 @@
         </w:tblCellMar>
       </w:tblPr>
       <w:tblGrid>
-        <w:gridCol w:w="1123"/>
-        <w:gridCol w:w="11957"/>
+        <w:gridCol w:w="837"/>
+        <w:gridCol w:w="8915"/>
       </w:tblGrid>
       <w:tr>
         <w:trPr/>
         <w:tc>
           <w:tcPr>
-            <w:tcW w:w="1123" w:type="dxa"/>
+            <w:tcW w:w="837" w:type="dxa"/>
             <w:tcBorders/>
             <w:vAlign w:val="center"/>
           </w:tcPr>
@@ -557,7 +557,7 @@
         </w:tc>
         <w:tc>
           <w:tcPr>
-            <w:tcW w:w="11957" w:type="dxa"/>
+            <w:tcW w:w="8915" w:type="dxa"/>
             <w:tcBorders/>
             <w:vAlign w:val="center"/>
           </w:tcPr>
@@ -582,7 +582,7 @@
         <w:trPr/>
         <w:tc>
           <w:tcPr>
-            <w:tcW w:w="1123" w:type="dxa"/>
+            <w:tcW w:w="837" w:type="dxa"/>
             <w:tcBorders/>
             <w:vAlign w:val="center"/>
           </w:tcPr>
@@ -601,7 +601,7 @@
         </w:tc>
         <w:tc>
           <w:tcPr>
-            <w:tcW w:w="11957" w:type="dxa"/>
+            <w:tcW w:w="8915" w:type="dxa"/>
             <w:tcBorders/>
             <w:vAlign w:val="center"/>
           </w:tcPr>
@@ -623,7 +623,7 @@
         <w:trPr/>
         <w:tc>
           <w:tcPr>
-            <w:tcW w:w="1123" w:type="dxa"/>
+            <w:tcW w:w="837" w:type="dxa"/>
             <w:tcBorders/>
             <w:vAlign w:val="center"/>
           </w:tcPr>
@@ -642,7 +642,7 @@
         </w:tc>
         <w:tc>
           <w:tcPr>
-            <w:tcW w:w="11957" w:type="dxa"/>
+            <w:tcW w:w="8915" w:type="dxa"/>
             <w:tcBorders/>
             <w:vAlign w:val="center"/>
           </w:tcPr>
@@ -664,7 +664,7 @@
         <w:trPr/>
         <w:tc>
           <w:tcPr>
-            <w:tcW w:w="1123" w:type="dxa"/>
+            <w:tcW w:w="837" w:type="dxa"/>
             <w:tcBorders/>
             <w:vAlign w:val="center"/>
           </w:tcPr>
@@ -683,7 +683,7 @@
         </w:tc>
         <w:tc>
           <w:tcPr>
-            <w:tcW w:w="11957" w:type="dxa"/>
+            <w:tcW w:w="8915" w:type="dxa"/>
             <w:tcBorders/>
             <w:vAlign w:val="center"/>
           </w:tcPr>
@@ -705,7 +705,7 @@
         <w:trPr/>
         <w:tc>
           <w:tcPr>
-            <w:tcW w:w="1123" w:type="dxa"/>
+            <w:tcW w:w="837" w:type="dxa"/>
             <w:tcBorders/>
             <w:vAlign w:val="center"/>
           </w:tcPr>
@@ -724,7 +724,7 @@
         </w:tc>
         <w:tc>
           <w:tcPr>
-            <w:tcW w:w="11957" w:type="dxa"/>
+            <w:tcW w:w="8915" w:type="dxa"/>
             <w:tcBorders/>
             <w:vAlign w:val="center"/>
           </w:tcPr>
@@ -746,7 +746,7 @@
         <w:trPr/>
         <w:tc>
           <w:tcPr>
-            <w:tcW w:w="1123" w:type="dxa"/>
+            <w:tcW w:w="837" w:type="dxa"/>
             <w:tcBorders/>
             <w:vAlign w:val="center"/>
           </w:tcPr>
@@ -765,7 +765,7 @@
         </w:tc>
         <w:tc>
           <w:tcPr>
-            <w:tcW w:w="11957" w:type="dxa"/>
+            <w:tcW w:w="8915" w:type="dxa"/>
             <w:tcBorders/>
             <w:vAlign w:val="center"/>
           </w:tcPr>
@@ -787,7 +787,7 @@
         <w:trPr/>
         <w:tc>
           <w:tcPr>
-            <w:tcW w:w="1123" w:type="dxa"/>
+            <w:tcW w:w="837" w:type="dxa"/>
             <w:tcBorders/>
             <w:vAlign w:val="center"/>
           </w:tcPr>
@@ -806,7 +806,7 @@
         </w:tc>
         <w:tc>
           <w:tcPr>
-            <w:tcW w:w="11957" w:type="dxa"/>
+            <w:tcW w:w="8915" w:type="dxa"/>
             <w:tcBorders/>
             <w:vAlign w:val="center"/>
           </w:tcPr>
@@ -828,7 +828,7 @@
         <w:trPr/>
         <w:tc>
           <w:tcPr>
-            <w:tcW w:w="1123" w:type="dxa"/>
+            <w:tcW w:w="837" w:type="dxa"/>
             <w:tcBorders/>
             <w:vAlign w:val="center"/>
           </w:tcPr>
@@ -847,7 +847,7 @@
         </w:tc>
         <w:tc>
           <w:tcPr>
-            <w:tcW w:w="11957" w:type="dxa"/>
+            <w:tcW w:w="8915" w:type="dxa"/>
             <w:tcBorders/>
             <w:vAlign w:val="center"/>
           </w:tcPr>
@@ -869,7 +869,7 @@
         <w:trPr/>
         <w:tc>
           <w:tcPr>
-            <w:tcW w:w="1123" w:type="dxa"/>
+            <w:tcW w:w="837" w:type="dxa"/>
             <w:tcBorders/>
             <w:vAlign w:val="center"/>
           </w:tcPr>
@@ -888,7 +888,7 @@
         </w:tc>
         <w:tc>
           <w:tcPr>
-            <w:tcW w:w="11957" w:type="dxa"/>
+            <w:tcW w:w="8915" w:type="dxa"/>
             <w:tcBorders/>
             <w:vAlign w:val="center"/>
           </w:tcPr>
@@ -910,7 +910,7 @@
         <w:trPr/>
         <w:tc>
           <w:tcPr>
-            <w:tcW w:w="1123" w:type="dxa"/>
+            <w:tcW w:w="837" w:type="dxa"/>
             <w:tcBorders/>
             <w:vAlign w:val="center"/>
           </w:tcPr>
@@ -929,7 +929,7 @@
         </w:tc>
         <w:tc>
           <w:tcPr>
-            <w:tcW w:w="11957" w:type="dxa"/>
+            <w:tcW w:w="8915" w:type="dxa"/>
             <w:tcBorders/>
             <w:vAlign w:val="center"/>
           </w:tcPr>
@@ -951,7 +951,7 @@
         <w:trPr/>
         <w:tc>
           <w:tcPr>
-            <w:tcW w:w="1123" w:type="dxa"/>
+            <w:tcW w:w="837" w:type="dxa"/>
             <w:tcBorders/>
             <w:vAlign w:val="center"/>
           </w:tcPr>
@@ -970,7 +970,7 @@
         </w:tc>
         <w:tc>
           <w:tcPr>
-            <w:tcW w:w="11957" w:type="dxa"/>
+            <w:tcW w:w="8915" w:type="dxa"/>
             <w:tcBorders/>
             <w:vAlign w:val="center"/>
           </w:tcPr>
@@ -992,7 +992,7 @@
         <w:trPr/>
         <w:tc>
           <w:tcPr>
-            <w:tcW w:w="1123" w:type="dxa"/>
+            <w:tcW w:w="837" w:type="dxa"/>
             <w:tcBorders/>
             <w:vAlign w:val="center"/>
           </w:tcPr>
@@ -1011,7 +1011,7 @@
         </w:tc>
         <w:tc>
           <w:tcPr>
-            <w:tcW w:w="11957" w:type="dxa"/>
+            <w:tcW w:w="8915" w:type="dxa"/>
             <w:tcBorders/>
             <w:vAlign w:val="center"/>
           </w:tcPr>
@@ -1033,7 +1033,7 @@
         <w:trPr/>
         <w:tc>
           <w:tcPr>
-            <w:tcW w:w="1123" w:type="dxa"/>
+            <w:tcW w:w="837" w:type="dxa"/>
             <w:tcBorders/>
             <w:vAlign w:val="center"/>
           </w:tcPr>
@@ -1052,7 +1052,7 @@
         </w:tc>
         <w:tc>
           <w:tcPr>
-            <w:tcW w:w="11957" w:type="dxa"/>
+            <w:tcW w:w="8915" w:type="dxa"/>
             <w:tcBorders/>
             <w:vAlign w:val="center"/>
           </w:tcPr>
@@ -1074,7 +1074,7 @@
         <w:trPr/>
         <w:tc>
           <w:tcPr>
-            <w:tcW w:w="1123" w:type="dxa"/>
+            <w:tcW w:w="837" w:type="dxa"/>
             <w:tcBorders/>
             <w:vAlign w:val="center"/>
           </w:tcPr>
@@ -1093,7 +1093,7 @@
         </w:tc>
         <w:tc>
           <w:tcPr>
-            <w:tcW w:w="11957" w:type="dxa"/>
+            <w:tcW w:w="8915" w:type="dxa"/>
             <w:tcBorders/>
             <w:vAlign w:val="center"/>
           </w:tcPr>
@@ -2535,7 +2535,7 @@
     </w:p>
     <w:tbl>
       <w:tblPr>
-        <w:tblW w:w="13596" w:type="dxa"/>
+        <w:tblW w:w="9752" w:type="dxa"/>
         <w:jc w:val="start"/>
         <w:tblInd w:w="0" w:type="dxa"/>
         <w:tblLayout w:type="fixed"/>
@@ -2547,14 +2547,14 @@
         </w:tblCellMar>
       </w:tblPr>
       <w:tblGrid>
-        <w:gridCol w:w="1835"/>
-        <w:gridCol w:w="11761"/>
+        <w:gridCol w:w="1316"/>
+        <w:gridCol w:w="8436"/>
       </w:tblGrid>
       <w:tr>
         <w:trPr/>
         <w:tc>
           <w:tcPr>
-            <w:tcW w:w="1835" w:type="dxa"/>
+            <w:tcW w:w="1316" w:type="dxa"/>
             <w:tcBorders/>
             <w:vAlign w:val="center"/>
           </w:tcPr>
@@ -2576,7 +2576,7 @@
         </w:tc>
         <w:tc>
           <w:tcPr>
-            <w:tcW w:w="11761" w:type="dxa"/>
+            <w:tcW w:w="8436" w:type="dxa"/>
             <w:tcBorders/>
             <w:vAlign w:val="center"/>
           </w:tcPr>
@@ -2601,7 +2601,7 @@
         <w:trPr/>
         <w:tc>
           <w:tcPr>
-            <w:tcW w:w="1835" w:type="dxa"/>
+            <w:tcW w:w="1316" w:type="dxa"/>
             <w:tcBorders/>
             <w:vAlign w:val="center"/>
           </w:tcPr>
@@ -2620,7 +2620,7 @@
         </w:tc>
         <w:tc>
           <w:tcPr>
-            <w:tcW w:w="11761" w:type="dxa"/>
+            <w:tcW w:w="8436" w:type="dxa"/>
             <w:tcBorders/>
             <w:vAlign w:val="center"/>
           </w:tcPr>
@@ -2642,7 +2642,7 @@
         <w:trPr/>
         <w:tc>
           <w:tcPr>
-            <w:tcW w:w="1835" w:type="dxa"/>
+            <w:tcW w:w="1316" w:type="dxa"/>
             <w:tcBorders/>
             <w:vAlign w:val="center"/>
           </w:tcPr>
@@ -2661,7 +2661,7 @@
         </w:tc>
         <w:tc>
           <w:tcPr>
-            <w:tcW w:w="11761" w:type="dxa"/>
+            <w:tcW w:w="8436" w:type="dxa"/>
             <w:tcBorders/>
             <w:vAlign w:val="center"/>
           </w:tcPr>
@@ -2683,7 +2683,7 @@
         <w:trPr/>
         <w:tc>
           <w:tcPr>
-            <w:tcW w:w="1835" w:type="dxa"/>
+            <w:tcW w:w="1316" w:type="dxa"/>
             <w:tcBorders/>
             <w:vAlign w:val="center"/>
           </w:tcPr>
@@ -2702,7 +2702,7 @@
         </w:tc>
         <w:tc>
           <w:tcPr>
-            <w:tcW w:w="11761" w:type="dxa"/>
+            <w:tcW w:w="8436" w:type="dxa"/>
             <w:tcBorders/>
             <w:vAlign w:val="center"/>
           </w:tcPr>
@@ -2724,7 +2724,7 @@
         <w:trPr/>
         <w:tc>
           <w:tcPr>
-            <w:tcW w:w="1835" w:type="dxa"/>
+            <w:tcW w:w="1316" w:type="dxa"/>
             <w:tcBorders/>
             <w:vAlign w:val="center"/>
           </w:tcPr>
@@ -2743,7 +2743,7 @@
         </w:tc>
         <w:tc>
           <w:tcPr>
-            <w:tcW w:w="11761" w:type="dxa"/>
+            <w:tcW w:w="8436" w:type="dxa"/>
             <w:tcBorders/>
             <w:vAlign w:val="center"/>
           </w:tcPr>
@@ -2765,7 +2765,7 @@
         <w:trPr/>
         <w:tc>
           <w:tcPr>
-            <w:tcW w:w="1835" w:type="dxa"/>
+            <w:tcW w:w="1316" w:type="dxa"/>
             <w:tcBorders/>
             <w:vAlign w:val="center"/>
           </w:tcPr>
@@ -2784,7 +2784,7 @@
         </w:tc>
         <w:tc>
           <w:tcPr>
-            <w:tcW w:w="11761" w:type="dxa"/>
+            <w:tcW w:w="8436" w:type="dxa"/>
             <w:tcBorders/>
             <w:vAlign w:val="center"/>
           </w:tcPr>
@@ -3244,7 +3244,7 @@
     </w:p>
     <w:tbl>
       <w:tblPr>
-        <w:tblW w:w="16471" w:type="dxa"/>
+        <w:tblW w:w="9752" w:type="dxa"/>
         <w:jc w:val="start"/>
         <w:tblInd w:w="0" w:type="dxa"/>
         <w:tblLayout w:type="fixed"/>
@@ -3256,14 +3256,14 @@
         </w:tblCellMar>
       </w:tblPr>
       <w:tblGrid>
-        <w:gridCol w:w="2533"/>
-        <w:gridCol w:w="13938"/>
+        <w:gridCol w:w="1500"/>
+        <w:gridCol w:w="8252"/>
       </w:tblGrid>
       <w:tr>
         <w:trPr/>
         <w:tc>
           <w:tcPr>
-            <w:tcW w:w="2533" w:type="dxa"/>
+            <w:tcW w:w="1500" w:type="dxa"/>
             <w:tcBorders/>
             <w:vAlign w:val="center"/>
           </w:tcPr>
@@ -3285,7 +3285,7 @@
         </w:tc>
         <w:tc>
           <w:tcPr>
-            <w:tcW w:w="13938" w:type="dxa"/>
+            <w:tcW w:w="8252" w:type="dxa"/>
             <w:tcBorders/>
             <w:vAlign w:val="center"/>
           </w:tcPr>
@@ -3310,7 +3310,7 @@
         <w:trPr/>
         <w:tc>
           <w:tcPr>
-            <w:tcW w:w="2533" w:type="dxa"/>
+            <w:tcW w:w="1500" w:type="dxa"/>
             <w:tcBorders/>
             <w:vAlign w:val="center"/>
           </w:tcPr>
@@ -3329,7 +3329,7 @@
         </w:tc>
         <w:tc>
           <w:tcPr>
-            <w:tcW w:w="13938" w:type="dxa"/>
+            <w:tcW w:w="8252" w:type="dxa"/>
             <w:tcBorders/>
             <w:vAlign w:val="center"/>
           </w:tcPr>
@@ -3351,7 +3351,7 @@
         <w:trPr/>
         <w:tc>
           <w:tcPr>
-            <w:tcW w:w="2533" w:type="dxa"/>
+            <w:tcW w:w="1500" w:type="dxa"/>
             <w:tcBorders/>
             <w:vAlign w:val="center"/>
           </w:tcPr>
@@ -3370,7 +3370,7 @@
         </w:tc>
         <w:tc>
           <w:tcPr>
-            <w:tcW w:w="13938" w:type="dxa"/>
+            <w:tcW w:w="8252" w:type="dxa"/>
             <w:tcBorders/>
             <w:vAlign w:val="center"/>
           </w:tcPr>
@@ -3392,7 +3392,7 @@
         <w:trPr/>
         <w:tc>
           <w:tcPr>
-            <w:tcW w:w="2533" w:type="dxa"/>
+            <w:tcW w:w="1500" w:type="dxa"/>
             <w:tcBorders/>
             <w:vAlign w:val="center"/>
           </w:tcPr>
@@ -3411,7 +3411,7 @@
         </w:tc>
         <w:tc>
           <w:tcPr>
-            <w:tcW w:w="13938" w:type="dxa"/>
+            <w:tcW w:w="8252" w:type="dxa"/>
             <w:tcBorders/>
             <w:vAlign w:val="center"/>
           </w:tcPr>
@@ -3433,7 +3433,7 @@
         <w:trPr/>
         <w:tc>
           <w:tcPr>
-            <w:tcW w:w="2533" w:type="dxa"/>
+            <w:tcW w:w="1500" w:type="dxa"/>
             <w:tcBorders/>
             <w:vAlign w:val="center"/>
           </w:tcPr>
@@ -3452,7 +3452,7 @@
         </w:tc>
         <w:tc>
           <w:tcPr>
-            <w:tcW w:w="13938" w:type="dxa"/>
+            <w:tcW w:w="8252" w:type="dxa"/>
             <w:tcBorders/>
             <w:vAlign w:val="center"/>
           </w:tcPr>
@@ -3474,7 +3474,7 @@
         <w:trPr/>
         <w:tc>
           <w:tcPr>
-            <w:tcW w:w="2533" w:type="dxa"/>
+            <w:tcW w:w="1500" w:type="dxa"/>
             <w:tcBorders/>
             <w:vAlign w:val="center"/>
           </w:tcPr>
@@ -3493,7 +3493,7 @@
         </w:tc>
         <w:tc>
           <w:tcPr>
-            <w:tcW w:w="13938" w:type="dxa"/>
+            <w:tcW w:w="8252" w:type="dxa"/>
             <w:tcBorders/>
             <w:vAlign w:val="center"/>
           </w:tcPr>
@@ -3515,7 +3515,7 @@
         <w:trPr/>
         <w:tc>
           <w:tcPr>
-            <w:tcW w:w="2533" w:type="dxa"/>
+            <w:tcW w:w="1500" w:type="dxa"/>
             <w:tcBorders/>
             <w:vAlign w:val="center"/>
           </w:tcPr>
@@ -3534,7 +3534,7 @@
         </w:tc>
         <w:tc>
           <w:tcPr>
-            <w:tcW w:w="13938" w:type="dxa"/>
+            <w:tcW w:w="8252" w:type="dxa"/>
             <w:tcBorders/>
             <w:vAlign w:val="center"/>
           </w:tcPr>
@@ -3556,7 +3556,7 @@
         <w:trPr/>
         <w:tc>
           <w:tcPr>
-            <w:tcW w:w="2533" w:type="dxa"/>
+            <w:tcW w:w="1500" w:type="dxa"/>
             <w:tcBorders/>
             <w:vAlign w:val="center"/>
           </w:tcPr>
@@ -3575,7 +3575,7 @@
         </w:tc>
         <w:tc>
           <w:tcPr>
-            <w:tcW w:w="13938" w:type="dxa"/>
+            <w:tcW w:w="8252" w:type="dxa"/>
             <w:tcBorders/>
             <w:vAlign w:val="center"/>
           </w:tcPr>
@@ -3597,7 +3597,7 @@
         <w:trPr/>
         <w:tc>
           <w:tcPr>
-            <w:tcW w:w="2533" w:type="dxa"/>
+            <w:tcW w:w="1500" w:type="dxa"/>
             <w:tcBorders/>
             <w:vAlign w:val="center"/>
           </w:tcPr>
@@ -3616,7 +3616,7 @@
         </w:tc>
         <w:tc>
           <w:tcPr>
-            <w:tcW w:w="13938" w:type="dxa"/>
+            <w:tcW w:w="8252" w:type="dxa"/>
             <w:tcBorders/>
             <w:vAlign w:val="center"/>
           </w:tcPr>
@@ -3638,7 +3638,7 @@
         <w:trPr/>
         <w:tc>
           <w:tcPr>
-            <w:tcW w:w="2533" w:type="dxa"/>
+            <w:tcW w:w="1500" w:type="dxa"/>
             <w:tcBorders/>
             <w:vAlign w:val="center"/>
           </w:tcPr>
@@ -3657,7 +3657,7 @@
         </w:tc>
         <w:tc>
           <w:tcPr>
-            <w:tcW w:w="13938" w:type="dxa"/>
+            <w:tcW w:w="8252" w:type="dxa"/>
             <w:tcBorders/>
             <w:vAlign w:val="center"/>
           </w:tcPr>
@@ -3679,7 +3679,7 @@
         <w:trPr/>
         <w:tc>
           <w:tcPr>
-            <w:tcW w:w="2533" w:type="dxa"/>
+            <w:tcW w:w="1500" w:type="dxa"/>
             <w:tcBorders/>
             <w:vAlign w:val="center"/>
           </w:tcPr>
@@ -3698,7 +3698,7 @@
         </w:tc>
         <w:tc>
           <w:tcPr>
-            <w:tcW w:w="13938" w:type="dxa"/>
+            <w:tcW w:w="8252" w:type="dxa"/>
             <w:tcBorders/>
             <w:vAlign w:val="center"/>
           </w:tcPr>
@@ -3720,7 +3720,7 @@
         <w:trPr/>
         <w:tc>
           <w:tcPr>
-            <w:tcW w:w="2533" w:type="dxa"/>
+            <w:tcW w:w="1500" w:type="dxa"/>
             <w:tcBorders/>
             <w:vAlign w:val="center"/>
           </w:tcPr>
@@ -3739,7 +3739,7 @@
         </w:tc>
         <w:tc>
           <w:tcPr>
-            <w:tcW w:w="13938" w:type="dxa"/>
+            <w:tcW w:w="8252" w:type="dxa"/>
             <w:tcBorders/>
             <w:vAlign w:val="center"/>
           </w:tcPr>
@@ -3761,7 +3761,7 @@
         <w:trPr/>
         <w:tc>
           <w:tcPr>
-            <w:tcW w:w="2533" w:type="dxa"/>
+            <w:tcW w:w="1500" w:type="dxa"/>
             <w:tcBorders/>
             <w:vAlign w:val="center"/>
           </w:tcPr>
@@ -3780,7 +3780,7 @@
         </w:tc>
         <w:tc>
           <w:tcPr>
-            <w:tcW w:w="13938" w:type="dxa"/>
+            <w:tcW w:w="8252" w:type="dxa"/>
             <w:tcBorders/>
             <w:vAlign w:val="center"/>
           </w:tcPr>
@@ -3802,7 +3802,7 @@
         <w:trPr/>
         <w:tc>
           <w:tcPr>
-            <w:tcW w:w="2533" w:type="dxa"/>
+            <w:tcW w:w="1500" w:type="dxa"/>
             <w:tcBorders/>
             <w:vAlign w:val="center"/>
           </w:tcPr>
@@ -3821,7 +3821,7 @@
         </w:tc>
         <w:tc>
           <w:tcPr>
-            <w:tcW w:w="13938" w:type="dxa"/>
+            <w:tcW w:w="8252" w:type="dxa"/>
             <w:tcBorders/>
             <w:vAlign w:val="center"/>
           </w:tcPr>
@@ -3843,7 +3843,7 @@
         <w:trPr/>
         <w:tc>
           <w:tcPr>
-            <w:tcW w:w="2533" w:type="dxa"/>
+            <w:tcW w:w="1500" w:type="dxa"/>
             <w:tcBorders/>
             <w:vAlign w:val="center"/>
           </w:tcPr>
@@ -3862,7 +3862,7 @@
         </w:tc>
         <w:tc>
           <w:tcPr>
-            <w:tcW w:w="13938" w:type="dxa"/>
+            <w:tcW w:w="8252" w:type="dxa"/>
             <w:tcBorders/>
             <w:vAlign w:val="center"/>
           </w:tcPr>
@@ -8952,7 +8952,7 @@
     </w:p>
     <w:tbl>
       <w:tblPr>
-        <w:tblW w:w="12160" w:type="dxa"/>
+        <w:tblW w:w="9752" w:type="dxa"/>
         <w:jc w:val="start"/>
         <w:tblInd w:w="0" w:type="dxa"/>
         <w:tblLayout w:type="fixed"/>
@@ -8964,14 +8964,14 @@
         </w:tblCellMar>
       </w:tblPr>
       <w:tblGrid>
-        <w:gridCol w:w="1684"/>
-        <w:gridCol w:w="10476"/>
+        <w:gridCol w:w="1351"/>
+        <w:gridCol w:w="8401"/>
       </w:tblGrid>
       <w:tr>
         <w:trPr/>
         <w:tc>
           <w:tcPr>
-            <w:tcW w:w="1684" w:type="dxa"/>
+            <w:tcW w:w="1351" w:type="dxa"/>
             <w:tcBorders/>
             <w:vAlign w:val="center"/>
           </w:tcPr>
@@ -8993,7 +8993,7 @@
         </w:tc>
         <w:tc>
           <w:tcPr>
-            <w:tcW w:w="10476" w:type="dxa"/>
+            <w:tcW w:w="8401" w:type="dxa"/>
             <w:tcBorders/>
             <w:vAlign w:val="center"/>
           </w:tcPr>
@@ -9018,7 +9018,7 @@
         <w:trPr/>
         <w:tc>
           <w:tcPr>
-            <w:tcW w:w="1684" w:type="dxa"/>
+            <w:tcW w:w="1351" w:type="dxa"/>
             <w:tcBorders/>
             <w:vAlign w:val="center"/>
           </w:tcPr>
@@ -9037,7 +9037,7 @@
         </w:tc>
         <w:tc>
           <w:tcPr>
-            <w:tcW w:w="10476" w:type="dxa"/>
+            <w:tcW w:w="8401" w:type="dxa"/>
             <w:tcBorders/>
             <w:vAlign w:val="center"/>
           </w:tcPr>
@@ -9059,7 +9059,7 @@
         <w:trPr/>
         <w:tc>
           <w:tcPr>
-            <w:tcW w:w="1684" w:type="dxa"/>
+            <w:tcW w:w="1351" w:type="dxa"/>
             <w:tcBorders/>
             <w:vAlign w:val="center"/>
           </w:tcPr>
@@ -9078,7 +9078,7 @@
         </w:tc>
         <w:tc>
           <w:tcPr>
-            <w:tcW w:w="10476" w:type="dxa"/>
+            <w:tcW w:w="8401" w:type="dxa"/>
             <w:tcBorders/>
             <w:vAlign w:val="center"/>
           </w:tcPr>
@@ -9100,7 +9100,7 @@
         <w:trPr/>
         <w:tc>
           <w:tcPr>
-            <w:tcW w:w="1684" w:type="dxa"/>
+            <w:tcW w:w="1351" w:type="dxa"/>
             <w:tcBorders/>
             <w:vAlign w:val="center"/>
           </w:tcPr>
@@ -9119,7 +9119,7 @@
         </w:tc>
         <w:tc>
           <w:tcPr>
-            <w:tcW w:w="10476" w:type="dxa"/>
+            <w:tcW w:w="8401" w:type="dxa"/>
             <w:tcBorders/>
             <w:vAlign w:val="center"/>
           </w:tcPr>
@@ -9141,7 +9141,7 @@
         <w:trPr/>
         <w:tc>
           <w:tcPr>
-            <w:tcW w:w="1684" w:type="dxa"/>
+            <w:tcW w:w="1351" w:type="dxa"/>
             <w:tcBorders/>
             <w:vAlign w:val="center"/>
           </w:tcPr>
@@ -9160,7 +9160,7 @@
         </w:tc>
         <w:tc>
           <w:tcPr>
-            <w:tcW w:w="10476" w:type="dxa"/>
+            <w:tcW w:w="8401" w:type="dxa"/>
             <w:tcBorders/>
             <w:vAlign w:val="center"/>
           </w:tcPr>
@@ -9182,7 +9182,7 @@
         <w:trPr/>
         <w:tc>
           <w:tcPr>
-            <w:tcW w:w="1684" w:type="dxa"/>
+            <w:tcW w:w="1351" w:type="dxa"/>
             <w:tcBorders/>
             <w:vAlign w:val="center"/>
           </w:tcPr>
@@ -9201,7 +9201,7 @@
         </w:tc>
         <w:tc>
           <w:tcPr>
-            <w:tcW w:w="10476" w:type="dxa"/>
+            <w:tcW w:w="8401" w:type="dxa"/>
             <w:tcBorders/>
             <w:vAlign w:val="center"/>
           </w:tcPr>
@@ -9223,7 +9223,7 @@
         <w:trPr/>
         <w:tc>
           <w:tcPr>
-            <w:tcW w:w="1684" w:type="dxa"/>
+            <w:tcW w:w="1351" w:type="dxa"/>
             <w:tcBorders/>
             <w:vAlign w:val="center"/>
           </w:tcPr>
@@ -9242,7 +9242,7 @@
         </w:tc>
         <w:tc>
           <w:tcPr>
-            <w:tcW w:w="10476" w:type="dxa"/>
+            <w:tcW w:w="8401" w:type="dxa"/>
             <w:tcBorders/>
             <w:vAlign w:val="center"/>
           </w:tcPr>
@@ -9264,7 +9264,7 @@
         <w:trPr/>
         <w:tc>
           <w:tcPr>
-            <w:tcW w:w="1684" w:type="dxa"/>
+            <w:tcW w:w="1351" w:type="dxa"/>
             <w:tcBorders/>
             <w:vAlign w:val="center"/>
           </w:tcPr>
@@ -9283,7 +9283,7 @@
         </w:tc>
         <w:tc>
           <w:tcPr>
-            <w:tcW w:w="10476" w:type="dxa"/>
+            <w:tcW w:w="8401" w:type="dxa"/>
             <w:tcBorders/>
             <w:vAlign w:val="center"/>
           </w:tcPr>
@@ -9305,7 +9305,7 @@
         <w:trPr/>
         <w:tc>
           <w:tcPr>
-            <w:tcW w:w="1684" w:type="dxa"/>
+            <w:tcW w:w="1351" w:type="dxa"/>
             <w:tcBorders/>
             <w:vAlign w:val="center"/>
           </w:tcPr>
@@ -9324,7 +9324,7 @@
         </w:tc>
         <w:tc>
           <w:tcPr>
-            <w:tcW w:w="10476" w:type="dxa"/>
+            <w:tcW w:w="8401" w:type="dxa"/>
             <w:tcBorders/>
             <w:vAlign w:val="center"/>
           </w:tcPr>
@@ -9346,7 +9346,7 @@
         <w:trPr/>
         <w:tc>
           <w:tcPr>
-            <w:tcW w:w="1684" w:type="dxa"/>
+            <w:tcW w:w="1351" w:type="dxa"/>
             <w:tcBorders/>
             <w:vAlign w:val="center"/>
           </w:tcPr>
@@ -9365,7 +9365,7 @@
         </w:tc>
         <w:tc>
           <w:tcPr>
-            <w:tcW w:w="10476" w:type="dxa"/>
+            <w:tcW w:w="8401" w:type="dxa"/>
             <w:tcBorders/>
             <w:vAlign w:val="center"/>
           </w:tcPr>
@@ -9387,7 +9387,7 @@
         <w:trPr/>
         <w:tc>
           <w:tcPr>
-            <w:tcW w:w="1684" w:type="dxa"/>
+            <w:tcW w:w="1351" w:type="dxa"/>
             <w:tcBorders/>
             <w:vAlign w:val="center"/>
           </w:tcPr>
@@ -9406,7 +9406,7 @@
         </w:tc>
         <w:tc>
           <w:tcPr>
-            <w:tcW w:w="10476" w:type="dxa"/>
+            <w:tcW w:w="8401" w:type="dxa"/>
             <w:tcBorders/>
             <w:vAlign w:val="center"/>
           </w:tcPr>
@@ -9428,7 +9428,7 @@
         <w:trPr/>
         <w:tc>
           <w:tcPr>
-            <w:tcW w:w="1684" w:type="dxa"/>
+            <w:tcW w:w="1351" w:type="dxa"/>
             <w:tcBorders/>
             <w:vAlign w:val="center"/>
           </w:tcPr>
@@ -9447,7 +9447,7 @@
         </w:tc>
         <w:tc>
           <w:tcPr>
-            <w:tcW w:w="10476" w:type="dxa"/>
+            <w:tcW w:w="8401" w:type="dxa"/>
             <w:tcBorders/>
             <w:vAlign w:val="center"/>
           </w:tcPr>
@@ -9469,7 +9469,7 @@
         <w:trPr/>
         <w:tc>
           <w:tcPr>
-            <w:tcW w:w="1684" w:type="dxa"/>
+            <w:tcW w:w="1351" w:type="dxa"/>
             <w:tcBorders/>
             <w:vAlign w:val="center"/>
           </w:tcPr>
@@ -9488,7 +9488,7 @@
         </w:tc>
         <w:tc>
           <w:tcPr>
-            <w:tcW w:w="10476" w:type="dxa"/>
+            <w:tcW w:w="8401" w:type="dxa"/>
             <w:tcBorders/>
             <w:vAlign w:val="center"/>
           </w:tcPr>
@@ -9510,7 +9510,7 @@
         <w:trPr/>
         <w:tc>
           <w:tcPr>
-            <w:tcW w:w="1684" w:type="dxa"/>
+            <w:tcW w:w="1351" w:type="dxa"/>
             <w:tcBorders/>
             <w:vAlign w:val="center"/>
           </w:tcPr>
@@ -9529,7 +9529,7 @@
         </w:tc>
         <w:tc>
           <w:tcPr>
-            <w:tcW w:w="10476" w:type="dxa"/>
+            <w:tcW w:w="8401" w:type="dxa"/>
             <w:tcBorders/>
             <w:vAlign w:val="center"/>
           </w:tcPr>
@@ -9551,7 +9551,7 @@
         <w:trPr/>
         <w:tc>
           <w:tcPr>
-            <w:tcW w:w="1684" w:type="dxa"/>
+            <w:tcW w:w="1351" w:type="dxa"/>
             <w:tcBorders/>
             <w:vAlign w:val="center"/>
           </w:tcPr>
@@ -9570,7 +9570,7 @@
         </w:tc>
         <w:tc>
           <w:tcPr>
-            <w:tcW w:w="10476" w:type="dxa"/>
+            <w:tcW w:w="8401" w:type="dxa"/>
             <w:tcBorders/>
             <w:vAlign w:val="center"/>
           </w:tcPr>
@@ -9592,7 +9592,7 @@
         <w:trPr/>
         <w:tc>
           <w:tcPr>
-            <w:tcW w:w="1684" w:type="dxa"/>
+            <w:tcW w:w="1351" w:type="dxa"/>
             <w:tcBorders/>
             <w:vAlign w:val="center"/>
           </w:tcPr>
@@ -9611,7 +9611,7 @@
         </w:tc>
         <w:tc>
           <w:tcPr>
-            <w:tcW w:w="10476" w:type="dxa"/>
+            <w:tcW w:w="8401" w:type="dxa"/>
             <w:tcBorders/>
             <w:vAlign w:val="center"/>
           </w:tcPr>
@@ -9633,7 +9633,7 @@
         <w:trPr/>
         <w:tc>
           <w:tcPr>
-            <w:tcW w:w="1684" w:type="dxa"/>
+            <w:tcW w:w="1351" w:type="dxa"/>
             <w:tcBorders/>
             <w:vAlign w:val="center"/>
           </w:tcPr>
@@ -9652,7 +9652,7 @@
         </w:tc>
         <w:tc>
           <w:tcPr>
-            <w:tcW w:w="10476" w:type="dxa"/>
+            <w:tcW w:w="8401" w:type="dxa"/>
             <w:tcBorders/>
             <w:vAlign w:val="center"/>
           </w:tcPr>
@@ -9674,7 +9674,7 @@
         <w:trPr/>
         <w:tc>
           <w:tcPr>
-            <w:tcW w:w="1684" w:type="dxa"/>
+            <w:tcW w:w="1351" w:type="dxa"/>
             <w:tcBorders/>
             <w:vAlign w:val="center"/>
           </w:tcPr>
@@ -9693,7 +9693,7 @@
         </w:tc>
         <w:tc>
           <w:tcPr>
-            <w:tcW w:w="10476" w:type="dxa"/>
+            <w:tcW w:w="8401" w:type="dxa"/>
             <w:tcBorders/>
             <w:vAlign w:val="center"/>
           </w:tcPr>
@@ -9715,7 +9715,7 @@
         <w:trPr/>
         <w:tc>
           <w:tcPr>
-            <w:tcW w:w="1684" w:type="dxa"/>
+            <w:tcW w:w="1351" w:type="dxa"/>
             <w:tcBorders/>
             <w:vAlign w:val="center"/>
           </w:tcPr>
@@ -9734,7 +9734,7 @@
         </w:tc>
         <w:tc>
           <w:tcPr>
-            <w:tcW w:w="10476" w:type="dxa"/>
+            <w:tcW w:w="8401" w:type="dxa"/>
             <w:tcBorders/>
             <w:vAlign w:val="center"/>
           </w:tcPr>
@@ -9756,7 +9756,7 @@
         <w:trPr/>
         <w:tc>
           <w:tcPr>
-            <w:tcW w:w="1684" w:type="dxa"/>
+            <w:tcW w:w="1351" w:type="dxa"/>
             <w:tcBorders/>
             <w:vAlign w:val="center"/>
           </w:tcPr>
@@ -9775,7 +9775,7 @@
         </w:tc>
         <w:tc>
           <w:tcPr>
-            <w:tcW w:w="10476" w:type="dxa"/>
+            <w:tcW w:w="8401" w:type="dxa"/>
             <w:tcBorders/>
             <w:vAlign w:val="center"/>
           </w:tcPr>
@@ -9797,7 +9797,7 @@
         <w:trPr/>
         <w:tc>
           <w:tcPr>
-            <w:tcW w:w="1684" w:type="dxa"/>
+            <w:tcW w:w="1351" w:type="dxa"/>
             <w:tcBorders/>
             <w:vAlign w:val="center"/>
           </w:tcPr>
@@ -9816,7 +9816,7 @@
         </w:tc>
         <w:tc>
           <w:tcPr>
-            <w:tcW w:w="10476" w:type="dxa"/>
+            <w:tcW w:w="8401" w:type="dxa"/>
             <w:tcBorders/>
             <w:vAlign w:val="center"/>
           </w:tcPr>
@@ -9838,7 +9838,7 @@
         <w:trPr/>
         <w:tc>
           <w:tcPr>
-            <w:tcW w:w="1684" w:type="dxa"/>
+            <w:tcW w:w="1351" w:type="dxa"/>
             <w:tcBorders/>
             <w:vAlign w:val="center"/>
           </w:tcPr>
@@ -9857,7 +9857,7 @@
         </w:tc>
         <w:tc>
           <w:tcPr>
-            <w:tcW w:w="10476" w:type="dxa"/>
+            <w:tcW w:w="8401" w:type="dxa"/>
             <w:tcBorders/>
             <w:vAlign w:val="center"/>
           </w:tcPr>
@@ -9879,7 +9879,7 @@
         <w:trPr/>
         <w:tc>
           <w:tcPr>
-            <w:tcW w:w="1684" w:type="dxa"/>
+            <w:tcW w:w="1351" w:type="dxa"/>
             <w:tcBorders/>
             <w:vAlign w:val="center"/>
           </w:tcPr>
@@ -9898,7 +9898,7 @@
         </w:tc>
         <w:tc>
           <w:tcPr>
-            <w:tcW w:w="10476" w:type="dxa"/>
+            <w:tcW w:w="8401" w:type="dxa"/>
             <w:tcBorders/>
             <w:vAlign w:val="center"/>
           </w:tcPr>
@@ -9920,7 +9920,7 @@
         <w:trPr/>
         <w:tc>
           <w:tcPr>
-            <w:tcW w:w="1684" w:type="dxa"/>
+            <w:tcW w:w="1351" w:type="dxa"/>
             <w:tcBorders/>
             <w:vAlign w:val="center"/>
           </w:tcPr>
@@ -9939,7 +9939,7 @@
         </w:tc>
         <w:tc>
           <w:tcPr>
-            <w:tcW w:w="10476" w:type="dxa"/>
+            <w:tcW w:w="8401" w:type="dxa"/>
             <w:tcBorders/>
             <w:vAlign w:val="center"/>
           </w:tcPr>
@@ -9961,7 +9961,7 @@
         <w:trPr/>
         <w:tc>
           <w:tcPr>
-            <w:tcW w:w="1684" w:type="dxa"/>
+            <w:tcW w:w="1351" w:type="dxa"/>
             <w:tcBorders/>
             <w:vAlign w:val="center"/>
           </w:tcPr>
@@ -9980,7 +9980,7 @@
         </w:tc>
         <w:tc>
           <w:tcPr>
-            <w:tcW w:w="10476" w:type="dxa"/>
+            <w:tcW w:w="8401" w:type="dxa"/>
             <w:tcBorders/>
             <w:vAlign w:val="center"/>
           </w:tcPr>
@@ -10002,7 +10002,7 @@
         <w:trPr/>
         <w:tc>
           <w:tcPr>
-            <w:tcW w:w="1684" w:type="dxa"/>
+            <w:tcW w:w="1351" w:type="dxa"/>
             <w:tcBorders/>
             <w:vAlign w:val="center"/>
           </w:tcPr>
@@ -10021,7 +10021,7 @@
         </w:tc>
         <w:tc>
           <w:tcPr>
-            <w:tcW w:w="10476" w:type="dxa"/>
+            <w:tcW w:w="8401" w:type="dxa"/>
             <w:tcBorders/>
             <w:vAlign w:val="center"/>
           </w:tcPr>
@@ -10043,7 +10043,7 @@
         <w:trPr/>
         <w:tc>
           <w:tcPr>
-            <w:tcW w:w="1684" w:type="dxa"/>
+            <w:tcW w:w="1351" w:type="dxa"/>
             <w:tcBorders/>
             <w:vAlign w:val="center"/>
           </w:tcPr>
@@ -10062,7 +10062,7 @@
         </w:tc>
         <w:tc>
           <w:tcPr>
-            <w:tcW w:w="10476" w:type="dxa"/>
+            <w:tcW w:w="8401" w:type="dxa"/>
             <w:tcBorders/>
             <w:vAlign w:val="center"/>
           </w:tcPr>
@@ -10084,7 +10084,7 @@
         <w:trPr/>
         <w:tc>
           <w:tcPr>
-            <w:tcW w:w="1684" w:type="dxa"/>
+            <w:tcW w:w="1351" w:type="dxa"/>
             <w:tcBorders/>
             <w:vAlign w:val="center"/>
           </w:tcPr>
@@ -10103,7 +10103,7 @@
         </w:tc>
         <w:tc>
           <w:tcPr>
-            <w:tcW w:w="10476" w:type="dxa"/>
+            <w:tcW w:w="8401" w:type="dxa"/>
             <w:tcBorders/>
             <w:vAlign w:val="center"/>
           </w:tcPr>
@@ -10125,7 +10125,7 @@
         <w:trPr/>
         <w:tc>
           <w:tcPr>
-            <w:tcW w:w="1684" w:type="dxa"/>
+            <w:tcW w:w="1351" w:type="dxa"/>
             <w:tcBorders/>
             <w:vAlign w:val="center"/>
           </w:tcPr>
@@ -10144,7 +10144,7 @@
         </w:tc>
         <w:tc>
           <w:tcPr>
-            <w:tcW w:w="10476" w:type="dxa"/>
+            <w:tcW w:w="8401" w:type="dxa"/>
             <w:tcBorders/>
             <w:vAlign w:val="center"/>
           </w:tcPr>
@@ -10166,7 +10166,7 @@
         <w:trPr/>
         <w:tc>
           <w:tcPr>
-            <w:tcW w:w="1684" w:type="dxa"/>
+            <w:tcW w:w="1351" w:type="dxa"/>
             <w:tcBorders/>
             <w:vAlign w:val="center"/>
           </w:tcPr>
@@ -10185,7 +10185,7 @@
         </w:tc>
         <w:tc>
           <w:tcPr>
-            <w:tcW w:w="10476" w:type="dxa"/>
+            <w:tcW w:w="8401" w:type="dxa"/>
             <w:tcBorders/>
             <w:vAlign w:val="center"/>
           </w:tcPr>
@@ -10207,7 +10207,7 @@
         <w:trPr/>
         <w:tc>
           <w:tcPr>
-            <w:tcW w:w="1684" w:type="dxa"/>
+            <w:tcW w:w="1351" w:type="dxa"/>
             <w:tcBorders/>
             <w:vAlign w:val="center"/>
           </w:tcPr>
@@ -10226,7 +10226,7 @@
         </w:tc>
         <w:tc>
           <w:tcPr>
-            <w:tcW w:w="10476" w:type="dxa"/>
+            <w:tcW w:w="8401" w:type="dxa"/>
             <w:tcBorders/>
             <w:vAlign w:val="center"/>
           </w:tcPr>
@@ -10248,7 +10248,7 @@
         <w:trPr/>
         <w:tc>
           <w:tcPr>
-            <w:tcW w:w="1684" w:type="dxa"/>
+            <w:tcW w:w="1351" w:type="dxa"/>
             <w:tcBorders/>
             <w:vAlign w:val="center"/>
           </w:tcPr>
@@ -10267,7 +10267,7 @@
         </w:tc>
         <w:tc>
           <w:tcPr>
-            <w:tcW w:w="10476" w:type="dxa"/>
+            <w:tcW w:w="8401" w:type="dxa"/>
             <w:tcBorders/>
             <w:vAlign w:val="center"/>
           </w:tcPr>
@@ -10289,7 +10289,7 @@
         <w:trPr/>
         <w:tc>
           <w:tcPr>
-            <w:tcW w:w="1684" w:type="dxa"/>
+            <w:tcW w:w="1351" w:type="dxa"/>
             <w:tcBorders/>
             <w:vAlign w:val="center"/>
           </w:tcPr>
@@ -10308,7 +10308,7 @@
         </w:tc>
         <w:tc>
           <w:tcPr>
-            <w:tcW w:w="10476" w:type="dxa"/>
+            <w:tcW w:w="8401" w:type="dxa"/>
             <w:tcBorders/>
             <w:vAlign w:val="center"/>
           </w:tcPr>
@@ -10330,7 +10330,7 @@
         <w:trPr/>
         <w:tc>
           <w:tcPr>
-            <w:tcW w:w="1684" w:type="dxa"/>
+            <w:tcW w:w="1351" w:type="dxa"/>
             <w:tcBorders/>
             <w:vAlign w:val="center"/>
           </w:tcPr>
@@ -10349,7 +10349,7 @@
         </w:tc>
         <w:tc>
           <w:tcPr>
-            <w:tcW w:w="10476" w:type="dxa"/>
+            <w:tcW w:w="8401" w:type="dxa"/>
             <w:tcBorders/>
             <w:vAlign w:val="center"/>
           </w:tcPr>
@@ -10371,7 +10371,7 @@
         <w:trPr/>
         <w:tc>
           <w:tcPr>
-            <w:tcW w:w="1684" w:type="dxa"/>
+            <w:tcW w:w="1351" w:type="dxa"/>
             <w:tcBorders/>
             <w:vAlign w:val="center"/>
           </w:tcPr>
@@ -10390,7 +10390,7 @@
         </w:tc>
         <w:tc>
           <w:tcPr>
-            <w:tcW w:w="10476" w:type="dxa"/>
+            <w:tcW w:w="8401" w:type="dxa"/>
             <w:tcBorders/>
             <w:vAlign w:val="center"/>
           </w:tcPr>
@@ -10412,7 +10412,7 @@
         <w:trPr/>
         <w:tc>
           <w:tcPr>
-            <w:tcW w:w="1684" w:type="dxa"/>
+            <w:tcW w:w="1351" w:type="dxa"/>
             <w:tcBorders/>
             <w:vAlign w:val="center"/>
           </w:tcPr>
@@ -10431,7 +10431,7 @@
         </w:tc>
         <w:tc>
           <w:tcPr>
-            <w:tcW w:w="10476" w:type="dxa"/>
+            <w:tcW w:w="8401" w:type="dxa"/>
             <w:tcBorders/>
             <w:vAlign w:val="center"/>
           </w:tcPr>
@@ -10453,7 +10453,7 @@
         <w:trPr/>
         <w:tc>
           <w:tcPr>
-            <w:tcW w:w="1684" w:type="dxa"/>
+            <w:tcW w:w="1351" w:type="dxa"/>
             <w:tcBorders/>
             <w:vAlign w:val="center"/>
           </w:tcPr>
@@ -10472,7 +10472,7 @@
         </w:tc>
         <w:tc>
           <w:tcPr>
-            <w:tcW w:w="10476" w:type="dxa"/>
+            <w:tcW w:w="8401" w:type="dxa"/>
             <w:tcBorders/>
             <w:vAlign w:val="center"/>
           </w:tcPr>
@@ -10494,7 +10494,7 @@
         <w:trPr/>
         <w:tc>
           <w:tcPr>
-            <w:tcW w:w="1684" w:type="dxa"/>
+            <w:tcW w:w="1351" w:type="dxa"/>
             <w:tcBorders/>
             <w:vAlign w:val="center"/>
           </w:tcPr>
@@ -10513,7 +10513,7 @@
         </w:tc>
         <w:tc>
           <w:tcPr>
-            <w:tcW w:w="10476" w:type="dxa"/>
+            <w:tcW w:w="8401" w:type="dxa"/>
             <w:tcBorders/>
             <w:vAlign w:val="center"/>
           </w:tcPr>
@@ -10535,7 +10535,7 @@
         <w:trPr/>
         <w:tc>
           <w:tcPr>
-            <w:tcW w:w="1684" w:type="dxa"/>
+            <w:tcW w:w="1351" w:type="dxa"/>
             <w:tcBorders/>
             <w:vAlign w:val="center"/>
           </w:tcPr>
@@ -10554,7 +10554,7 @@
         </w:tc>
         <w:tc>
           <w:tcPr>
-            <w:tcW w:w="10476" w:type="dxa"/>
+            <w:tcW w:w="8401" w:type="dxa"/>
             <w:tcBorders/>
             <w:vAlign w:val="center"/>
           </w:tcPr>
@@ -10576,7 +10576,7 @@
         <w:trPr/>
         <w:tc>
           <w:tcPr>
-            <w:tcW w:w="1684" w:type="dxa"/>
+            <w:tcW w:w="1351" w:type="dxa"/>
             <w:tcBorders/>
             <w:vAlign w:val="center"/>
           </w:tcPr>
@@ -10595,7 +10595,7 @@
         </w:tc>
         <w:tc>
           <w:tcPr>
-            <w:tcW w:w="10476" w:type="dxa"/>
+            <w:tcW w:w="8401" w:type="dxa"/>
             <w:tcBorders/>
             <w:vAlign w:val="center"/>
           </w:tcPr>
@@ -10617,7 +10617,7 @@
         <w:trPr/>
         <w:tc>
           <w:tcPr>
-            <w:tcW w:w="1684" w:type="dxa"/>
+            <w:tcW w:w="1351" w:type="dxa"/>
             <w:tcBorders/>
             <w:vAlign w:val="center"/>
           </w:tcPr>
@@ -10636,7 +10636,7 @@
         </w:tc>
         <w:tc>
           <w:tcPr>
-            <w:tcW w:w="10476" w:type="dxa"/>
+            <w:tcW w:w="8401" w:type="dxa"/>
             <w:tcBorders/>
             <w:vAlign w:val="center"/>
           </w:tcPr>
@@ -10658,7 +10658,7 @@
         <w:trPr/>
         <w:tc>
           <w:tcPr>
-            <w:tcW w:w="1684" w:type="dxa"/>
+            <w:tcW w:w="1351" w:type="dxa"/>
             <w:tcBorders/>
             <w:vAlign w:val="center"/>
           </w:tcPr>
@@ -10677,7 +10677,7 @@
         </w:tc>
         <w:tc>
           <w:tcPr>
-            <w:tcW w:w="10476" w:type="dxa"/>
+            <w:tcW w:w="8401" w:type="dxa"/>
             <w:tcBorders/>
             <w:vAlign w:val="center"/>
           </w:tcPr>
@@ -10699,7 +10699,7 @@
         <w:trPr/>
         <w:tc>
           <w:tcPr>
-            <w:tcW w:w="1684" w:type="dxa"/>
+            <w:tcW w:w="1351" w:type="dxa"/>
             <w:tcBorders/>
             <w:vAlign w:val="center"/>
           </w:tcPr>
@@ -10718,7 +10718,7 @@
         </w:tc>
         <w:tc>
           <w:tcPr>
-            <w:tcW w:w="10476" w:type="dxa"/>
+            <w:tcW w:w="8401" w:type="dxa"/>
             <w:tcBorders/>
             <w:vAlign w:val="center"/>
           </w:tcPr>
@@ -10740,7 +10740,7 @@
         <w:trPr/>
         <w:tc>
           <w:tcPr>
-            <w:tcW w:w="1684" w:type="dxa"/>
+            <w:tcW w:w="1351" w:type="dxa"/>
             <w:tcBorders/>
             <w:vAlign w:val="center"/>
           </w:tcPr>
@@ -10759,7 +10759,7 @@
         </w:tc>
         <w:tc>
           <w:tcPr>
-            <w:tcW w:w="10476" w:type="dxa"/>
+            <w:tcW w:w="8401" w:type="dxa"/>
             <w:tcBorders/>
             <w:vAlign w:val="center"/>
           </w:tcPr>
@@ -10781,7 +10781,7 @@
         <w:trPr/>
         <w:tc>
           <w:tcPr>
-            <w:tcW w:w="1684" w:type="dxa"/>
+            <w:tcW w:w="1351" w:type="dxa"/>
             <w:tcBorders/>
             <w:vAlign w:val="center"/>
           </w:tcPr>
@@ -10800,7 +10800,7 @@
         </w:tc>
         <w:tc>
           <w:tcPr>
-            <w:tcW w:w="10476" w:type="dxa"/>
+            <w:tcW w:w="8401" w:type="dxa"/>
             <w:tcBorders/>
             <w:vAlign w:val="center"/>
           </w:tcPr>
@@ -10822,7 +10822,7 @@
         <w:trPr/>
         <w:tc>
           <w:tcPr>
-            <w:tcW w:w="1684" w:type="dxa"/>
+            <w:tcW w:w="1351" w:type="dxa"/>
             <w:tcBorders/>
             <w:vAlign w:val="center"/>
           </w:tcPr>
@@ -10841,7 +10841,7 @@
         </w:tc>
         <w:tc>
           <w:tcPr>
-            <w:tcW w:w="10476" w:type="dxa"/>
+            <w:tcW w:w="8401" w:type="dxa"/>
             <w:tcBorders/>
             <w:vAlign w:val="center"/>
           </w:tcPr>
@@ -10863,7 +10863,7 @@
         <w:trPr/>
         <w:tc>
           <w:tcPr>
-            <w:tcW w:w="1684" w:type="dxa"/>
+            <w:tcW w:w="1351" w:type="dxa"/>
             <w:tcBorders/>
             <w:vAlign w:val="center"/>
           </w:tcPr>
@@ -10882,7 +10882,7 @@
         </w:tc>
         <w:tc>
           <w:tcPr>
-            <w:tcW w:w="10476" w:type="dxa"/>
+            <w:tcW w:w="8401" w:type="dxa"/>
             <w:tcBorders/>
             <w:vAlign w:val="center"/>
           </w:tcPr>
@@ -10904,7 +10904,7 @@
         <w:trPr/>
         <w:tc>
           <w:tcPr>
-            <w:tcW w:w="1684" w:type="dxa"/>
+            <w:tcW w:w="1351" w:type="dxa"/>
             <w:tcBorders/>
             <w:vAlign w:val="center"/>
           </w:tcPr>
@@ -10923,7 +10923,7 @@
         </w:tc>
         <w:tc>
           <w:tcPr>
-            <w:tcW w:w="10476" w:type="dxa"/>
+            <w:tcW w:w="8401" w:type="dxa"/>
             <w:tcBorders/>
             <w:vAlign w:val="center"/>
           </w:tcPr>
@@ -10945,7 +10945,7 @@
         <w:trPr/>
         <w:tc>
           <w:tcPr>
-            <w:tcW w:w="1684" w:type="dxa"/>
+            <w:tcW w:w="1351" w:type="dxa"/>
             <w:tcBorders/>
             <w:vAlign w:val="center"/>
           </w:tcPr>
@@ -10964,7 +10964,7 @@
         </w:tc>
         <w:tc>
           <w:tcPr>
-            <w:tcW w:w="10476" w:type="dxa"/>
+            <w:tcW w:w="8401" w:type="dxa"/>
             <w:tcBorders/>
             <w:vAlign w:val="center"/>
           </w:tcPr>
@@ -10986,7 +10986,7 @@
         <w:trPr/>
         <w:tc>
           <w:tcPr>
-            <w:tcW w:w="1684" w:type="dxa"/>
+            <w:tcW w:w="1351" w:type="dxa"/>
             <w:tcBorders/>
             <w:vAlign w:val="center"/>
           </w:tcPr>
@@ -11005,7 +11005,7 @@
         </w:tc>
         <w:tc>
           <w:tcPr>
-            <w:tcW w:w="10476" w:type="dxa"/>
+            <w:tcW w:w="8401" w:type="dxa"/>
             <w:tcBorders/>
             <w:vAlign w:val="center"/>
           </w:tcPr>
@@ -11027,7 +11027,7 @@
         <w:trPr/>
         <w:tc>
           <w:tcPr>
-            <w:tcW w:w="1684" w:type="dxa"/>
+            <w:tcW w:w="1351" w:type="dxa"/>
             <w:tcBorders/>
             <w:vAlign w:val="center"/>
           </w:tcPr>
@@ -11046,7 +11046,7 @@
         </w:tc>
         <w:tc>
           <w:tcPr>
-            <w:tcW w:w="10476" w:type="dxa"/>
+            <w:tcW w:w="8401" w:type="dxa"/>
             <w:tcBorders/>
             <w:vAlign w:val="center"/>
           </w:tcPr>
@@ -11068,7 +11068,7 @@
         <w:trPr/>
         <w:tc>
           <w:tcPr>
-            <w:tcW w:w="1684" w:type="dxa"/>
+            <w:tcW w:w="1351" w:type="dxa"/>
             <w:tcBorders/>
             <w:vAlign w:val="center"/>
           </w:tcPr>
@@ -11087,7 +11087,7 @@
         </w:tc>
         <w:tc>
           <w:tcPr>
-            <w:tcW w:w="10476" w:type="dxa"/>
+            <w:tcW w:w="8401" w:type="dxa"/>
             <w:tcBorders/>
             <w:vAlign w:val="center"/>
           </w:tcPr>
@@ -11109,7 +11109,7 @@
         <w:trPr/>
         <w:tc>
           <w:tcPr>
-            <w:tcW w:w="1684" w:type="dxa"/>
+            <w:tcW w:w="1351" w:type="dxa"/>
             <w:tcBorders/>
             <w:vAlign w:val="center"/>
           </w:tcPr>
@@ -11128,7 +11128,7 @@
         </w:tc>
         <w:tc>
           <w:tcPr>
-            <w:tcW w:w="10476" w:type="dxa"/>
+            <w:tcW w:w="8401" w:type="dxa"/>
             <w:tcBorders/>
             <w:vAlign w:val="center"/>
           </w:tcPr>
@@ -11150,7 +11150,7 @@
         <w:trPr/>
         <w:tc>
           <w:tcPr>
-            <w:tcW w:w="1684" w:type="dxa"/>
+            <w:tcW w:w="1351" w:type="dxa"/>
             <w:tcBorders/>
             <w:vAlign w:val="center"/>
           </w:tcPr>
@@ -11169,7 +11169,7 @@
         </w:tc>
         <w:tc>
           <w:tcPr>
-            <w:tcW w:w="10476" w:type="dxa"/>
+            <w:tcW w:w="8401" w:type="dxa"/>
             <w:tcBorders/>
             <w:vAlign w:val="center"/>
           </w:tcPr>
@@ -11191,7 +11191,7 @@
         <w:trPr/>
         <w:tc>
           <w:tcPr>
-            <w:tcW w:w="1684" w:type="dxa"/>
+            <w:tcW w:w="1351" w:type="dxa"/>
             <w:tcBorders/>
             <w:vAlign w:val="center"/>
           </w:tcPr>
@@ -11210,7 +11210,7 @@
         </w:tc>
         <w:tc>
           <w:tcPr>
-            <w:tcW w:w="10476" w:type="dxa"/>
+            <w:tcW w:w="8401" w:type="dxa"/>
             <w:tcBorders/>
             <w:vAlign w:val="center"/>
           </w:tcPr>
@@ -11232,7 +11232,7 @@
         <w:trPr/>
         <w:tc>
           <w:tcPr>
-            <w:tcW w:w="1684" w:type="dxa"/>
+            <w:tcW w:w="1351" w:type="dxa"/>
             <w:tcBorders/>
             <w:vAlign w:val="center"/>
           </w:tcPr>
@@ -11251,7 +11251,7 @@
         </w:tc>
         <w:tc>
           <w:tcPr>
-            <w:tcW w:w="10476" w:type="dxa"/>
+            <w:tcW w:w="8401" w:type="dxa"/>
             <w:tcBorders/>
             <w:vAlign w:val="center"/>
           </w:tcPr>
@@ -11273,7 +11273,7 @@
         <w:trPr/>
         <w:tc>
           <w:tcPr>
-            <w:tcW w:w="1684" w:type="dxa"/>
+            <w:tcW w:w="1351" w:type="dxa"/>
             <w:tcBorders/>
             <w:vAlign w:val="center"/>
           </w:tcPr>
@@ -11292,7 +11292,7 @@
         </w:tc>
         <w:tc>
           <w:tcPr>
-            <w:tcW w:w="10476" w:type="dxa"/>
+            <w:tcW w:w="8401" w:type="dxa"/>
             <w:tcBorders/>
             <w:vAlign w:val="center"/>
           </w:tcPr>
@@ -11314,7 +11314,7 @@
         <w:trPr/>
         <w:tc>
           <w:tcPr>
-            <w:tcW w:w="1684" w:type="dxa"/>
+            <w:tcW w:w="1351" w:type="dxa"/>
             <w:tcBorders/>
             <w:vAlign w:val="center"/>
           </w:tcPr>
@@ -11333,7 +11333,7 @@
         </w:tc>
         <w:tc>
           <w:tcPr>
-            <w:tcW w:w="10476" w:type="dxa"/>
+            <w:tcW w:w="8401" w:type="dxa"/>
             <w:tcBorders/>
             <w:vAlign w:val="center"/>
           </w:tcPr>
@@ -13422,7 +13422,7 @@
     </w:p>
     <w:tbl>
       <w:tblPr>
-        <w:tblW w:w="10275" w:type="dxa"/>
+        <w:tblW w:w="9752" w:type="dxa"/>
         <w:jc w:val="start"/>
         <w:tblInd w:w="0" w:type="dxa"/>
         <w:tblLayout w:type="fixed"/>
@@ -13434,14 +13434,14 @@
         </w:tblCellMar>
       </w:tblPr>
       <w:tblGrid>
-        <w:gridCol w:w="669"/>
-        <w:gridCol w:w="9606"/>
+        <w:gridCol w:w="635"/>
+        <w:gridCol w:w="9117"/>
       </w:tblGrid>
       <w:tr>
         <w:trPr/>
         <w:tc>
           <w:tcPr>
-            <w:tcW w:w="669" w:type="dxa"/>
+            <w:tcW w:w="635" w:type="dxa"/>
             <w:tcBorders/>
             <w:vAlign w:val="center"/>
           </w:tcPr>
@@ -13463,7 +13463,7 @@
         </w:tc>
         <w:tc>
           <w:tcPr>
-            <w:tcW w:w="9606" w:type="dxa"/>
+            <w:tcW w:w="9117" w:type="dxa"/>
             <w:tcBorders/>
             <w:vAlign w:val="center"/>
           </w:tcPr>
@@ -13488,7 +13488,7 @@
         <w:trPr/>
         <w:tc>
           <w:tcPr>
-            <w:tcW w:w="669" w:type="dxa"/>
+            <w:tcW w:w="635" w:type="dxa"/>
             <w:tcBorders/>
             <w:vAlign w:val="center"/>
           </w:tcPr>
@@ -13507,7 +13507,7 @@
         </w:tc>
         <w:tc>
           <w:tcPr>
-            <w:tcW w:w="9606" w:type="dxa"/>
+            <w:tcW w:w="9117" w:type="dxa"/>
             <w:tcBorders/>
             <w:vAlign w:val="center"/>
           </w:tcPr>
@@ -13529,7 +13529,7 @@
         <w:trPr/>
         <w:tc>
           <w:tcPr>
-            <w:tcW w:w="669" w:type="dxa"/>
+            <w:tcW w:w="635" w:type="dxa"/>
             <w:tcBorders/>
             <w:vAlign w:val="center"/>
           </w:tcPr>
@@ -13548,7 +13548,7 @@
         </w:tc>
         <w:tc>
           <w:tcPr>
-            <w:tcW w:w="9606" w:type="dxa"/>
+            <w:tcW w:w="9117" w:type="dxa"/>
             <w:tcBorders/>
             <w:vAlign w:val="center"/>
           </w:tcPr>
@@ -13570,7 +13570,7 @@
         <w:trPr/>
         <w:tc>
           <w:tcPr>
-            <w:tcW w:w="669" w:type="dxa"/>
+            <w:tcW w:w="635" w:type="dxa"/>
             <w:tcBorders/>
             <w:vAlign w:val="center"/>
           </w:tcPr>
@@ -13589,7 +13589,7 @@
         </w:tc>
         <w:tc>
           <w:tcPr>
-            <w:tcW w:w="9606" w:type="dxa"/>
+            <w:tcW w:w="9117" w:type="dxa"/>
             <w:tcBorders/>
             <w:vAlign w:val="center"/>
           </w:tcPr>
@@ -13611,7 +13611,7 @@
         <w:trPr/>
         <w:tc>
           <w:tcPr>
-            <w:tcW w:w="669" w:type="dxa"/>
+            <w:tcW w:w="635" w:type="dxa"/>
             <w:tcBorders/>
             <w:vAlign w:val="center"/>
           </w:tcPr>
@@ -13630,7 +13630,7 @@
         </w:tc>
         <w:tc>
           <w:tcPr>
-            <w:tcW w:w="9606" w:type="dxa"/>
+            <w:tcW w:w="9117" w:type="dxa"/>
             <w:tcBorders/>
             <w:vAlign w:val="center"/>
           </w:tcPr>

</xml_diff>

<commit_message>
Prepare 2.9.0 alpha planner and sight-visibility improvements
</commit_message>
<xml_diff>
--- a/docs/v2/output/Celestial_Navigation_Manual_v2.docx
+++ b/docs/v2/output/Celestial_Navigation_Manual_v2.docx
@@ -56,7 +56,7 @@
         <w:rPr/>
         <w:t>Celestial Navigation plugin 2.9.0</w:t>
         <w:br/>
-        <w:t>Documentation revision 20 September 2026</w:t>
+        <w:t>Documentation revision 23 September 2026</w:t>
       </w:r>
     </w:p>
     <w:p>
@@ -3031,7 +3031,7 @@
         <w:rPr/>
         <w:drawing>
           <wp:inline distT="0" distB="0" distL="0" distR="0">
-            <wp:extent cx="5850000" cy="2991302"/>
+            <wp:extent cx="5850000" cy="2992880"/>
             <wp:effectExtent l="0" t="0" r="0" b="0"/>
             <wp:docPr id="6" name="Image6" title="Two globes comparing the predicted geographic position with correct UTC and a watch twenty minutes slow."/>
             <wp:cNvGraphicFramePr>
@@ -3055,7 +3055,7 @@
                   <pic:spPr bwMode="auto">
                     <a:xfrm>
                       <a:off x="0" y="0"/>
-                      <a:ext cx="5850000" cy="2991302"/>
+                      <a:ext cx="5850000" cy="2992880"/>
                     </a:xfrm>
                     <a:prstGeom prst="rect">
                       <a:avLst/>
@@ -3256,14 +3256,14 @@
         </w:tblCellMar>
       </w:tblPr>
       <w:tblGrid>
-        <w:gridCol w:w="1500"/>
-        <w:gridCol w:w="8252"/>
+        <w:gridCol w:w="1693"/>
+        <w:gridCol w:w="8059"/>
       </w:tblGrid>
       <w:tr>
         <w:trPr/>
         <w:tc>
           <w:tcPr>
-            <w:tcW w:w="1500" w:type="dxa"/>
+            <w:tcW w:w="1693" w:type="dxa"/>
             <w:tcBorders/>
             <w:vAlign w:val="center"/>
           </w:tcPr>
@@ -3285,7 +3285,7 @@
         </w:tc>
         <w:tc>
           <w:tcPr>
-            <w:tcW w:w="8252" w:type="dxa"/>
+            <w:tcW w:w="8059" w:type="dxa"/>
             <w:tcBorders/>
             <w:vAlign w:val="center"/>
           </w:tcPr>
@@ -3310,7 +3310,7 @@
         <w:trPr/>
         <w:tc>
           <w:tcPr>
-            <w:tcW w:w="1500" w:type="dxa"/>
+            <w:tcW w:w="1693" w:type="dxa"/>
             <w:tcBorders/>
             <w:vAlign w:val="center"/>
           </w:tcPr>
@@ -3329,7 +3329,7 @@
         </w:tc>
         <w:tc>
           <w:tcPr>
-            <w:tcW w:w="8252" w:type="dxa"/>
+            <w:tcW w:w="8059" w:type="dxa"/>
             <w:tcBorders/>
             <w:vAlign w:val="center"/>
           </w:tcPr>
@@ -3351,7 +3351,7 @@
         <w:trPr/>
         <w:tc>
           <w:tcPr>
-            <w:tcW w:w="1500" w:type="dxa"/>
+            <w:tcW w:w="1693" w:type="dxa"/>
             <w:tcBorders/>
             <w:vAlign w:val="center"/>
           </w:tcPr>
@@ -3370,7 +3370,7 @@
         </w:tc>
         <w:tc>
           <w:tcPr>
-            <w:tcW w:w="8252" w:type="dxa"/>
+            <w:tcW w:w="8059" w:type="dxa"/>
             <w:tcBorders/>
             <w:vAlign w:val="center"/>
           </w:tcPr>
@@ -3392,7 +3392,7 @@
         <w:trPr/>
         <w:tc>
           <w:tcPr>
-            <w:tcW w:w="1500" w:type="dxa"/>
+            <w:tcW w:w="1693" w:type="dxa"/>
             <w:tcBorders/>
             <w:vAlign w:val="center"/>
           </w:tcPr>
@@ -3411,7 +3411,7 @@
         </w:tc>
         <w:tc>
           <w:tcPr>
-            <w:tcW w:w="8252" w:type="dxa"/>
+            <w:tcW w:w="8059" w:type="dxa"/>
             <w:tcBorders/>
             <w:vAlign w:val="center"/>
           </w:tcPr>
@@ -3433,7 +3433,7 @@
         <w:trPr/>
         <w:tc>
           <w:tcPr>
-            <w:tcW w:w="1500" w:type="dxa"/>
+            <w:tcW w:w="1693" w:type="dxa"/>
             <w:tcBorders/>
             <w:vAlign w:val="center"/>
           </w:tcPr>
@@ -3452,7 +3452,7 @@
         </w:tc>
         <w:tc>
           <w:tcPr>
-            <w:tcW w:w="8252" w:type="dxa"/>
+            <w:tcW w:w="8059" w:type="dxa"/>
             <w:tcBorders/>
             <w:vAlign w:val="center"/>
           </w:tcPr>
@@ -3474,7 +3474,7 @@
         <w:trPr/>
         <w:tc>
           <w:tcPr>
-            <w:tcW w:w="1500" w:type="dxa"/>
+            <w:tcW w:w="1693" w:type="dxa"/>
             <w:tcBorders/>
             <w:vAlign w:val="center"/>
           </w:tcPr>
@@ -3493,7 +3493,7 @@
         </w:tc>
         <w:tc>
           <w:tcPr>
-            <w:tcW w:w="8252" w:type="dxa"/>
+            <w:tcW w:w="8059" w:type="dxa"/>
             <w:tcBorders/>
             <w:vAlign w:val="center"/>
           </w:tcPr>
@@ -3515,7 +3515,7 @@
         <w:trPr/>
         <w:tc>
           <w:tcPr>
-            <w:tcW w:w="1500" w:type="dxa"/>
+            <w:tcW w:w="1693" w:type="dxa"/>
             <w:tcBorders/>
             <w:vAlign w:val="center"/>
           </w:tcPr>
@@ -3534,7 +3534,7 @@
         </w:tc>
         <w:tc>
           <w:tcPr>
-            <w:tcW w:w="8252" w:type="dxa"/>
+            <w:tcW w:w="8059" w:type="dxa"/>
             <w:tcBorders/>
             <w:vAlign w:val="center"/>
           </w:tcPr>
@@ -3556,7 +3556,7 @@
         <w:trPr/>
         <w:tc>
           <w:tcPr>
-            <w:tcW w:w="1500" w:type="dxa"/>
+            <w:tcW w:w="1693" w:type="dxa"/>
             <w:tcBorders/>
             <w:vAlign w:val="center"/>
           </w:tcPr>
@@ -3575,7 +3575,7 @@
         </w:tc>
         <w:tc>
           <w:tcPr>
-            <w:tcW w:w="8252" w:type="dxa"/>
+            <w:tcW w:w="8059" w:type="dxa"/>
             <w:tcBorders/>
             <w:vAlign w:val="center"/>
           </w:tcPr>
@@ -3597,7 +3597,7 @@
         <w:trPr/>
         <w:tc>
           <w:tcPr>
-            <w:tcW w:w="1500" w:type="dxa"/>
+            <w:tcW w:w="1693" w:type="dxa"/>
             <w:tcBorders/>
             <w:vAlign w:val="center"/>
           </w:tcPr>
@@ -3616,7 +3616,7 @@
         </w:tc>
         <w:tc>
           <w:tcPr>
-            <w:tcW w:w="8252" w:type="dxa"/>
+            <w:tcW w:w="8059" w:type="dxa"/>
             <w:tcBorders/>
             <w:vAlign w:val="center"/>
           </w:tcPr>
@@ -3638,7 +3638,7 @@
         <w:trPr/>
         <w:tc>
           <w:tcPr>
-            <w:tcW w:w="1500" w:type="dxa"/>
+            <w:tcW w:w="1693" w:type="dxa"/>
             <w:tcBorders/>
             <w:vAlign w:val="center"/>
           </w:tcPr>
@@ -3657,7 +3657,7 @@
         </w:tc>
         <w:tc>
           <w:tcPr>
-            <w:tcW w:w="8252" w:type="dxa"/>
+            <w:tcW w:w="8059" w:type="dxa"/>
             <w:tcBorders/>
             <w:vAlign w:val="center"/>
           </w:tcPr>
@@ -3679,7 +3679,7 @@
         <w:trPr/>
         <w:tc>
           <w:tcPr>
-            <w:tcW w:w="1500" w:type="dxa"/>
+            <w:tcW w:w="1693" w:type="dxa"/>
             <w:tcBorders/>
             <w:vAlign w:val="center"/>
           </w:tcPr>
@@ -3698,7 +3698,7 @@
         </w:tc>
         <w:tc>
           <w:tcPr>
-            <w:tcW w:w="8252" w:type="dxa"/>
+            <w:tcW w:w="8059" w:type="dxa"/>
             <w:tcBorders/>
             <w:vAlign w:val="center"/>
           </w:tcPr>
@@ -3720,7 +3720,7 @@
         <w:trPr/>
         <w:tc>
           <w:tcPr>
-            <w:tcW w:w="1500" w:type="dxa"/>
+            <w:tcW w:w="1693" w:type="dxa"/>
             <w:tcBorders/>
             <w:vAlign w:val="center"/>
           </w:tcPr>
@@ -3739,7 +3739,7 @@
         </w:tc>
         <w:tc>
           <w:tcPr>
-            <w:tcW w:w="8252" w:type="dxa"/>
+            <w:tcW w:w="8059" w:type="dxa"/>
             <w:tcBorders/>
             <w:vAlign w:val="center"/>
           </w:tcPr>
@@ -3761,7 +3761,7 @@
         <w:trPr/>
         <w:tc>
           <w:tcPr>
-            <w:tcW w:w="1500" w:type="dxa"/>
+            <w:tcW w:w="1693" w:type="dxa"/>
             <w:tcBorders/>
             <w:vAlign w:val="center"/>
           </w:tcPr>
@@ -3780,7 +3780,7 @@
         </w:tc>
         <w:tc>
           <w:tcPr>
-            <w:tcW w:w="8252" w:type="dxa"/>
+            <w:tcW w:w="8059" w:type="dxa"/>
             <w:tcBorders/>
             <w:vAlign w:val="center"/>
           </w:tcPr>
@@ -3802,39 +3802,39 @@
         <w:trPr/>
         <w:tc>
           <w:tcPr>
-            <w:tcW w:w="1500" w:type="dxa"/>
-            <w:tcBorders/>
-            <w:vAlign w:val="center"/>
-          </w:tcPr>
-          <w:p>
-            <w:pPr>
-              <w:pStyle w:val="TableContents"/>
-              <w:bidi w:val="0"/>
-              <w:spacing w:before="0" w:after="283"/>
-              <w:rPr/>
-            </w:pPr>
-            <w:r>
-              <w:rPr/>
-              <w:t>Hide Sights / Show Sights</w:t>
-            </w:r>
-          </w:p>
-        </w:tc>
-        <w:tc>
-          <w:tcPr>
-            <w:tcW w:w="8252" w:type="dxa"/>
-            <w:tcBorders/>
-            <w:vAlign w:val="center"/>
-          </w:tcPr>
-          <w:p>
-            <w:pPr>
-              <w:pStyle w:val="TableContents"/>
-              <w:bidi w:val="0"/>
-              <w:spacing w:before="0" w:after="283"/>
-              <w:rPr/>
-            </w:pPr>
-            <w:r>
-              <w:rPr/>
-              <w:t>Collapse or restore the sight list and controls.</w:t>
+            <w:tcW w:w="1693" w:type="dxa"/>
+            <w:tcBorders/>
+            <w:vAlign w:val="center"/>
+          </w:tcPr>
+          <w:p>
+            <w:pPr>
+              <w:pStyle w:val="TableContents"/>
+              <w:bidi w:val="0"/>
+              <w:spacing w:before="0" w:after="283"/>
+              <w:rPr/>
+            </w:pPr>
+            <w:r>
+              <w:rPr/>
+              <w:t>Hide sight log / Show sight log</w:t>
+            </w:r>
+          </w:p>
+        </w:tc>
+        <w:tc>
+          <w:tcPr>
+            <w:tcW w:w="8059" w:type="dxa"/>
+            <w:tcBorders/>
+            <w:vAlign w:val="center"/>
+          </w:tcPr>
+          <w:p>
+            <w:pPr>
+              <w:pStyle w:val="TableContents"/>
+              <w:bidi w:val="0"/>
+              <w:spacing w:before="0" w:after="283"/>
+              <w:rPr/>
+            </w:pPr>
+            <w:r>
+              <w:rPr/>
+              <w:t>Collapse or restore the sight list; this does not hide its chart plots.</w:t>
             </w:r>
           </w:p>
         </w:tc>
@@ -3843,39 +3843,39 @@
         <w:trPr/>
         <w:tc>
           <w:tcPr>
-            <w:tcW w:w="1500" w:type="dxa"/>
-            <w:tcBorders/>
-            <w:vAlign w:val="center"/>
-          </w:tcPr>
-          <w:p>
-            <w:pPr>
-              <w:pStyle w:val="TableContents"/>
-              <w:bidi w:val="0"/>
-              <w:spacing w:before="0" w:after="283"/>
-              <w:rPr/>
-            </w:pPr>
-            <w:r>
-              <w:rPr/>
-              <w:t>Documentation</w:t>
-            </w:r>
-          </w:p>
-        </w:tc>
-        <w:tc>
-          <w:tcPr>
-            <w:tcW w:w="8252" w:type="dxa"/>
-            <w:tcBorders/>
-            <w:vAlign w:val="center"/>
-          </w:tcPr>
-          <w:p>
-            <w:pPr>
-              <w:pStyle w:val="TableContents"/>
-              <w:bidi w:val="0"/>
-              <w:spacing w:before="0" w:after="283"/>
-              <w:rPr/>
-            </w:pPr>
-            <w:r>
-              <w:rPr/>
-              <w:t>Open this completely offline manual in the plugin's internal viewer.</w:t>
+            <w:tcW w:w="1693" w:type="dxa"/>
+            <w:tcBorders/>
+            <w:vAlign w:val="center"/>
+          </w:tcPr>
+          <w:p>
+            <w:pPr>
+              <w:pStyle w:val="TableContents"/>
+              <w:bidi w:val="0"/>
+              <w:spacing w:before="0" w:after="283"/>
+              <w:rPr/>
+            </w:pPr>
+            <w:r>
+              <w:rPr/>
+              <w:t>Chart display…</w:t>
+            </w:r>
+          </w:p>
+        </w:tc>
+        <w:tc>
+          <w:tcPr>
+            <w:tcW w:w="8059" w:type="dxa"/>
+            <w:tcBorders/>
+            <w:vAlign w:val="center"/>
+          </w:tcPr>
+          <w:p>
+            <w:pPr>
+              <w:pStyle w:val="TableContents"/>
+              <w:bidi w:val="0"/>
+              <w:spacing w:before="0" w:after="283"/>
+              <w:rPr/>
+            </w:pPr>
+            <w:r>
+              <w:rPr/>
+              <w:t>Adjust nominal line width, contrasting outline, uncertainty shading and hover labels for all sights.</w:t>
             </w:r>
           </w:p>
         </w:tc>
@@ -3884,7 +3884,48 @@
         <w:trPr/>
         <w:tc>
           <w:tcPr>
-            <w:tcW w:w="1500" w:type="dxa"/>
+            <w:tcW w:w="1693" w:type="dxa"/>
+            <w:tcBorders/>
+            <w:vAlign w:val="center"/>
+          </w:tcPr>
+          <w:p>
+            <w:pPr>
+              <w:pStyle w:val="TableContents"/>
+              <w:bidi w:val="0"/>
+              <w:spacing w:before="0" w:after="283"/>
+              <w:rPr/>
+            </w:pPr>
+            <w:r>
+              <w:rPr/>
+              <w:t>Documentation</w:t>
+            </w:r>
+          </w:p>
+        </w:tc>
+        <w:tc>
+          <w:tcPr>
+            <w:tcW w:w="8059" w:type="dxa"/>
+            <w:tcBorders/>
+            <w:vAlign w:val="center"/>
+          </w:tcPr>
+          <w:p>
+            <w:pPr>
+              <w:pStyle w:val="TableContents"/>
+              <w:bidi w:val="0"/>
+              <w:spacing w:before="0" w:after="283"/>
+              <w:rPr/>
+            </w:pPr>
+            <w:r>
+              <w:rPr/>
+              <w:t>Open this completely offline manual in the plugin's internal viewer.</w:t>
+            </w:r>
+          </w:p>
+        </w:tc>
+      </w:tr>
+      <w:tr>
+        <w:trPr/>
+        <w:tc>
+          <w:tcPr>
+            <w:tcW w:w="1693" w:type="dxa"/>
             <w:tcBorders/>
             <w:vAlign w:val="center"/>
           </w:tcPr>
@@ -3903,7 +3944,7 @@
         </w:tc>
         <w:tc>
           <w:tcPr>
-            <w:tcW w:w="8252" w:type="dxa"/>
+            <w:tcW w:w="8059" w:type="dxa"/>
             <w:tcBorders/>
             <w:vAlign w:val="center"/>
           </w:tcPr>
@@ -3922,6 +3963,58 @@
         </w:tc>
       </w:tr>
     </w:tbl>
+    <w:p>
+      <w:pPr>
+        <w:pStyle w:val="BodyText"/>
+        <w:bidi w:val="0"/>
+        <w:rPr/>
+      </w:pPr>
+      <w:r>
+        <w:rPr/>
+        <w:t xml:space="preserve">The nominal COP is an opaque central stroke in the sight colour, with an automatic black or white outline. Its default width is 0.5 mm, scaled for the display. </w:t>
+      </w:r>
+      <w:r>
+        <w:rPr>
+          <w:rStyle w:val="Strong"/>
+        </w:rPr>
+        <w:t>Chart display…</w:t>
+      </w:r>
+      <w:r>
+        <w:rPr/>
+        <w:t xml:space="preserve"> remembers a global width (0.2–2.0 mm) and an independent shading multiplier; reducing uncertainty shading does not fade or move the nominal line. The per-sight transparency remains available. The shaded region represents input uncertainty, not a guaranteed position bound.</w:t>
+      </w:r>
+    </w:p>
+    <w:p>
+      <w:pPr>
+        <w:pStyle w:val="BodyText"/>
+        <w:bidi w:val="0"/>
+        <w:rPr/>
+      </w:pPr>
+      <w:r>
+        <w:rPr/>
+        <w:t xml:space="preserve">Hover near a plotted nominal line to see the body, corrected UTC and sight number. Overlapping COPs list up to four nearby sights and report any further matches. In a sight's </w:t>
+      </w:r>
+      <w:r>
+        <w:rPr>
+          <w:rStyle w:val="Strong"/>
+        </w:rPr>
+        <w:t>Config</w:t>
+      </w:r>
+      <w:r>
+        <w:rPr/>
+        <w:t xml:space="preserve"> tab, choose a named colour or use the custom colour picker. Non-palette colours are labelled </w:t>
+      </w:r>
+      <w:r>
+        <w:rPr>
+          <w:rStyle w:val="Strong"/>
+        </w:rPr>
+        <w:t>Custom (#RRGGBB)</w:t>
+      </w:r>
+      <w:r>
+        <w:rPr/>
+        <w:t>. Existing colours are retained; use the sight log and hover labels, not colour alone, to identify observations.</w:t>
+      </w:r>
+    </w:p>
     <w:p>
       <w:pPr>
         <w:pStyle w:val="BodyText"/>
@@ -4933,7 +5026,7 @@
       </w:r>
       <w:r>
         <w:rPr/>
-        <w:t xml:space="preserve"> optionally applies the adjacent, editable minimum and maximum only to suggested pairs and triads. The initial preferred range is 10°–75°. Bodies outside it remain in the table and are marked below or above the preferred Hc; disabling the option makes every listed body eligible for recommendations.</w:t>
+        <w:t xml:space="preserve"> optionally applies the adjacent, editable minimum and maximum only to suggested pairs and triads. The initial preferred range is 10°–75°. Bodies outside it remain in the table and are marked below or above the preferred Hc; disabling the option makes every above-horizon body eligible for recommendations. All eligible bodies are considered for pair/triad geometry, not just a brightness shortlist.</w:t>
       </w:r>
     </w:p>
     <w:p>
@@ -4950,7 +5043,48 @@
       </w:r>
       <w:r>
         <w:rPr/>
-        <w:t xml:space="preserve"> shows predicted geocentric Moon-body distance, signed distance rate, the seconds represented by 0.1′, companion ecliptic latitude, both altitudes and bearings, illumination and guidance. A positive rate means increasing distance. The suitability ordering combines timing rate, distance, ecliptic proximity, altitude and brightness. Read the flags for faint, low, daylight or awkward-distance pairs; the ordering is a planning aid. This differs from the separate Lunar Tools pair table, which orders by 0.1′ timing sensitivity with below-horizon pairs last.</w:t>
+        <w:t xml:space="preserve"> shows predicted geocentric Moon-body distance, signed distance rate, the seconds represented by 0.1′, companion ecliptic latitude, both altitudes and bearings, illumination and guidance. A positive rate means increasing distance. Both planners use the same explainable default: fewest planning cautions, then strongest timing sensitivity. Choose </w:t>
+      </w:r>
+      <w:r>
+        <w:rPr>
+          <w:rStyle w:val="Strong"/>
+        </w:rPr>
+        <w:t>Lunar order: timing sensitivity</w:t>
+      </w:r>
+      <w:r>
+        <w:rPr/>
+        <w:t xml:space="preserve"> to put timing first. Below-horizon pairs remain last. Cautions flag altitude outside 10°–75°, distance outside 20°–100°, absolute rate below 10′/hour, companion magnitude above 2.5, or Sun altitude above −6° for companions fainter than magnitude −2. These preferences do not establish visibility. Ecliptic latitude is descriptive, not an additional weight on top of the calculated rate.</w:t>
+      </w:r>
+    </w:p>
+    <w:p>
+      <w:pPr>
+        <w:pStyle w:val="BodyText"/>
+        <w:bidi w:val="0"/>
+        <w:rPr/>
+      </w:pPr>
+      <w:r>
+        <w:rPr/>
+        <w:t xml:space="preserve">Select a companion in </w:t>
+      </w:r>
+      <w:r>
+        <w:rPr>
+          <w:rStyle w:val="Strong"/>
+        </w:rPr>
+        <w:t>All bodies</w:t>
+      </w:r>
+      <w:r>
+        <w:rPr/>
+        <w:t xml:space="preserve">, then choose </w:t>
+      </w:r>
+      <w:r>
+        <w:rPr>
+          <w:rStyle w:val="Strong"/>
+        </w:rPr>
+        <w:t>Lunar windows for selected body…</w:t>
+      </w:r>
+      <w:r>
+        <w:rPr/>
+        <w:t xml:space="preserve"> to search the next 24 hours in 10-minute samples. Results show intervals meeting the above preferences and the best sampled timing within each interval. The search uses the entered moving-observer course and speed when enabled. Boundaries are approximate; an empty result does not prove that the pair cannot be observed.</w:t>
       </w:r>
     </w:p>
     <w:p>
@@ -5019,7 +5153,7 @@
       </w:r>
       <w:r>
         <w:rPr/>
-        <w:t xml:space="preserve"> shows celestial coordinates and is useful for a longer Moon track. The ecliptic follows the date's obliquity and the Moon path follows the selected ephemeris. Neither replaces a visibility check.</w:t>
+        <w:t xml:space="preserve"> shows celestial coordinates and is useful for a longer Moon track. The ecliptic follows the date's obliquity and the Moon path follows the selected ephemeris, with UTC labels at its start, middle and end. Selecting a body highlights its plotted symbol. Neither overlay replaces a visibility check.</w:t>
       </w:r>
     </w:p>
     <w:p>
@@ -7115,18 +7249,49 @@
       </w:r>
       <w:r>
         <w:rPr/>
-        <w:t xml:space="preserve"> orders pairs by the approximate UTC change corresponding to 0.1′ of lunar distance, shortest first, with below-horizon pairs last. It shows centre separation, signed distance rate in arcminutes per hour, Moon/body altitude and true azimuth, Moon illumination, body magnitude and which body is below the geometric horizon. A small time value indicates greater timing sensitivity. There is no combined quality score: use the measured quantities to assess visibility, sextant range and whether the pair is practical to observe.</w:t>
-      </w:r>
-    </w:p>
-    <w:p>
-      <w:pPr>
-        <w:pStyle w:val="BodyText"/>
-        <w:bidi w:val="0"/>
-        <w:rPr/>
-      </w:pPr>
-      <w:r>
-        <w:rPr/>
-        <w:t>In 2.9.0 this table also shows the companion's signed ecliptic latitude and guidance derived from the same planning model as the main planner. Its ordering still uses timing sensitivity, not the main planner's combined suitability score.</w:t>
+        <w:t xml:space="preserve"> uses the same default ordering and optional timing-first choice as </w:t>
+      </w:r>
+      <w:r>
+        <w:rPr>
+          <w:rStyle w:val="Strong"/>
+        </w:rPr>
+        <w:t>Bodies &amp; Best Sights</w:t>
+      </w:r>
+      <w:r>
+        <w:rPr/>
+        <w:t>, with below-horizon pairs last. It shows centre separation, signed distance rate in arcminutes per hour, Moon/body altitude and true azimuth, Moon illumination, body magnitude and which body is below the geometric horizon. A small time value indicates greater timing sensitivity. There is no combined quality score: use the measured quantities to assess visibility, sextant range and whether the pair is practical to observe.</w:t>
+      </w:r>
+    </w:p>
+    <w:p>
+      <w:pPr>
+        <w:pStyle w:val="BodyText"/>
+        <w:bidi w:val="0"/>
+        <w:rPr/>
+      </w:pPr>
+      <w:r>
+        <w:rPr/>
+        <w:t>In 2.9.0 this table also shows the companion's signed ecliptic latitude and guidance derived from the same planning model as the main planner.</w:t>
+      </w:r>
+    </w:p>
+    <w:p>
+      <w:pPr>
+        <w:pStyle w:val="BodyText"/>
+        <w:bidi w:val="0"/>
+        <w:rPr/>
+      </w:pPr>
+      <w:r>
+        <w:rPr/>
+        <w:t xml:space="preserve">When a lunar solution reports several candidate UTCs, even very close values are </w:t>
+      </w:r>
+      <w:r>
+        <w:rPr>
+          <w:rStyle w:val="Strong"/>
+        </w:rPr>
+        <w:t>unresolved alternatives, not measurements to average</w:t>
+      </w:r>
+      <w:r>
+        <w:rPr/>
+        <w:t>. Use another observation or independent position/time evidence to distinguish them. A preferred candidate chosen by proximity to DR or entered UTC does not establish that the ambiguity has been resolved.</w:t>
       </w:r>
     </w:p>
     <w:p>
@@ -7931,6 +8096,57 @@
       <w:r>
         <w:rPr/>
         <w:t xml:space="preserve"> optional lunar-topography refinement of contact timing; not required for ordinary eclipse use. </w:t>
+      </w:r>
+    </w:p>
+    <w:p>
+      <w:pPr>
+        <w:pStyle w:val="BodyText"/>
+        <w:bidi w:val="0"/>
+        <w:rPr/>
+      </w:pPr>
+      <w:r>
+        <w:rPr/>
+        <w:t xml:space="preserve">The Eclipse window displays the local astronomy-data directory and expected filenames: </w:t>
+      </w:r>
+      <w:r>
+        <w:rPr>
+          <w:rStyle w:val="SourceText"/>
+        </w:rPr>
+        <w:t>de440s.bsp</w:t>
+      </w:r>
+      <w:r>
+        <w:rPr/>
+        <w:t xml:space="preserve">, </w:t>
+      </w:r>
+      <w:r>
+        <w:rPr>
+          <w:rStyle w:val="SourceText"/>
+        </w:rPr>
+        <w:t>moon_pa_de440_200625.bpc</w:t>
+      </w:r>
+      <w:r>
+        <w:rPr/>
+        <w:t xml:space="preserve"> and </w:t>
+      </w:r>
+      <w:r>
+        <w:rPr>
+          <w:rStyle w:val="SourceText"/>
+        </w:rPr>
+        <w:t>lola64-pa.bin</w:t>
+      </w:r>
+      <w:r>
+        <w:rPr/>
+        <w:t xml:space="preserve">. </w:t>
+      </w:r>
+      <w:r>
+        <w:rPr>
+          <w:rStyle w:val="Strong"/>
+        </w:rPr>
+        <w:t>Open astronomy data folder…</w:t>
+      </w:r>
+      <w:r>
+        <w:rPr/>
+        <w:t xml:space="preserve"> opens that directory. Use the import controls to install and verify downloaded files; merely placing a file there does not establish that it is valid.</w:t>
       </w:r>
     </w:p>
     <w:p>
@@ -16952,7 +17168,7 @@
   <w:docDefaults>
     <w:rPrDefault>
       <w:rPr>
-        <w:rFonts w:ascii="Liberation Serif" w:hAnsi="Liberation Serif" w:eastAsia="Noto Sans" w:cs="FreeSans"/>
+        <w:rFonts w:ascii="Liberation Serif" w:hAnsi="Liberation Serif" w:eastAsia="Noto Sans" w:cs="Noto Sans"/>
         <w:sz w:val="24"/>
         <w:szCs w:val="24"/>
         <w:lang w:val="en-US" w:eastAsia="zh-CN" w:bidi="hi-IN"/>
@@ -17010,7 +17226,7 @@
       <w:outlineLvl w:val="1"/>
     </w:pPr>
     <w:rPr>
-      <w:rFonts w:ascii="Liberation Serif" w:hAnsi="Liberation Serif" w:eastAsia="Noto Sans" w:cs="FreeSans"/>
+      <w:rFonts w:ascii="Liberation Serif" w:hAnsi="Liberation Serif" w:eastAsia="Noto Sans" w:cs="Noto Sans"/>
       <w:b/>
       <w:bCs/>
       <w:color w:val="17365D"/>
@@ -17029,7 +17245,7 @@
       <w:outlineLvl w:val="2"/>
     </w:pPr>
     <w:rPr>
-      <w:rFonts w:ascii="Liberation Serif" w:hAnsi="Liberation Serif" w:eastAsia="Noto Sans" w:cs="FreeSans"/>
+      <w:rFonts w:ascii="Liberation Serif" w:hAnsi="Liberation Serif" w:eastAsia="Noto Sans" w:cs="Noto Sans"/>
       <w:b/>
       <w:bCs/>
       <w:color w:val="17365D"/>
@@ -17048,7 +17264,7 @@
       <w:outlineLvl w:val="3"/>
     </w:pPr>
     <w:rPr>
-      <w:rFonts w:ascii="Liberation Serif" w:hAnsi="Liberation Serif" w:eastAsia="Noto Sans" w:cs="FreeSans"/>
+      <w:rFonts w:ascii="Liberation Serif" w:hAnsi="Liberation Serif" w:eastAsia="Noto Sans" w:cs="Noto Sans"/>
       <w:b/>
       <w:bCs/>
       <w:color w:val="17365D"/>
@@ -17164,9 +17380,7 @@
     <w:pPr>
       <w:suppressLineNumbers/>
     </w:pPr>
-    <w:rPr>
-      <w:rFonts w:cs="FreeSans"/>
-    </w:rPr>
+    <w:rPr/>
   </w:style>
   <w:style w:type="paragraph" w:styleId="Caption">
     <w:name w:val="caption"/>
@@ -17177,7 +17391,6 @@
       <w:spacing w:before="120" w:after="120"/>
     </w:pPr>
     <w:rPr>
-      <w:rFonts w:cs="FreeSans"/>
       <w:i/>
       <w:iCs/>
       <w:sz w:val="24"/>
@@ -17188,9 +17401,7 @@
     <w:name w:val="List"/>
     <w:basedOn w:val="BodyText"/>
     <w:pPr/>
-    <w:rPr>
-      <w:rFonts w:cs="FreeSans"/>
-    </w:rPr>
+    <w:rPr/>
   </w:style>
   <w:style w:type="paragraph" w:styleId="BodyText">
     <w:name w:val="Body Text"/>

</xml_diff>

<commit_message>
Clarify uncertainty and lunar UTC search span in 2.8.12 manuals
</commit_message>
<xml_diff>
--- a/docs/v2/output/Celestial_Navigation_Manual_v2.docx
+++ b/docs/v2/output/Celestial_Navigation_Manual_v2.docx
@@ -54,9 +54,9 @@
       </w:pPr>
       <w:r>
         <w:rPr/>
-        <w:t>Celestial Navigation plugin 2.8.9</w:t>
+        <w:t>Celestial Navigation plugin 2.8.12</w:t>
         <w:br/>
-        <w:t>Documentation revision 20 September 2026</w:t>
+        <w:t>Documentation revision 25 September 2026</w:t>
       </w:r>
     </w:p>
     <w:p>
@@ -227,7 +227,7 @@
       </w:r>
       <w:r>
         <w:rPr/>
-        <w:t xml:space="preserve"> this edition covers the per-sight DR-shift running fix, Find position sources, measured lunar-pair guidance and corrected Horizon Event display. The descriptions below match the 2.8.9 controls.</w:t>
+        <w:t xml:space="preserve"> this edition covers the per-sight DR-shift running fix, Find position sources, measured lunar-pair guidance and corrected Horizon Event display. The descriptions below match the 2.8.12 controls.</w:t>
       </w:r>
     </w:p>
     <w:p>
@@ -2982,7 +2982,28 @@
       </w:pPr>
       <w:r>
         <w:rPr/>
-        <w:t>Measurement certainty controls the plotted band around a COP/LOP. Time certainty represents uncertainty in the observation epoch. These values should describe the observation honestly; reducing the number only draws a thinner line and does not improve the sight.</w:t>
+        <w:t>For an altitude or bearing sight, angular measurement certainty sets the width of the plotted COP/LOP band. It does not limit the geographic positions considered by a lunar solution. The running-fix solver also uses altitude measurement uncertainty to weight observations, so changing it can affect a weighted fix and its reported uncertainty. It does not alter the recorded sextant altitude or the predicted altitude.</w:t>
+      </w:r>
+    </w:p>
+    <w:p>
+      <w:pPr>
+        <w:pStyle w:val="BodyText"/>
+        <w:bidi w:val="0"/>
+        <w:rPr/>
+      </w:pPr>
+      <w:r>
+        <w:rPr/>
+        <w:t xml:space="preserve">For a lunar sight, angular measurement uncertainty describes the measured Moon-body distance and contributes to the estimated UTC uncertainty; the separate Moon and body altitude uncertainties contribute as well. The </w:t>
+      </w:r>
+      <w:r>
+        <w:rPr>
+          <w:rStyle w:val="Strong"/>
+        </w:rPr>
+        <w:t>Total UTC search span (seconds)</w:t>
+      </w:r>
+      <w:r>
+        <w:rPr/>
+        <w:t xml:space="preserve"> is different: it limits the time interval searched for a lunar solution. None of these settings makes a recorded observation more precise merely by reducing its value.</w:t>
       </w:r>
     </w:p>
     <w:p>
@@ -6009,8 +6030,45 @@
         <w:rPr/>
       </w:pPr>
       <w:r>
-        <w:rPr/>
-        <w:t>For a Moon–Sun calculation, the solver uses the checksum-verified local JPL DE440s kernel when it has already been imported for the eclipse module. A Moon–planet or Moon–star calculation, or any installation without DE440s, uses the bundled analytical ephemeris. The result identifies the ephemeris source used. DE440s is optional for ordinary navigation, no calculation downloads data, and LOLA terrain is unrelated to lunar-distance clearing.</w:t>
+        <w:rPr>
+          <w:rStyle w:val="Strong"/>
+        </w:rPr>
+        <w:t>2.8.10 precision update:</w:t>
+      </w:r>
+      <w:r>
+        <w:rPr/>
+        <w:t xml:space="preserve"> a verified local DE440s kernel is used automatically for supported Sun, Moon, Mercury and Venus positions, including sights, planning and generated Almanacs. Moon–Sun, Moon–Mercury and Moon–Venus lunar pairs use it consistently. Automatic UTC handling starts in 1972 and requires a date within the kernel coverage. Other bodies, earlier dates and unavailable data retain the analytical fallback.</w:t>
+      </w:r>
+    </w:p>
+    <w:p>
+      <w:pPr>
+        <w:pStyle w:val="BodyText"/>
+        <w:bidi w:val="0"/>
+        <w:rPr/>
+      </w:pPr>
+      <w:r>
+        <w:rPr/>
+        <w:t xml:space="preserve">Install the optional kernel through </w:t>
+      </w:r>
+      <w:r>
+        <w:rPr>
+          <w:rStyle w:val="Strong"/>
+        </w:rPr>
+        <w:t>Eclipses… &gt; Download and install DE440s…</w:t>
+      </w:r>
+      <w:r>
+        <w:rPr/>
+        <w:t xml:space="preserve">, or import a local copy. Navigation still works offline without it. Neither lunar orientation nor LOLA terrain is required. The Almanac uses dated offline IERS DUT1 unless overridden and records sources and fallback on its </w:t>
+      </w:r>
+      <w:r>
+        <w:rPr>
+          <w:rStyle w:val="Strong"/>
+        </w:rPr>
+        <w:t>Sources and conventions</w:t>
+      </w:r>
+      <w:r>
+        <w:rPr/>
+        <w:t xml:space="preserve"> page. DE440s improves the ephemeris foundation, but exact agreement with a printed Almanac also depends on its conventions, time assumptions and rounding.</w:t>
       </w:r>
     </w:p>
     <w:p>
@@ -6477,6 +6535,23 @@
         <w:rPr/>
       </w:pPr>
       <w:r>
+        <w:rPr>
+          <w:rStyle w:val="Strong"/>
+        </w:rPr>
+        <w:t>UTC search span:</w:t>
+      </w:r>
+      <w:r>
+        <w:rPr/>
+        <w:t xml:space="preserve"> a new lunar sight defaults to 86,400 seconds, searching 12 hours either side of its entered watch time. Older saved sights can retain narrower spans. If no UTC solution is found, first check the observation, limbs and watch reading; then widen the span if the true UTC may lie outside it. This changes the times searched, not the recorded observation or its measurement uncertainty. A wider span can also reveal additional candidate solutions.</w:t>
+      </w:r>
+    </w:p>
+    <w:p>
+      <w:pPr>
+        <w:pStyle w:val="BodyText"/>
+        <w:bidi w:val="0"/>
+        <w:rPr/>
+      </w:pPr>
+      <w:r>
         <w:rPr/>
         <w:t xml:space="preserve">The lunar result window deliberately has two pages. </w:t>
       </w:r>
@@ -8047,7 +8122,7 @@
             </w:pPr>
             <w:r>
               <w:rPr/>
-              <w:t>Confirm the eye icon is enabled; zoom out; check UTC/date, body, Hs and limb; increase plotted certainty temporarily; verify the circle is not far from the current viewport.</w:t>
+              <w:t>Confirm the eye icon is enabled; zoom out; check UTC/date, body, Hs and limb; increase plotted certainty temporarily to locate the circle, then restore the observation's honest uncertainty; verify the circle is not far from the current viewport.</w:t>
             </w:r>
           </w:p>
         </w:tc>
@@ -8478,6 +8553,47 @@
             <w:r>
               <w:rPr/>
               <w:t>The computer may use another synchronisation service, chrony may not be installed, or its query interface may be unavailable. UTC display still uses the system clock.</w:t>
+            </w:r>
+          </w:p>
+        </w:tc>
+      </w:tr>
+      <w:tr>
+        <w:trPr/>
+        <w:tc>
+          <w:tcPr>
+            <w:tcW w:w="2970" w:type="dxa"/>
+            <w:tcBorders/>
+            <w:vAlign w:val="center"/>
+          </w:tcPr>
+          <w:p>
+            <w:pPr>
+              <w:pStyle w:val="TableContents"/>
+              <w:bidi w:val="0"/>
+              <w:spacing w:before="0" w:after="283"/>
+              <w:rPr/>
+            </w:pPr>
+            <w:r>
+              <w:rPr/>
+              <w:t>No lunar UTC solution is found</w:t>
+            </w:r>
+          </w:p>
+        </w:tc>
+        <w:tc>
+          <w:tcPr>
+            <w:tcW w:w="6780" w:type="dxa"/>
+            <w:tcBorders/>
+            <w:vAlign w:val="center"/>
+          </w:tcPr>
+          <w:p>
+            <w:pPr>
+              <w:pStyle w:val="TableContents"/>
+              <w:bidi w:val="0"/>
+              <w:spacing w:before="0" w:after="283"/>
+              <w:rPr/>
+            </w:pPr>
+            <w:r>
+              <w:rPr/>
+              <w:t>Check watch reading, date, lunar distance, contact/limbs and altitudes. An older sight may retain a narrow UTC search span; widen it if the true time may lie outside the selected interval. Angular COP width is not the UTC search control.</w:t>
             </w:r>
           </w:p>
         </w:tc>

</xml_diff>

<commit_message>
Clarify uncertainty and lunar UTC search span in 2.9 manuals
</commit_message>
<xml_diff>
--- a/docs/v2/output/Celestial_Navigation_Manual_v2.docx
+++ b/docs/v2/output/Celestial_Navigation_Manual_v2.docx
@@ -56,7 +56,7 @@
         <w:rPr/>
         <w:t>Celestial Navigation plugin 2.9.0</w:t>
         <w:br/>
-        <w:t>Documentation revision 23 September 2026</w:t>
+        <w:t>Documentation revision 25 September 2026</w:t>
       </w:r>
     </w:p>
     <w:p>
@@ -2982,7 +2982,28 @@
       </w:pPr>
       <w:r>
         <w:rPr/>
-        <w:t>Measurement certainty controls the plotted band around a COP/LOP. Time certainty represents uncertainty in the observation epoch. These values should describe the observation honestly; reducing the number only draws a thinner line and does not improve the sight.</w:t>
+        <w:t>For an altitude or bearing sight, angular measurement certainty sets the width of the plotted COP/LOP band. It does not limit the geographic positions considered by a lunar solution. The running-fix solver also uses altitude measurement uncertainty to weight observations, so changing it can affect a weighted fix and its reported uncertainty. It does not alter the recorded sextant altitude or the predicted altitude.</w:t>
+      </w:r>
+    </w:p>
+    <w:p>
+      <w:pPr>
+        <w:pStyle w:val="BodyText"/>
+        <w:bidi w:val="0"/>
+        <w:rPr/>
+      </w:pPr>
+      <w:r>
+        <w:rPr/>
+        <w:t xml:space="preserve">For a lunar sight, angular measurement uncertainty describes the measured Moon-body distance and contributes to the estimated UTC uncertainty; the separate Moon and body altitude uncertainties contribute as well. The </w:t>
+      </w:r>
+      <w:r>
+        <w:rPr>
+          <w:rStyle w:val="Strong"/>
+        </w:rPr>
+        <w:t>Total UTC search span (seconds)</w:t>
+      </w:r>
+      <w:r>
+        <w:rPr/>
+        <w:t xml:space="preserve"> is different: it limits the time interval searched for a lunar solution. None of these settings makes a recorded observation more precise merely by reducing its value.</w:t>
       </w:r>
     </w:p>
     <w:p>
@@ -3031,7 +3052,7 @@
         <w:rPr/>
         <w:drawing>
           <wp:inline distT="0" distB="0" distL="0" distR="0">
-            <wp:extent cx="5850000" cy="2992880"/>
+            <wp:extent cx="5850000" cy="2991302"/>
             <wp:effectExtent l="0" t="0" r="0" b="0"/>
             <wp:docPr id="6" name="Image6" title="Two globes comparing the predicted geographic position with correct UTC and a watch twenty minutes slow."/>
             <wp:cNvGraphicFramePr>
@@ -3055,7 +3076,7 @@
                   <pic:spPr bwMode="auto">
                     <a:xfrm>
                       <a:off x="0" y="0"/>
-                      <a:ext cx="5850000" cy="2992880"/>
+                      <a:ext cx="5850000" cy="2991302"/>
                     </a:xfrm>
                     <a:prstGeom prst="rect">
                       <a:avLst/>
@@ -6845,6 +6866,23 @@
         <w:rPr/>
       </w:pPr>
       <w:r>
+        <w:rPr>
+          <w:rStyle w:val="Strong"/>
+        </w:rPr>
+        <w:t>UTC search span:</w:t>
+      </w:r>
+      <w:r>
+        <w:rPr/>
+        <w:t xml:space="preserve"> a new lunar sight defaults to 86,400 seconds, searching 12 hours either side of its entered watch time. Older saved sights can retain narrower spans. If no UTC solution is found, first check the observation, limbs and watch reading; then widen the span if the true UTC may lie outside it. This changes the times searched, not the recorded observation or its measurement uncertainty. A wider span can also reveal additional candidate solutions.</w:t>
+      </w:r>
+    </w:p>
+    <w:p>
+      <w:pPr>
+        <w:pStyle w:val="BodyText"/>
+        <w:bidi w:val="0"/>
+        <w:rPr/>
+      </w:pPr>
+      <w:r>
         <w:rPr/>
         <w:t xml:space="preserve">The lunar result window deliberately has two pages. </w:t>
       </w:r>
@@ -8508,7 +8546,7 @@
             </w:pPr>
             <w:r>
               <w:rPr/>
-              <w:t>Confirm the eye icon is enabled; zoom out; check UTC/date, body, Hs and limb; increase plotted certainty temporarily; verify the circle is not far from the current viewport.</w:t>
+              <w:t>Confirm the eye icon is enabled; zoom out; check UTC/date, body, Hs and limb; increase plotted certainty temporarily to locate the circle, then restore the observation's honest uncertainty; verify the circle is not far from the current viewport.</w:t>
             </w:r>
           </w:p>
         </w:tc>
@@ -8939,6 +8977,47 @@
             <w:r>
               <w:rPr/>
               <w:t>The computer may use another synchronisation service, chrony may not be installed, or its query interface may be unavailable. UTC display still uses the system clock.</w:t>
+            </w:r>
+          </w:p>
+        </w:tc>
+      </w:tr>
+      <w:tr>
+        <w:trPr/>
+        <w:tc>
+          <w:tcPr>
+            <w:tcW w:w="2970" w:type="dxa"/>
+            <w:tcBorders/>
+            <w:vAlign w:val="center"/>
+          </w:tcPr>
+          <w:p>
+            <w:pPr>
+              <w:pStyle w:val="TableContents"/>
+              <w:bidi w:val="0"/>
+              <w:spacing w:before="0" w:after="283"/>
+              <w:rPr/>
+            </w:pPr>
+            <w:r>
+              <w:rPr/>
+              <w:t>No lunar UTC solution is found</w:t>
+            </w:r>
+          </w:p>
+        </w:tc>
+        <w:tc>
+          <w:tcPr>
+            <w:tcW w:w="6780" w:type="dxa"/>
+            <w:tcBorders/>
+            <w:vAlign w:val="center"/>
+          </w:tcPr>
+          <w:p>
+            <w:pPr>
+              <w:pStyle w:val="TableContents"/>
+              <w:bidi w:val="0"/>
+              <w:spacing w:before="0" w:after="283"/>
+              <w:rPr/>
+            </w:pPr>
+            <w:r>
+              <w:rPr/>
+              <w:t>Check watch reading, date, lunar distance, contact/limbs and altitudes. An older sight may retain a narrow UTC search span; widen it if the true time may lie outside the selected interval. Angular COP width is not the UTC search control.</w:t>
             </w:r>
           </w:p>
         </w:tc>
@@ -17168,7 +17247,7 @@
   <w:docDefaults>
     <w:rPrDefault>
       <w:rPr>
-        <w:rFonts w:ascii="Liberation Serif" w:hAnsi="Liberation Serif" w:eastAsia="Noto Sans" w:cs="Noto Sans"/>
+        <w:rFonts w:ascii="Liberation Serif" w:hAnsi="Liberation Serif" w:eastAsia="Noto Sans" w:cs="FreeSans"/>
         <w:sz w:val="24"/>
         <w:szCs w:val="24"/>
         <w:lang w:val="en-US" w:eastAsia="zh-CN" w:bidi="hi-IN"/>
@@ -17226,7 +17305,7 @@
       <w:outlineLvl w:val="1"/>
     </w:pPr>
     <w:rPr>
-      <w:rFonts w:ascii="Liberation Serif" w:hAnsi="Liberation Serif" w:eastAsia="Noto Sans" w:cs="Noto Sans"/>
+      <w:rFonts w:ascii="Liberation Serif" w:hAnsi="Liberation Serif" w:eastAsia="Noto Sans" w:cs="FreeSans"/>
       <w:b/>
       <w:bCs/>
       <w:color w:val="17365D"/>
@@ -17245,7 +17324,7 @@
       <w:outlineLvl w:val="2"/>
     </w:pPr>
     <w:rPr>
-      <w:rFonts w:ascii="Liberation Serif" w:hAnsi="Liberation Serif" w:eastAsia="Noto Sans" w:cs="Noto Sans"/>
+      <w:rFonts w:ascii="Liberation Serif" w:hAnsi="Liberation Serif" w:eastAsia="Noto Sans" w:cs="FreeSans"/>
       <w:b/>
       <w:bCs/>
       <w:color w:val="17365D"/>
@@ -17264,7 +17343,7 @@
       <w:outlineLvl w:val="3"/>
     </w:pPr>
     <w:rPr>
-      <w:rFonts w:ascii="Liberation Serif" w:hAnsi="Liberation Serif" w:eastAsia="Noto Sans" w:cs="Noto Sans"/>
+      <w:rFonts w:ascii="Liberation Serif" w:hAnsi="Liberation Serif" w:eastAsia="Noto Sans" w:cs="FreeSans"/>
       <w:b/>
       <w:bCs/>
       <w:color w:val="17365D"/>
@@ -17380,7 +17459,9 @@
     <w:pPr>
       <w:suppressLineNumbers/>
     </w:pPr>
-    <w:rPr/>
+    <w:rPr>
+      <w:rFonts w:cs="FreeSans"/>
+    </w:rPr>
   </w:style>
   <w:style w:type="paragraph" w:styleId="Caption">
     <w:name w:val="caption"/>
@@ -17391,6 +17472,7 @@
       <w:spacing w:before="120" w:after="120"/>
     </w:pPr>
     <w:rPr>
+      <w:rFonts w:cs="FreeSans"/>
       <w:i/>
       <w:iCs/>
       <w:sz w:val="24"/>
@@ -17401,7 +17483,9 @@
     <w:name w:val="List"/>
     <w:basedOn w:val="BodyText"/>
     <w:pPr/>
-    <w:rPr/>
+    <w:rPr>
+      <w:rFonts w:cs="FreeSans"/>
+    </w:rPr>
   </w:style>
   <w:style w:type="paragraph" w:styleId="BodyText">
     <w:name w:val="Body Text"/>

</xml_diff>

<commit_message>
Implement Android 2.8.13 workspace and retain iterative tablet evidence
Android-only touch editors, UTC/angle adapters, workers, document viewers and lifecycle fixes; preserve desktop presentation and shared numerical behavior. Incorporate 2.8.12 manual artifacts as 2.8.13 and retain all platform build jobs with reviewed deployment gating. Acceptance remains in progress, as recorded in the physical matrix.
</commit_message>
<xml_diff>
--- a/docs/v2/output/Celestial_Navigation_Manual_v2.docx
+++ b/docs/v2/output/Celestial_Navigation_Manual_v2.docx
@@ -54,9 +54,9 @@
       </w:pPr>
       <w:r>
         <w:rPr/>
-        <w:t>Celestial Navigation plugin 2.8.12</w:t>
+        <w:t>Celestial Navigation plugin 2.8.13</w:t>
         <w:br/>
-        <w:t>Documentation revision 25 September 2026</w:t>
+        <w:t>Documentation revision 27 September 2026</w:t>
       </w:r>
     </w:p>
     <w:p>
@@ -227,7 +227,7 @@
       </w:r>
       <w:r>
         <w:rPr/>
-        <w:t xml:space="preserve"> this edition covers the per-sight DR-shift running fix, Find position sources, measured lunar-pair guidance and corrected Horizon Event display. The descriptions below match the 2.8.12 controls.</w:t>
+        <w:t xml:space="preserve"> this edition covers the per-sight DR-shift running fix, Find position sources, measured lunar-pair guidance and corrected Horizon Event display. The descriptions below match the 2.8.13 controls.</w:t>
       </w:r>
     </w:p>
     <w:p>
@@ -3052,7 +3052,7 @@
         <w:rPr/>
         <w:drawing>
           <wp:inline distT="0" distB="0" distL="0" distR="0">
-            <wp:extent cx="5850000" cy="2991302"/>
+            <wp:extent cx="5850000" cy="2992880"/>
             <wp:effectExtent l="0" t="0" r="0" b="0"/>
             <wp:docPr id="6" name="Image6" title="Two globes comparing the predicted geographic position with correct UTC and a watch twenty minutes slow."/>
             <wp:cNvGraphicFramePr>
@@ -3076,7 +3076,7 @@
                   <pic:spPr bwMode="auto">
                     <a:xfrm>
                       <a:off x="0" y="0"/>
-                      <a:ext cx="5850000" cy="2991302"/>
+                      <a:ext cx="5850000" cy="2992880"/>
                     </a:xfrm>
                     <a:prstGeom prst="rect">
                       <a:avLst/>
@@ -16823,7 +16823,7 @@
   <w:docDefaults>
     <w:rPrDefault>
       <w:rPr>
-        <w:rFonts w:ascii="Liberation Serif" w:hAnsi="Liberation Serif" w:eastAsia="Noto Sans" w:cs="FreeSans"/>
+        <w:rFonts w:ascii="Liberation Serif" w:hAnsi="Liberation Serif" w:eastAsia="Noto Sans" w:cs="Noto Sans"/>
         <w:sz w:val="24"/>
         <w:szCs w:val="24"/>
         <w:lang w:val="en-US" w:eastAsia="zh-CN" w:bidi="hi-IN"/>
@@ -16881,7 +16881,7 @@
       <w:outlineLvl w:val="1"/>
     </w:pPr>
     <w:rPr>
-      <w:rFonts w:ascii="Liberation Serif" w:hAnsi="Liberation Serif" w:eastAsia="Noto Sans" w:cs="FreeSans"/>
+      <w:rFonts w:ascii="Liberation Serif" w:hAnsi="Liberation Serif" w:eastAsia="Noto Sans" w:cs="Noto Sans"/>
       <w:b/>
       <w:bCs/>
       <w:color w:val="17365D"/>
@@ -16900,7 +16900,7 @@
       <w:outlineLvl w:val="2"/>
     </w:pPr>
     <w:rPr>
-      <w:rFonts w:ascii="Liberation Serif" w:hAnsi="Liberation Serif" w:eastAsia="Noto Sans" w:cs="FreeSans"/>
+      <w:rFonts w:ascii="Liberation Serif" w:hAnsi="Liberation Serif" w:eastAsia="Noto Sans" w:cs="Noto Sans"/>
       <w:b/>
       <w:bCs/>
       <w:color w:val="17365D"/>
@@ -16919,7 +16919,7 @@
       <w:outlineLvl w:val="3"/>
     </w:pPr>
     <w:rPr>
-      <w:rFonts w:ascii="Liberation Serif" w:hAnsi="Liberation Serif" w:eastAsia="Noto Sans" w:cs="FreeSans"/>
+      <w:rFonts w:ascii="Liberation Serif" w:hAnsi="Liberation Serif" w:eastAsia="Noto Sans" w:cs="Noto Sans"/>
       <w:b/>
       <w:bCs/>
       <w:color w:val="17365D"/>
@@ -17035,9 +17035,7 @@
     <w:pPr>
       <w:suppressLineNumbers/>
     </w:pPr>
-    <w:rPr>
-      <w:rFonts w:cs="FreeSans"/>
-    </w:rPr>
+    <w:rPr/>
   </w:style>
   <w:style w:type="paragraph" w:styleId="Caption">
     <w:name w:val="caption"/>
@@ -17048,7 +17046,6 @@
       <w:spacing w:before="120" w:after="120"/>
     </w:pPr>
     <w:rPr>
-      <w:rFonts w:cs="FreeSans"/>
       <w:i/>
       <w:iCs/>
       <w:sz w:val="24"/>
@@ -17059,9 +17056,7 @@
     <w:name w:val="List"/>
     <w:basedOn w:val="BodyText"/>
     <w:pPr/>
-    <w:rPr>
-      <w:rFonts w:cs="FreeSans"/>
-    </w:rPr>
+    <w:rPr/>
   </w:style>
   <w:style w:type="paragraph" w:styleId="BodyText">
     <w:name w:val="Body Text"/>

</xml_diff>

<commit_message>
Refine 2.9.3 planner layout, sky labels and lunar recommendations
</commit_message>
<xml_diff>
--- a/docs/v2/output/Celestial_Navigation_Manual_v2.docx
+++ b/docs/v2/output/Celestial_Navigation_Manual_v2.docx
@@ -54,9 +54,9 @@
       </w:pPr>
       <w:r>
         <w:rPr/>
-        <w:t>Celestial Navigation plugin 2.9.0</w:t>
+        <w:t>Celestial Navigation plugin 2.9.3</w:t>
         <w:br/>
-        <w:t>Documentation revision 25 September 2026</w:t>
+        <w:t>Documentation revision 2 October 2026</w:t>
       </w:r>
     </w:p>
     <w:p>
@@ -3052,7 +3052,7 @@
         <w:rPr/>
         <w:drawing>
           <wp:inline distT="0" distB="0" distL="0" distR="0">
-            <wp:extent cx="5850000" cy="2991302"/>
+            <wp:extent cx="5850000" cy="2992880"/>
             <wp:effectExtent l="0" t="0" r="0" b="0"/>
             <wp:docPr id="6" name="Image6" title="Two globes comparing the predicted geographic position with correct UTC and a watch twenty minutes slow."/>
             <wp:cNvGraphicFramePr>
@@ -3076,7 +3076,7 @@
                   <pic:spPr bwMode="auto">
                     <a:xfrm>
                       <a:off x="0" y="0"/>
-                      <a:ext cx="5850000" cy="2991302"/>
+                      <a:ext cx="5850000" cy="2992880"/>
                     </a:xfrm>
                     <a:prstGeom prst="rect">
                       <a:avLst/>
@@ -4921,7 +4921,27 @@
       </w:r>
       <w:r>
         <w:rPr/>
-        <w:t>. Eye height is reloaded from the main plugin defaults each time.</w:t>
+        <w:t xml:space="preserve">. Eye height is reloaded from the main plugin defaults each time. Related fields stay together when the header wraps. </w:t>
+      </w:r>
+      <w:r>
+        <w:rPr>
+          <w:rStyle w:val="Strong"/>
+        </w:rPr>
+        <w:t>−1 h</w:t>
+      </w:r>
+      <w:r>
+        <w:rPr/>
+        <w:t xml:space="preserve"> and </w:t>
+      </w:r>
+      <w:r>
+        <w:rPr>
+          <w:rStyle w:val="Strong"/>
+        </w:rPr>
+        <w:t>+1 h</w:t>
+      </w:r>
+      <w:r>
+        <w:rPr/>
+        <w:t xml:space="preserve"> step the complete sky by one UTC hour, switching to manual time. With a moving observer, the entered position advances too and switches to Manual.</w:t>
       </w:r>
     </w:p>
     <w:p>
@@ -5047,7 +5067,17 @@
       </w:r>
       <w:r>
         <w:rPr/>
-        <w:t xml:space="preserve"> optionally applies the adjacent, editable minimum and maximum only to suggested pairs and triads. The initial preferred range is 10°–75°. Bodies outside it remain in the table and are marked below or above the preferred Hc; disabling the option makes every above-horizon body eligible for recommendations. All eligible bodies are considered for pair/triad geometry, not just a brightness shortlist.</w:t>
+        <w:t xml:space="preserve"> optionally applies the adjacent, editable minimum and maximum only to suggested pairs and triads. The initial preferred range is 10°–75°. Bodies outside it remain in the table and are marked below or above the preferred Hc; disabling the option makes every above-horizon body eligible for recommendations. All eligible bodies are considered for pair/triad geometry. Three-body fixes are listed first. Polaris remains available in the body list and latitude helper; enable </w:t>
+      </w:r>
+      <w:r>
+        <w:rPr>
+          <w:rStyle w:val="Strong"/>
+        </w:rPr>
+        <w:t>Include Polaris in fixes</w:t>
+      </w:r>
+      <w:r>
+        <w:rPr/>
+        <w:t xml:space="preserve"> to include its mainly latitude constraint in recommendations with other suitable bearings. Daylight stars remain listed but are excluded from recommended fixes.</w:t>
       </w:r>
     </w:p>
     <w:p>
@@ -5064,7 +5094,38 @@
       </w:r>
       <w:r>
         <w:rPr/>
-        <w:t xml:space="preserve"> shows predicted geocentric Moon-body distance, signed distance rate, the seconds represented by 0.1′, companion ecliptic latitude, both altitudes and bearings, illumination and guidance. A positive rate means increasing distance. Both planners use the same explainable default: fewest planning cautions, then strongest timing sensitivity. Choose </w:t>
+        <w:t xml:space="preserve"> shows geocentric Moon-body distance, signed distance rate, seconds represented by 0.1′, companion magnitude and ecliptic latitude, altitudes, bearings, illumination and guidance. A positive rate means increasing distance. Both planners initially offer </w:t>
+      </w:r>
+      <w:r>
+        <w:rPr>
+          <w:rStyle w:val="Strong"/>
+        </w:rPr>
+        <w:t>Traditional lunar companions</w:t>
+      </w:r>
+      <w:r>
+        <w:rPr/>
+        <w:t xml:space="preserve">: Sun, Venus, Mars, Jupiter, Saturn, Aldebaran, Altair, Antares, Fomalhaut, Hamal, Markab, Pollux, Regulus and Spica. Choose </w:t>
+      </w:r>
+      <w:r>
+        <w:rPr>
+          <w:rStyle w:val="Strong"/>
+        </w:rPr>
+        <w:t>All calculated companions</w:t>
+      </w:r>
+      <w:r>
+        <w:rPr/>
+        <w:t xml:space="preserve"> to compare other bodies; the general body list is unaffected.</w:t>
+      </w:r>
+    </w:p>
+    <w:p>
+      <w:pPr>
+        <w:pStyle w:val="BodyText"/>
+        <w:bidi w:val="0"/>
+        <w:rPr/>
+      </w:pPr>
+      <w:r>
+        <w:rPr/>
+        <w:t xml:space="preserve">The practical lunar order prefers fewer cautions, then brighter companions, then timing sensitivity. Choose </w:t>
       </w:r>
       <w:r>
         <w:rPr>
@@ -5074,7 +5135,7 @@
       </w:r>
       <w:r>
         <w:rPr/>
-        <w:t xml:space="preserve"> to put timing first. Below-horizon pairs remain last. Cautions flag altitude outside 10°–75°, distance outside 20°–100°, absolute rate below 10′/hour, companion magnitude above 2.5, or Sun altitude above −6° for companions fainter than magnitude −2. These preferences do not establish visibility. Ecliptic latitude is descriptive, not an additional weight on top of the calculated rate.</w:t>
+        <w:t xml:space="preserve"> to put timing first. Below-horizon pairs remain last. Cautions flag altitude outside 10°–75°, distance outside 20°–100°, absolute rate below 10′/hour, companion magnitude above 1.5, or Sun above −6° for companions fainter than magnitude −2. Ecliptic latitude is context, not an extra penalty on the actual distance rate. The 0.1′ time describes distance sensitivity alone, not the uncertainty of a complete lunar observation or position solution.</w:t>
       </w:r>
     </w:p>
     <w:p>
@@ -5116,26 +5177,96 @@
       </w:pPr>
       <w:r>
         <w:rPr/>
-        <w:t>The individual score gives 65% weight to altitude near 40° and 35% to brightness, with a daylight/twilight penalty for stars. Planets currently receive no equivalent twilight penalty, so the score is not by itself a guarantee that Mercury or another planet is practically observable. Suggested pairs additionally favour a crossing angle near 90°; triads rank their two-dimensional bearing geometry separately.</w:t>
-      </w:r>
-    </w:p>
-    <w:p>
-      <w:pPr>
-        <w:pStyle w:val="BodyText"/>
-        <w:bidi w:val="0"/>
-        <w:rPr/>
-      </w:pPr>
-      <w:r>
-        <w:rPr/>
-        <w:t>The polar sky plot has independent magnitude limits of 1, 2 or 3 and can optionally show bodies below the horizon. Sun symbols are yellow, the Moon is blue, planets are red, stars rendered during daylight are grey, and below-horizon bodies are hollow. Labels favour the brightest bodies and share the available label allowance across the four compass quadrants. The allowance adapts to the plot size, and labels are still suppressed when they would overlap; an unlabeled dot does not mean the body is absent from the catalogue.</w:t>
-      </w:r>
-    </w:p>
-    <w:p>
-      <w:pPr>
-        <w:pStyle w:val="BodyText"/>
-        <w:bidi w:val="0"/>
-        <w:rPr/>
-      </w:pPr>
+        <w:t xml:space="preserve">The </w:t>
+      </w:r>
+      <w:r>
+        <w:rPr>
+          <w:rStyle w:val="Strong"/>
+        </w:rPr>
+        <w:t>Visibility</w:t>
+      </w:r>
+      <w:r>
+        <w:rPr/>
+        <w:t xml:space="preserve"> column gives guidance rather than a probability of seeing a body. </w:t>
+      </w:r>
+      <w:r>
+        <w:rPr>
+          <w:rStyle w:val="Strong"/>
+        </w:rPr>
+        <w:t>Why</w:t>
+      </w:r>
+      <w:r>
+        <w:rPr/>
+        <w:t xml:space="preserve"> distinguishes visibility from sextant handling. The internal planning preference combines 75% brightness and sky conditions with 25% altitude handling; it favours moderate altitudes and advises presetting the sextant for high bright stars. Twilight penalises faint stars more than bright ones. Planets receive solar-glare/daylight penalties. Sun, Moon and planet magnitudes are representative values, not current photometry; check Moon phase and glare. Pair crossing angles and triad bearing geometry are assessed separately. Recommendation scores are heuristics, not accuracy estimates.</w:t>
+      </w:r>
+    </w:p>
+    <w:p>
+      <w:pPr>
+        <w:pStyle w:val="BodyText"/>
+        <w:bidi w:val="0"/>
+        <w:rPr/>
+      </w:pPr>
+      <w:r>
+        <w:rPr/>
+        <w:t xml:space="preserve">The plots have magnitude limits of 1, 2 or 3. </w:t>
+      </w:r>
+      <w:r>
+        <w:rPr>
+          <w:rStyle w:val="Strong"/>
+        </w:rPr>
+        <w:t>Star labels</w:t>
+      </w:r>
+      <w:r>
+        <w:rPr/>
+        <w:t xml:space="preserve"> offers </w:t>
+      </w:r>
+      <w:r>
+        <w:rPr>
+          <w:rStyle w:val="Strong"/>
+        </w:rPr>
+        <w:t>Sparse</w:t>
+      </w:r>
+      <w:r>
+        <w:rPr/>
+        <w:t xml:space="preserve">, </w:t>
+      </w:r>
+      <w:r>
+        <w:rPr>
+          <w:rStyle w:val="Strong"/>
+        </w:rPr>
+        <w:t>Balanced</w:t>
+      </w:r>
+      <w:r>
+        <w:rPr/>
+        <w:t xml:space="preserve"> (default) and </w:t>
+      </w:r>
+      <w:r>
+        <w:rPr>
+          <w:rStyle w:val="Strong"/>
+        </w:rPr>
+        <w:t>More</w:t>
+      </w:r>
+      <w:r>
+        <w:rPr/>
+        <w:t>. Names favour brighter bodies, use the available space and avoid other labels and dots; short leaders identify offset names. The selected body has first priority and remains plotted when above the horizon even if fainter than the magnitude limit. Hover over a dot for its name. More means as many labels as fit, so some crowded dots may remain unnamed. Label density is remembered independently of the magnitude filter.</w:t>
+      </w:r>
+    </w:p>
+    <w:p>
+      <w:pPr>
+        <w:pStyle w:val="BodyText"/>
+        <w:bidi w:val="0"/>
+        <w:rPr/>
+      </w:pPr>
+      <w:r>
+        <w:rPr>
+          <w:rStyle w:val="Strong"/>
+        </w:rPr>
+        <w:t>Local sky</w:t>
+      </w:r>
+      <w:r>
+        <w:rPr/>
+        <w:t xml:space="preserve"> shows altitude and true bearing at the selected instant. Sun symbols are yellow, Moon blue, planets red; daylight stars are grey and below-horizon bodies hollow. </w:t>
+      </w:r>
       <w:r>
         <w:rPr>
           <w:rStyle w:val="Strong"/>
@@ -5144,7 +5275,7 @@
       </w:r>
       <w:r>
         <w:rPr/>
-        <w:t xml:space="preserve"> and </w:t>
+        <w:t xml:space="preserve"> draws the amber reference at that same instant. The blue </w:t>
       </w:r>
       <w:r>
         <w:rPr>
@@ -5154,17 +5285,7 @@
       </w:r>
       <w:r>
         <w:rPr/>
-        <w:t xml:space="preserve"> are independent overlays. The ecliptic defaults on and the Moon path off; the path can span ±3, ±6 or ±12 hours around the planning instant. </w:t>
-      </w:r>
-      <w:r>
-        <w:rPr>
-          <w:rStyle w:val="Strong"/>
-        </w:rPr>
-        <w:t>Local sky</w:t>
-      </w:r>
-      <w:r>
-        <w:rPr/>
-        <w:t xml:space="preserve"> shows altitude and true bearing at the planning position. </w:t>
+        <w:t xml:space="preserve"> overlay is available only on </w:t>
       </w:r>
       <w:r>
         <w:rPr>
@@ -5174,7 +5295,7 @@
       </w:r>
       <w:r>
         <w:rPr/>
-        <w:t xml:space="preserve"> shows celestial coordinates and is useful for a longer Moon track. The ecliptic follows the date's obliquity and the Moon path follows the selected ephemeris, with UTC labels at its start, middle and end. Selecting a body highlights its plotted symbol. Neither overlay replaces a visibility check.</w:t>
+        <w:t>, where it shows motion relative to the stars over ±3, ±6 or ±12 hours with UTC labels at the start, selected time and end. Use the hour-step buttons to move the whole local sky together. The SHA chart includes the polar regions through ±90°.</w:t>
       </w:r>
     </w:p>
     <w:p>
@@ -6399,7 +6520,17 @@
       </w:pPr>
       <w:r>
         <w:rPr/>
-        <w:t>When its checksum-verified local JPL DE440s kernel is installed and covers the sight date, Moon–Sun, Moon–Mercury and Moon–Venus calculations use it. Moon–star and other Moon–planet calculations, or any sight outside the compact kernel's range, use the bundled analytical ephemeris. The result identifies the source used. DE440s is optional for navigation, no calculation downloads data, and LOLA terrain is unrelated to lunar-distance clearing.</w:t>
+        <w:t xml:space="preserve">When its checksum-verified local JPL DE440s kernel is installed and covers the sight date, Moon–Sun, Moon–Mercury and Moon–Venus calculations use it. Moon–star and other Moon–planet calculations use the bundled Compact engine by default for 1972–2100. Compact also supplies the fallback when DE440s is unavailable. In Lunar Tools → Advanced, disable </w:t>
+      </w:r>
+      <w:r>
+        <w:rPr>
+          <w:rStyle w:val="Strong"/>
+        </w:rPr>
+        <w:t>Use compact analytical fallback (recommended)</w:t>
+      </w:r>
+      <w:r>
+        <w:rPr/>
+        <w:t xml:space="preserve"> to retain classic analytical calculations. Classic also handles dates outside Compact coverage or unavailable Compact data. The corrected lunar solver remains active with every provider, and the result identifies the source used. DE440s is optional for navigation, no calculation downloads data, and LOLA terrain is unrelated to lunar-distance clearing.</w:t>
       </w:r>
     </w:p>
     <w:p>
@@ -7297,7 +7428,7 @@
       </w:r>
       <w:r>
         <w:rPr/>
-        <w:t>, with below-horizon pairs last. It shows centre separation, signed distance rate in arcminutes per hour, Moon/body altitude and true azimuth, Moon illumination, body magnitude and which body is below the geometric horizon. A small time value indicates greater timing sensitivity. There is no combined quality score: use the measured quantities to assess visibility, sextant range and whether the pair is practical to observe.</w:t>
+        <w:t>, with below-horizon pairs last and the same traditional/all-companion choice. It shows centre separation, signed distance rate in arcminutes per hour, Moon/body altitude and true azimuth, Moon illumination, body magnitude and which body is below the geometric horizon. A small time value indicates greater timing sensitivity. There is no combined quality score: use the measured quantities to assess visibility, sextant range and whether the pair is practical to observe.</w:t>
       </w:r>
     </w:p>
     <w:p>
@@ -8802,7 +8933,7 @@
             </w:pPr>
             <w:r>
               <w:rPr/>
-              <w:t>Labels favour bright bodies, are shared across compass quadrants and are suppressed when they would overlap. Enlarge the planner or use the sortable body table to identify and inspect every listed body.</w:t>
+              <w:t>Labels favour bright bodies and avoid overlaps. Choose Balanced or More, enlarge the planner, hover over a dot, or select its body in the table to give its name priority.</w:t>
             </w:r>
           </w:p>
         </w:tc>
@@ -17247,7 +17378,7 @@
   <w:docDefaults>
     <w:rPrDefault>
       <w:rPr>
-        <w:rFonts w:ascii="Liberation Serif" w:hAnsi="Liberation Serif" w:eastAsia="Noto Sans" w:cs="FreeSans"/>
+        <w:rFonts w:ascii="Liberation Serif" w:hAnsi="Liberation Serif" w:eastAsia="Noto Sans" w:cs="Noto Sans"/>
         <w:sz w:val="24"/>
         <w:szCs w:val="24"/>
         <w:lang w:val="en-US" w:eastAsia="zh-CN" w:bidi="hi-IN"/>
@@ -17305,7 +17436,7 @@
       <w:outlineLvl w:val="1"/>
     </w:pPr>
     <w:rPr>
-      <w:rFonts w:ascii="Liberation Serif" w:hAnsi="Liberation Serif" w:eastAsia="Noto Sans" w:cs="FreeSans"/>
+      <w:rFonts w:ascii="Liberation Serif" w:hAnsi="Liberation Serif" w:eastAsia="Noto Sans" w:cs="Noto Sans"/>
       <w:b/>
       <w:bCs/>
       <w:color w:val="17365D"/>
@@ -17324,7 +17455,7 @@
       <w:outlineLvl w:val="2"/>
     </w:pPr>
     <w:rPr>
-      <w:rFonts w:ascii="Liberation Serif" w:hAnsi="Liberation Serif" w:eastAsia="Noto Sans" w:cs="FreeSans"/>
+      <w:rFonts w:ascii="Liberation Serif" w:hAnsi="Liberation Serif" w:eastAsia="Noto Sans" w:cs="Noto Sans"/>
       <w:b/>
       <w:bCs/>
       <w:color w:val="17365D"/>
@@ -17343,7 +17474,7 @@
       <w:outlineLvl w:val="3"/>
     </w:pPr>
     <w:rPr>
-      <w:rFonts w:ascii="Liberation Serif" w:hAnsi="Liberation Serif" w:eastAsia="Noto Sans" w:cs="FreeSans"/>
+      <w:rFonts w:ascii="Liberation Serif" w:hAnsi="Liberation Serif" w:eastAsia="Noto Sans" w:cs="Noto Sans"/>
       <w:b/>
       <w:bCs/>
       <w:color w:val="17365D"/>
@@ -17459,9 +17590,7 @@
     <w:pPr>
       <w:suppressLineNumbers/>
     </w:pPr>
-    <w:rPr>
-      <w:rFonts w:cs="FreeSans"/>
-    </w:rPr>
+    <w:rPr/>
   </w:style>
   <w:style w:type="paragraph" w:styleId="Caption">
     <w:name w:val="caption"/>
@@ -17472,7 +17601,6 @@
       <w:spacing w:before="120" w:after="120"/>
     </w:pPr>
     <w:rPr>
-      <w:rFonts w:cs="FreeSans"/>
       <w:i/>
       <w:iCs/>
       <w:sz w:val="24"/>
@@ -17483,9 +17611,7 @@
     <w:name w:val="List"/>
     <w:basedOn w:val="BodyText"/>
     <w:pPr/>
-    <w:rPr>
-      <w:rFonts w:cs="FreeSans"/>
-    </w:rPr>
+    <w:rPr/>
   </w:style>
   <w:style w:type="paragraph" w:styleId="BodyText">
     <w:name w:val="Body Text"/>

</xml_diff>

<commit_message>
Bring Android touch baseline to 2.9.3 with Compact and planner improvements
</commit_message>
<xml_diff>
--- a/docs/v2/output/Celestial_Navigation_Manual_v2.docx
+++ b/docs/v2/output/Celestial_Navigation_Manual_v2.docx
@@ -54,9 +54,9 @@
       </w:pPr>
       <w:r>
         <w:rPr/>
-        <w:t>Celestial Navigation plugin 2.8.13</w:t>
+        <w:t>Celestial Navigation plugin 2.9.3</w:t>
         <w:br/>
-        <w:t>Documentation revision 27 September 2026</w:t>
+        <w:t>Documentation revision 2 October 2026</w:t>
       </w:r>
     </w:p>
     <w:p>
@@ -223,11 +223,11 @@
         <w:rPr>
           <w:rStyle w:val="Strong"/>
         </w:rPr>
-        <w:t>Current release:</w:t>
-      </w:r>
-      <w:r>
-        <w:rPr/>
-        <w:t xml:space="preserve"> this edition covers the per-sight DR-shift running fix, Find position sources, measured lunar-pair guidance and corrected Horizon Event display. The descriptions below match the 2.8.13 controls.</w:t>
+        <w:t>This edition:</w:t>
+      </w:r>
+      <w:r>
+        <w:rPr/>
+        <w:t xml:space="preserve"> the manual covers the per-sight DR-shift running fix, Find position sources, measured lunar-pair guidance and corrected Horizon Event display, together with 2.9.0 planning modes, sky overlays, per-sight remarks and sight-log management.</w:t>
       </w:r>
     </w:p>
     <w:p>
@@ -3260,7 +3260,7 @@
       </w:pPr>
       <w:r>
         <w:rPr/>
-        <w:t>The main list contains stored observations. Its columns show sight type, body, UTC time, measurement and colour. The eye symbol controls whether a sight is plotted and included where a workflow uses visible sights.</w:t>
+        <w:t>The main list contains stored observations. Its columns show sight type, body, UTC time, measurement, colour and remarks. The eye symbol controls whether a sight is plotted and included where a workflow uses visible sights.</w:t>
       </w:r>
     </w:p>
     <w:tbl>
@@ -3277,14 +3277,14 @@
         </w:tblCellMar>
       </w:tblPr>
       <w:tblGrid>
-        <w:gridCol w:w="1500"/>
-        <w:gridCol w:w="8252"/>
+        <w:gridCol w:w="1693"/>
+        <w:gridCol w:w="8059"/>
       </w:tblGrid>
       <w:tr>
         <w:trPr/>
         <w:tc>
           <w:tcPr>
-            <w:tcW w:w="1500" w:type="dxa"/>
+            <w:tcW w:w="1693" w:type="dxa"/>
             <w:tcBorders/>
             <w:vAlign w:val="center"/>
           </w:tcPr>
@@ -3306,7 +3306,7 @@
         </w:tc>
         <w:tc>
           <w:tcPr>
-            <w:tcW w:w="8252" w:type="dxa"/>
+            <w:tcW w:w="8059" w:type="dxa"/>
             <w:tcBorders/>
             <w:vAlign w:val="center"/>
           </w:tcPr>
@@ -3331,7 +3331,7 @@
         <w:trPr/>
         <w:tc>
           <w:tcPr>
-            <w:tcW w:w="1500" w:type="dxa"/>
+            <w:tcW w:w="1693" w:type="dxa"/>
             <w:tcBorders/>
             <w:vAlign w:val="center"/>
           </w:tcPr>
@@ -3350,7 +3350,7 @@
         </w:tc>
         <w:tc>
           <w:tcPr>
-            <w:tcW w:w="8252" w:type="dxa"/>
+            <w:tcW w:w="8059" w:type="dxa"/>
             <w:tcBorders/>
             <w:vAlign w:val="center"/>
           </w:tcPr>
@@ -3372,7 +3372,7 @@
         <w:trPr/>
         <w:tc>
           <w:tcPr>
-            <w:tcW w:w="1500" w:type="dxa"/>
+            <w:tcW w:w="1693" w:type="dxa"/>
             <w:tcBorders/>
             <w:vAlign w:val="center"/>
           </w:tcPr>
@@ -3391,7 +3391,7 @@
         </w:tc>
         <w:tc>
           <w:tcPr>
-            <w:tcW w:w="8252" w:type="dxa"/>
+            <w:tcW w:w="8059" w:type="dxa"/>
             <w:tcBorders/>
             <w:vAlign w:val="center"/>
           </w:tcPr>
@@ -3413,7 +3413,7 @@
         <w:trPr/>
         <w:tc>
           <w:tcPr>
-            <w:tcW w:w="1500" w:type="dxa"/>
+            <w:tcW w:w="1693" w:type="dxa"/>
             <w:tcBorders/>
             <w:vAlign w:val="center"/>
           </w:tcPr>
@@ -3432,7 +3432,7 @@
         </w:tc>
         <w:tc>
           <w:tcPr>
-            <w:tcW w:w="8252" w:type="dxa"/>
+            <w:tcW w:w="8059" w:type="dxa"/>
             <w:tcBorders/>
             <w:vAlign w:val="center"/>
           </w:tcPr>
@@ -3454,7 +3454,7 @@
         <w:trPr/>
         <w:tc>
           <w:tcPr>
-            <w:tcW w:w="1500" w:type="dxa"/>
+            <w:tcW w:w="1693" w:type="dxa"/>
             <w:tcBorders/>
             <w:vAlign w:val="center"/>
           </w:tcPr>
@@ -3473,7 +3473,7 @@
         </w:tc>
         <w:tc>
           <w:tcPr>
-            <w:tcW w:w="8252" w:type="dxa"/>
+            <w:tcW w:w="8059" w:type="dxa"/>
             <w:tcBorders/>
             <w:vAlign w:val="center"/>
           </w:tcPr>
@@ -3495,7 +3495,7 @@
         <w:trPr/>
         <w:tc>
           <w:tcPr>
-            <w:tcW w:w="1500" w:type="dxa"/>
+            <w:tcW w:w="1693" w:type="dxa"/>
             <w:tcBorders/>
             <w:vAlign w:val="center"/>
           </w:tcPr>
@@ -3514,7 +3514,7 @@
         </w:tc>
         <w:tc>
           <w:tcPr>
-            <w:tcW w:w="8252" w:type="dxa"/>
+            <w:tcW w:w="8059" w:type="dxa"/>
             <w:tcBorders/>
             <w:vAlign w:val="center"/>
           </w:tcPr>
@@ -3536,7 +3536,7 @@
         <w:trPr/>
         <w:tc>
           <w:tcPr>
-            <w:tcW w:w="1500" w:type="dxa"/>
+            <w:tcW w:w="1693" w:type="dxa"/>
             <w:tcBorders/>
             <w:vAlign w:val="center"/>
           </w:tcPr>
@@ -3555,7 +3555,7 @@
         </w:tc>
         <w:tc>
           <w:tcPr>
-            <w:tcW w:w="8252" w:type="dxa"/>
+            <w:tcW w:w="8059" w:type="dxa"/>
             <w:tcBorders/>
             <w:vAlign w:val="center"/>
           </w:tcPr>
@@ -3577,7 +3577,7 @@
         <w:trPr/>
         <w:tc>
           <w:tcPr>
-            <w:tcW w:w="1500" w:type="dxa"/>
+            <w:tcW w:w="1693" w:type="dxa"/>
             <w:tcBorders/>
             <w:vAlign w:val="center"/>
           </w:tcPr>
@@ -3596,7 +3596,7 @@
         </w:tc>
         <w:tc>
           <w:tcPr>
-            <w:tcW w:w="8252" w:type="dxa"/>
+            <w:tcW w:w="8059" w:type="dxa"/>
             <w:tcBorders/>
             <w:vAlign w:val="center"/>
           </w:tcPr>
@@ -3618,7 +3618,7 @@
         <w:trPr/>
         <w:tc>
           <w:tcPr>
-            <w:tcW w:w="1500" w:type="dxa"/>
+            <w:tcW w:w="1693" w:type="dxa"/>
             <w:tcBorders/>
             <w:vAlign w:val="center"/>
           </w:tcPr>
@@ -3637,7 +3637,7 @@
         </w:tc>
         <w:tc>
           <w:tcPr>
-            <w:tcW w:w="8252" w:type="dxa"/>
+            <w:tcW w:w="8059" w:type="dxa"/>
             <w:tcBorders/>
             <w:vAlign w:val="center"/>
           </w:tcPr>
@@ -3659,7 +3659,7 @@
         <w:trPr/>
         <w:tc>
           <w:tcPr>
-            <w:tcW w:w="1500" w:type="dxa"/>
+            <w:tcW w:w="1693" w:type="dxa"/>
             <w:tcBorders/>
             <w:vAlign w:val="center"/>
           </w:tcPr>
@@ -3678,7 +3678,7 @@
         </w:tc>
         <w:tc>
           <w:tcPr>
-            <w:tcW w:w="8252" w:type="dxa"/>
+            <w:tcW w:w="8059" w:type="dxa"/>
             <w:tcBorders/>
             <w:vAlign w:val="center"/>
           </w:tcPr>
@@ -3700,7 +3700,7 @@
         <w:trPr/>
         <w:tc>
           <w:tcPr>
-            <w:tcW w:w="1500" w:type="dxa"/>
+            <w:tcW w:w="1693" w:type="dxa"/>
             <w:tcBorders/>
             <w:vAlign w:val="center"/>
           </w:tcPr>
@@ -3719,7 +3719,7 @@
         </w:tc>
         <w:tc>
           <w:tcPr>
-            <w:tcW w:w="8252" w:type="dxa"/>
+            <w:tcW w:w="8059" w:type="dxa"/>
             <w:tcBorders/>
             <w:vAlign w:val="center"/>
           </w:tcPr>
@@ -3741,39 +3741,39 @@
         <w:trPr/>
         <w:tc>
           <w:tcPr>
-            <w:tcW w:w="1500" w:type="dxa"/>
-            <w:tcBorders/>
-            <w:vAlign w:val="center"/>
-          </w:tcPr>
-          <w:p>
-            <w:pPr>
-              <w:pStyle w:val="TableContents"/>
-              <w:bidi w:val="0"/>
-              <w:spacing w:before="0" w:after="283"/>
-              <w:rPr/>
-            </w:pPr>
-            <w:r>
-              <w:rPr/>
-              <w:t>Clock Offset</w:t>
-            </w:r>
-          </w:p>
-        </w:tc>
-        <w:tc>
-          <w:tcPr>
-            <w:tcW w:w="8252" w:type="dxa"/>
-            <w:tcBorders/>
-            <w:vAlign w:val="center"/>
-          </w:tcPr>
-          <w:p>
-            <w:pPr>
-              <w:pStyle w:val="TableContents"/>
-              <w:bidi w:val="0"/>
-              <w:spacing w:before="0" w:after="283"/>
-              <w:rPr/>
-            </w:pPr>
-            <w:r>
-              <w:rPr/>
-              <w:t>Apply a common correction to stored sight times.</w:t>
+            <w:tcW w:w="1693" w:type="dxa"/>
+            <w:tcBorders/>
+            <w:vAlign w:val="center"/>
+          </w:tcPr>
+          <w:p>
+            <w:pPr>
+              <w:pStyle w:val="TableContents"/>
+              <w:bidi w:val="0"/>
+              <w:spacing w:before="0" w:after="283"/>
+              <w:rPr/>
+            </w:pPr>
+            <w:r>
+              <w:rPr/>
+              <w:t>Manage Sights…</w:t>
+            </w:r>
+          </w:p>
+        </w:tc>
+        <w:tc>
+          <w:tcPr>
+            <w:tcW w:w="8059" w:type="dxa"/>
+            <w:tcBorders/>
+            <w:vAlign w:val="center"/>
+          </w:tcPr>
+          <w:p>
+            <w:pPr>
+              <w:pStyle w:val="TableContents"/>
+              <w:bidi w:val="0"/>
+              <w:spacing w:before="0" w:after="283"/>
+              <w:rPr/>
+            </w:pPr>
+            <w:r>
+              <w:rPr/>
+              <w:t>Save a dated XML backup, add sights from another log, or restore a complete log.</w:t>
             </w:r>
           </w:p>
         </w:tc>
@@ -3782,39 +3782,39 @@
         <w:trPr/>
         <w:tc>
           <w:tcPr>
-            <w:tcW w:w="1500" w:type="dxa"/>
-            <w:tcBorders/>
-            <w:vAlign w:val="center"/>
-          </w:tcPr>
-          <w:p>
-            <w:pPr>
-              <w:pStyle w:val="TableContents"/>
-              <w:bidi w:val="0"/>
-              <w:spacing w:before="0" w:after="283"/>
-              <w:rPr/>
-            </w:pPr>
-            <w:r>
-              <w:rPr/>
-              <w:t>Hide Sights / Show Sights</w:t>
-            </w:r>
-          </w:p>
-        </w:tc>
-        <w:tc>
-          <w:tcPr>
-            <w:tcW w:w="8252" w:type="dxa"/>
-            <w:tcBorders/>
-            <w:vAlign w:val="center"/>
-          </w:tcPr>
-          <w:p>
-            <w:pPr>
-              <w:pStyle w:val="TableContents"/>
-              <w:bidi w:val="0"/>
-              <w:spacing w:before="0" w:after="283"/>
-              <w:rPr/>
-            </w:pPr>
-            <w:r>
-              <w:rPr/>
-              <w:t>Collapse or restore the sight list and controls.</w:t>
+            <w:tcW w:w="1693" w:type="dxa"/>
+            <w:tcBorders/>
+            <w:vAlign w:val="center"/>
+          </w:tcPr>
+          <w:p>
+            <w:pPr>
+              <w:pStyle w:val="TableContents"/>
+              <w:bidi w:val="0"/>
+              <w:spacing w:before="0" w:after="283"/>
+              <w:rPr/>
+            </w:pPr>
+            <w:r>
+              <w:rPr/>
+              <w:t>Clock Offset</w:t>
+            </w:r>
+          </w:p>
+        </w:tc>
+        <w:tc>
+          <w:tcPr>
+            <w:tcW w:w="8059" w:type="dxa"/>
+            <w:tcBorders/>
+            <w:vAlign w:val="center"/>
+          </w:tcPr>
+          <w:p>
+            <w:pPr>
+              <w:pStyle w:val="TableContents"/>
+              <w:bidi w:val="0"/>
+              <w:spacing w:before="0" w:after="283"/>
+              <w:rPr/>
+            </w:pPr>
+            <w:r>
+              <w:rPr/>
+              <w:t>Apply a common correction to stored sight times.</w:t>
             </w:r>
           </w:p>
         </w:tc>
@@ -3823,39 +3823,39 @@
         <w:trPr/>
         <w:tc>
           <w:tcPr>
-            <w:tcW w:w="1500" w:type="dxa"/>
-            <w:tcBorders/>
-            <w:vAlign w:val="center"/>
-          </w:tcPr>
-          <w:p>
-            <w:pPr>
-              <w:pStyle w:val="TableContents"/>
-              <w:bidi w:val="0"/>
-              <w:spacing w:before="0" w:after="283"/>
-              <w:rPr/>
-            </w:pPr>
-            <w:r>
-              <w:rPr/>
-              <w:t>Documentation</w:t>
-            </w:r>
-          </w:p>
-        </w:tc>
-        <w:tc>
-          <w:tcPr>
-            <w:tcW w:w="8252" w:type="dxa"/>
-            <w:tcBorders/>
-            <w:vAlign w:val="center"/>
-          </w:tcPr>
-          <w:p>
-            <w:pPr>
-              <w:pStyle w:val="TableContents"/>
-              <w:bidi w:val="0"/>
-              <w:spacing w:before="0" w:after="283"/>
-              <w:rPr/>
-            </w:pPr>
-            <w:r>
-              <w:rPr/>
-              <w:t>Open this completely offline manual in the plugin's internal viewer.</w:t>
+            <w:tcW w:w="1693" w:type="dxa"/>
+            <w:tcBorders/>
+            <w:vAlign w:val="center"/>
+          </w:tcPr>
+          <w:p>
+            <w:pPr>
+              <w:pStyle w:val="TableContents"/>
+              <w:bidi w:val="0"/>
+              <w:spacing w:before="0" w:after="283"/>
+              <w:rPr/>
+            </w:pPr>
+            <w:r>
+              <w:rPr/>
+              <w:t>Hide sight log / Show sight log</w:t>
+            </w:r>
+          </w:p>
+        </w:tc>
+        <w:tc>
+          <w:tcPr>
+            <w:tcW w:w="8059" w:type="dxa"/>
+            <w:tcBorders/>
+            <w:vAlign w:val="center"/>
+          </w:tcPr>
+          <w:p>
+            <w:pPr>
+              <w:pStyle w:val="TableContents"/>
+              <w:bidi w:val="0"/>
+              <w:spacing w:before="0" w:after="283"/>
+              <w:rPr/>
+            </w:pPr>
+            <w:r>
+              <w:rPr/>
+              <w:t>Collapse or restore the sight list; this does not hide its chart plots.</w:t>
             </w:r>
           </w:p>
         </w:tc>
@@ -3864,7 +3864,89 @@
         <w:trPr/>
         <w:tc>
           <w:tcPr>
-            <w:tcW w:w="1500" w:type="dxa"/>
+            <w:tcW w:w="1693" w:type="dxa"/>
+            <w:tcBorders/>
+            <w:vAlign w:val="center"/>
+          </w:tcPr>
+          <w:p>
+            <w:pPr>
+              <w:pStyle w:val="TableContents"/>
+              <w:bidi w:val="0"/>
+              <w:spacing w:before="0" w:after="283"/>
+              <w:rPr/>
+            </w:pPr>
+            <w:r>
+              <w:rPr/>
+              <w:t>Chart display…</w:t>
+            </w:r>
+          </w:p>
+        </w:tc>
+        <w:tc>
+          <w:tcPr>
+            <w:tcW w:w="8059" w:type="dxa"/>
+            <w:tcBorders/>
+            <w:vAlign w:val="center"/>
+          </w:tcPr>
+          <w:p>
+            <w:pPr>
+              <w:pStyle w:val="TableContents"/>
+              <w:bidi w:val="0"/>
+              <w:spacing w:before="0" w:after="283"/>
+              <w:rPr/>
+            </w:pPr>
+            <w:r>
+              <w:rPr/>
+              <w:t>Adjust nominal line width, contrasting outline, uncertainty shading and hover labels for all sights.</w:t>
+            </w:r>
+          </w:p>
+        </w:tc>
+      </w:tr>
+      <w:tr>
+        <w:trPr/>
+        <w:tc>
+          <w:tcPr>
+            <w:tcW w:w="1693" w:type="dxa"/>
+            <w:tcBorders/>
+            <w:vAlign w:val="center"/>
+          </w:tcPr>
+          <w:p>
+            <w:pPr>
+              <w:pStyle w:val="TableContents"/>
+              <w:bidi w:val="0"/>
+              <w:spacing w:before="0" w:after="283"/>
+              <w:rPr/>
+            </w:pPr>
+            <w:r>
+              <w:rPr/>
+              <w:t>Documentation</w:t>
+            </w:r>
+          </w:p>
+        </w:tc>
+        <w:tc>
+          <w:tcPr>
+            <w:tcW w:w="8059" w:type="dxa"/>
+            <w:tcBorders/>
+            <w:vAlign w:val="center"/>
+          </w:tcPr>
+          <w:p>
+            <w:pPr>
+              <w:pStyle w:val="TableContents"/>
+              <w:bidi w:val="0"/>
+              <w:spacing w:before="0" w:after="283"/>
+              <w:rPr/>
+            </w:pPr>
+            <w:r>
+              <w:rPr/>
+              <w:t>Open this completely offline manual in the plugin's internal viewer.</w:t>
+            </w:r>
+          </w:p>
+        </w:tc>
+      </w:tr>
+      <w:tr>
+        <w:trPr/>
+        <w:tc>
+          <w:tcPr>
+            <w:tcW w:w="1693" w:type="dxa"/>
             <w:tcBorders/>
             <w:vAlign w:val="center"/>
           </w:tcPr>
@@ -3883,7 +3965,7 @@
         </w:tc>
         <w:tc>
           <w:tcPr>
-            <w:tcW w:w="8252" w:type="dxa"/>
+            <w:tcW w:w="8059" w:type="dxa"/>
             <w:tcBorders/>
             <w:vAlign w:val="center"/>
           </w:tcPr>
@@ -3910,6 +3992,58 @@
       </w:pPr>
       <w:r>
         <w:rPr/>
+        <w:t xml:space="preserve">The nominal COP is an opaque central stroke in the sight colour, with an automatic black or white outline. Its default width is 0.5 mm, scaled for the display. </w:t>
+      </w:r>
+      <w:r>
+        <w:rPr>
+          <w:rStyle w:val="Strong"/>
+        </w:rPr>
+        <w:t>Chart display…</w:t>
+      </w:r>
+      <w:r>
+        <w:rPr/>
+        <w:t xml:space="preserve"> remembers a global width (0.2–2.0 mm) and an independent shading multiplier; reducing uncertainty shading does not fade or move the nominal line. The per-sight transparency remains available. The shaded region represents input uncertainty, not a guaranteed position bound.</w:t>
+      </w:r>
+    </w:p>
+    <w:p>
+      <w:pPr>
+        <w:pStyle w:val="BodyText"/>
+        <w:bidi w:val="0"/>
+        <w:rPr/>
+      </w:pPr>
+      <w:r>
+        <w:rPr/>
+        <w:t xml:space="preserve">Hover near a plotted nominal line to see the body, corrected UTC and sight number. Overlapping COPs list up to four nearby sights and report any further matches. In a sight's </w:t>
+      </w:r>
+      <w:r>
+        <w:rPr>
+          <w:rStyle w:val="Strong"/>
+        </w:rPr>
+        <w:t>Config</w:t>
+      </w:r>
+      <w:r>
+        <w:rPr/>
+        <w:t xml:space="preserve"> tab, choose a named colour or use the custom colour picker. Non-palette colours are labelled </w:t>
+      </w:r>
+      <w:r>
+        <w:rPr>
+          <w:rStyle w:val="Strong"/>
+        </w:rPr>
+        <w:t>Custom (#RRGGBB)</w:t>
+      </w:r>
+      <w:r>
+        <w:rPr/>
+        <w:t>. Existing colours are retained; use the sight log and hover labels, not colour alone, to identify observations.</w:t>
+      </w:r>
+    </w:p>
+    <w:p>
+      <w:pPr>
+        <w:pStyle w:val="BodyText"/>
+        <w:bidi w:val="0"/>
+        <w:rPr/>
+      </w:pPr>
+      <w:r>
+        <w:rPr/>
         <w:t xml:space="preserve">Editors use task-specific actions: </w:t>
       </w:r>
       <w:r>
@@ -3972,6 +4106,74 @@
       <w:r>
         <w:rPr/>
         <w:t>Creating a sight selects it and clears the previous selection. Deleting a selected sight moves the selection to an adjacent sight when one remains, so there is deliberately no unselected state while the list is non-empty.</w:t>
+      </w:r>
+    </w:p>
+    <w:p>
+      <w:pPr>
+        <w:pStyle w:val="BodyText"/>
+        <w:bidi w:val="0"/>
+        <w:rPr/>
+      </w:pPr>
+      <w:r>
+        <w:rPr>
+          <w:rStyle w:val="Strong"/>
+        </w:rPr>
+        <w:t>Remarks</w:t>
+      </w:r>
+      <w:r>
+        <w:rPr/>
+        <w:t xml:space="preserve"> stores a short note with an observation without altering its calculation. Enter it on the Sight Properties Parameters tab or in the Horizon Event editor. It is also shown in the main list.</w:t>
+      </w:r>
+    </w:p>
+    <w:p>
+      <w:pPr>
+        <w:pStyle w:val="BodyText"/>
+        <w:bidi w:val="0"/>
+        <w:rPr/>
+      </w:pPr>
+      <w:r>
+        <w:rPr/>
+        <w:t xml:space="preserve">The current log is saved automatically in </w:t>
+      </w:r>
+      <w:r>
+        <w:rPr>
+          <w:rStyle w:val="SourceText"/>
+        </w:rPr>
+        <w:t>Sights.xml</w:t>
+      </w:r>
+      <w:r>
+        <w:rPr/>
+        <w:t xml:space="preserve">. </w:t>
+      </w:r>
+      <w:r>
+        <w:rPr>
+          <w:rStyle w:val="Strong"/>
+        </w:rPr>
+        <w:t>Manage Sights… → Save backup of all sights...</w:t>
+      </w:r>
+      <w:r>
+        <w:rPr/>
+        <w:t xml:space="preserve"> offers a dated XML copy, initially in Downloads; choose another location if preferred. </w:t>
+      </w:r>
+      <w:r>
+        <w:rPr>
+          <w:rStyle w:val="Strong"/>
+        </w:rPr>
+        <w:t>Import sights (add to current log)...</w:t>
+      </w:r>
+      <w:r>
+        <w:rPr/>
+        <w:t xml:space="preserve"> adds sights and saved lunar solutions from another log and requires the same global clock correction. </w:t>
+      </w:r>
+      <w:r>
+        <w:rPr>
+          <w:rStyle w:val="Strong"/>
+        </w:rPr>
+        <w:t>Restore sights (replace current log)...</w:t>
+      </w:r>
+      <w:r>
+        <w:rPr/>
+        <w:t xml:space="preserve"> replaces both the log and its clock correction. Both operations validate the file and save a dated safety backup before changing the current log. Older files open with empty Remarks; older plugin versions may discard remarks when rewriting a newer file, so retain a backup before returning to an older version.</w:t>
       </w:r>
     </w:p>
     <w:p>
@@ -4719,7 +4921,27 @@
       </w:r>
       <w:r>
         <w:rPr/>
-        <w:t>. Eye height is reloaded from the main plugin defaults each time.</w:t>
+        <w:t xml:space="preserve">. Eye height is reloaded from the main plugin defaults each time. Related fields stay together when the header wraps. </w:t>
+      </w:r>
+      <w:r>
+        <w:rPr>
+          <w:rStyle w:val="Strong"/>
+        </w:rPr>
+        <w:t>−1 h</w:t>
+      </w:r>
+      <w:r>
+        <w:rPr/>
+        <w:t xml:space="preserve"> and </w:t>
+      </w:r>
+      <w:r>
+        <w:rPr>
+          <w:rStyle w:val="Strong"/>
+        </w:rPr>
+        <w:t>+1 h</w:t>
+      </w:r>
+      <w:r>
+        <w:rPr/>
+        <w:t xml:space="preserve"> step the complete sky by one UTC hour, switching to manual time. With a moving observer, the entered position advances too and switches to Manual.</w:t>
       </w:r>
     </w:p>
     <w:p>
@@ -4774,7 +4996,68 @@
       </w:pPr>
       <w:r>
         <w:rPr/>
-        <w:t xml:space="preserve">The body list shows every catalogued body whose geometric Hc is at or above the horizon. Click any column heading to sort the table; click it again to reverse the order. </w:t>
+        <w:t xml:space="preserve">Choose a planning mode: </w:t>
+      </w:r>
+      <w:r>
+        <w:rPr>
+          <w:rStyle w:val="Strong"/>
+        </w:rPr>
+        <w:t>Practical Fix</w:t>
+      </w:r>
+      <w:r>
+        <w:rPr/>
+        <w:t xml:space="preserve"> favours observable bodies and pair/triad geometry; </w:t>
+      </w:r>
+      <w:r>
+        <w:rPr>
+          <w:rStyle w:val="Strong"/>
+        </w:rPr>
+        <w:t>Bright Bodies</w:t>
+      </w:r>
+      <w:r>
+        <w:rPr/>
+        <w:t xml:space="preserve"> puts brightness first; </w:t>
+      </w:r>
+      <w:r>
+        <w:rPr>
+          <w:rStyle w:val="Strong"/>
+        </w:rPr>
+        <w:t>Lunar Candidates</w:t>
+      </w:r>
+      <w:r>
+        <w:rPr/>
+        <w:t xml:space="preserve"> compares potential companions with the Moon; </w:t>
+      </w:r>
+      <w:r>
+        <w:rPr>
+          <w:rStyle w:val="Strong"/>
+        </w:rPr>
+        <w:t>Show All</w:t>
+      </w:r>
+      <w:r>
+        <w:rPr/>
+        <w:t xml:space="preserve"> lists bodies alphabetically.</w:t>
+      </w:r>
+    </w:p>
+    <w:p>
+      <w:pPr>
+        <w:pStyle w:val="BodyText"/>
+        <w:bidi w:val="0"/>
+        <w:rPr/>
+      </w:pPr>
+      <w:r>
+        <w:rPr/>
+        <w:t xml:space="preserve">The full body list remains available in each mode. It includes bodies above the geometric horizon; </w:t>
+      </w:r>
+      <w:r>
+        <w:rPr>
+          <w:rStyle w:val="Strong"/>
+        </w:rPr>
+        <w:t>Include below-horizon bodies</w:t>
+      </w:r>
+      <w:r>
+        <w:rPr/>
+        <w:t xml:space="preserve"> adds the rest. Click a column heading to sort it and again to reverse the order. </w:t>
       </w:r>
       <w:r>
         <w:rPr>
@@ -4784,29 +5067,235 @@
       </w:r>
       <w:r>
         <w:rPr/>
-        <w:t xml:space="preserve"> optionally applies the adjacent, editable minimum and maximum only to suggested pairs and triads. The initial preferred range is 10°–75°. Bodies outside it remain in the table and are marked below or above the preferred Hc; disabling the option makes every listed body eligible for recommendations.</w:t>
-      </w:r>
-    </w:p>
-    <w:p>
-      <w:pPr>
-        <w:pStyle w:val="BodyText"/>
-        <w:bidi w:val="0"/>
-        <w:rPr/>
-      </w:pPr>
-      <w:r>
-        <w:rPr/>
-        <w:t>The individual score gives 65% weight to altitude near 40° and 35% to brightness, with a daylight/twilight penalty for stars. Planets currently receive no equivalent twilight penalty, so the score is not by itself a guarantee that Mercury or another planet is practically observable. Suggested pairs additionally favour a crossing angle near 90°; triads rank their two-dimensional bearing geometry separately.</w:t>
-      </w:r>
-    </w:p>
-    <w:p>
-      <w:pPr>
-        <w:pStyle w:val="BodyText"/>
-        <w:bidi w:val="0"/>
-        <w:rPr/>
-      </w:pPr>
-      <w:r>
-        <w:rPr/>
-        <w:t>The polar sky plot has independent magnitude limits of 1, 2 or 3 and can optionally show bodies below the horizon. Sun symbols are yellow, the Moon is blue, planets are red, stars rendered during daylight are grey, and below-horizon bodies are hollow. Labels favour the brightest bodies and share the available label allowance across the four compass quadrants. The allowance adapts to the plot size, and labels are still suppressed when they would overlap; an unlabeled dot does not mean the body is absent from the catalogue.</w:t>
+        <w:t xml:space="preserve"> optionally applies the adjacent, editable minimum and maximum only to suggested pairs and triads. The initial preferred range is 10°–75°. Bodies outside it remain in the table and are marked below or above the preferred Hc; disabling the option makes every above-horizon body eligible for recommendations. All eligible bodies are considered for pair/triad geometry. Three-body fixes are listed first. Polaris remains available in the body list and latitude helper; enable </w:t>
+      </w:r>
+      <w:r>
+        <w:rPr>
+          <w:rStyle w:val="Strong"/>
+        </w:rPr>
+        <w:t>Include Polaris in fixes</w:t>
+      </w:r>
+      <w:r>
+        <w:rPr/>
+        <w:t xml:space="preserve"> to include its mainly latitude constraint in recommendations with other suitable bearings. Daylight stars remain listed but are excluded from recommended fixes.</w:t>
+      </w:r>
+    </w:p>
+    <w:p>
+      <w:pPr>
+        <w:pStyle w:val="BodyText"/>
+        <w:bidi w:val="0"/>
+        <w:rPr/>
+      </w:pPr>
+      <w:r>
+        <w:rPr>
+          <w:rStyle w:val="Strong"/>
+        </w:rPr>
+        <w:t>Lunar Candidates</w:t>
+      </w:r>
+      <w:r>
+        <w:rPr/>
+        <w:t xml:space="preserve"> shows geocentric Moon-body distance, signed distance rate, seconds represented by 0.1′, companion magnitude and ecliptic latitude, altitudes, bearings, illumination and guidance. A positive rate means increasing distance. Both planners initially offer </w:t>
+      </w:r>
+      <w:r>
+        <w:rPr>
+          <w:rStyle w:val="Strong"/>
+        </w:rPr>
+        <w:t>Traditional lunar companions</w:t>
+      </w:r>
+      <w:r>
+        <w:rPr/>
+        <w:t xml:space="preserve">: Sun, Venus, Mars, Jupiter, Saturn, Aldebaran, Altair, Antares, Fomalhaut, Hamal, Markab, Pollux, Regulus and Spica. Choose </w:t>
+      </w:r>
+      <w:r>
+        <w:rPr>
+          <w:rStyle w:val="Strong"/>
+        </w:rPr>
+        <w:t>All calculated companions</w:t>
+      </w:r>
+      <w:r>
+        <w:rPr/>
+        <w:t xml:space="preserve"> to compare other bodies; the general body list is unaffected.</w:t>
+      </w:r>
+    </w:p>
+    <w:p>
+      <w:pPr>
+        <w:pStyle w:val="BodyText"/>
+        <w:bidi w:val="0"/>
+        <w:rPr/>
+      </w:pPr>
+      <w:r>
+        <w:rPr/>
+        <w:t xml:space="preserve">The practical lunar order prefers fewer cautions, then brighter companions, then timing sensitivity. Choose </w:t>
+      </w:r>
+      <w:r>
+        <w:rPr>
+          <w:rStyle w:val="Strong"/>
+        </w:rPr>
+        <w:t>Lunar order: timing sensitivity</w:t>
+      </w:r>
+      <w:r>
+        <w:rPr/>
+        <w:t xml:space="preserve"> to put timing first. Below-horizon pairs remain last. Cautions flag altitude outside 10°–75°, distance outside 20°–100°, absolute rate below 10′/hour, companion magnitude above 1.5, or Sun above −6° for companions fainter than magnitude −2. Ecliptic latitude is context, not an extra penalty on the actual distance rate. The 0.1′ time describes distance sensitivity alone, not the uncertainty of a complete lunar observation or position solution.</w:t>
+      </w:r>
+    </w:p>
+    <w:p>
+      <w:pPr>
+        <w:pStyle w:val="BodyText"/>
+        <w:bidi w:val="0"/>
+        <w:rPr/>
+      </w:pPr>
+      <w:r>
+        <w:rPr/>
+        <w:t xml:space="preserve">Select a companion in </w:t>
+      </w:r>
+      <w:r>
+        <w:rPr>
+          <w:rStyle w:val="Strong"/>
+        </w:rPr>
+        <w:t>All bodies</w:t>
+      </w:r>
+      <w:r>
+        <w:rPr/>
+        <w:t xml:space="preserve">, then choose </w:t>
+      </w:r>
+      <w:r>
+        <w:rPr>
+          <w:rStyle w:val="Strong"/>
+        </w:rPr>
+        <w:t>Lunar windows for selected body…</w:t>
+      </w:r>
+      <w:r>
+        <w:rPr/>
+        <w:t xml:space="preserve"> to search the next 24 hours in 10-minute samples. Results show intervals meeting the above preferences and the best sampled timing within each interval. The search uses the entered moving-observer course and speed when enabled. Boundaries are approximate; an empty result does not prove that the pair cannot be observed.</w:t>
+      </w:r>
+    </w:p>
+    <w:p>
+      <w:pPr>
+        <w:pStyle w:val="BodyText"/>
+        <w:bidi w:val="0"/>
+        <w:rPr/>
+      </w:pPr>
+      <w:r>
+        <w:rPr/>
+        <w:t xml:space="preserve">The </w:t>
+      </w:r>
+      <w:r>
+        <w:rPr>
+          <w:rStyle w:val="Strong"/>
+        </w:rPr>
+        <w:t>Visibility</w:t>
+      </w:r>
+      <w:r>
+        <w:rPr/>
+        <w:t xml:space="preserve"> column gives guidance rather than a probability of seeing a body. </w:t>
+      </w:r>
+      <w:r>
+        <w:rPr>
+          <w:rStyle w:val="Strong"/>
+        </w:rPr>
+        <w:t>Why</w:t>
+      </w:r>
+      <w:r>
+        <w:rPr/>
+        <w:t xml:space="preserve"> distinguishes visibility from sextant handling. The internal planning preference combines 75% brightness and sky conditions with 25% altitude handling; it favours moderate altitudes and advises presetting the sextant for high bright stars. Twilight penalises faint stars more than bright ones. Planets receive solar-glare/daylight penalties. Sun, Moon and planet magnitudes are representative values, not current photometry; check Moon phase and glare. Pair crossing angles and triad bearing geometry are assessed separately. Recommendation scores are heuristics, not accuracy estimates.</w:t>
+      </w:r>
+    </w:p>
+    <w:p>
+      <w:pPr>
+        <w:pStyle w:val="BodyText"/>
+        <w:bidi w:val="0"/>
+        <w:rPr/>
+      </w:pPr>
+      <w:r>
+        <w:rPr/>
+        <w:t xml:space="preserve">The plots have magnitude limits of 1, 2 or 3. </w:t>
+      </w:r>
+      <w:r>
+        <w:rPr>
+          <w:rStyle w:val="Strong"/>
+        </w:rPr>
+        <w:t>Star labels</w:t>
+      </w:r>
+      <w:r>
+        <w:rPr/>
+        <w:t xml:space="preserve"> offers </w:t>
+      </w:r>
+      <w:r>
+        <w:rPr>
+          <w:rStyle w:val="Strong"/>
+        </w:rPr>
+        <w:t>Sparse</w:t>
+      </w:r>
+      <w:r>
+        <w:rPr/>
+        <w:t xml:space="preserve">, </w:t>
+      </w:r>
+      <w:r>
+        <w:rPr>
+          <w:rStyle w:val="Strong"/>
+        </w:rPr>
+        <w:t>Balanced</w:t>
+      </w:r>
+      <w:r>
+        <w:rPr/>
+        <w:t xml:space="preserve"> (default) and </w:t>
+      </w:r>
+      <w:r>
+        <w:rPr>
+          <w:rStyle w:val="Strong"/>
+        </w:rPr>
+        <w:t>More</w:t>
+      </w:r>
+      <w:r>
+        <w:rPr/>
+        <w:t>. Names favour brighter bodies, use the available space and avoid other labels and dots; short leaders identify offset names. The selected body has first priority and remains plotted when above the horizon even if fainter than the magnitude limit. Hover over a dot for its name. More means as many labels as fit, so some crowded dots may remain unnamed. Label density is remembered independently of the magnitude filter.</w:t>
+      </w:r>
+    </w:p>
+    <w:p>
+      <w:pPr>
+        <w:pStyle w:val="BodyText"/>
+        <w:bidi w:val="0"/>
+        <w:rPr/>
+      </w:pPr>
+      <w:r>
+        <w:rPr>
+          <w:rStyle w:val="Strong"/>
+        </w:rPr>
+        <w:t>Local sky</w:t>
+      </w:r>
+      <w:r>
+        <w:rPr/>
+        <w:t xml:space="preserve"> shows altitude and true bearing at the selected instant. Sun symbols are yellow, Moon blue, planets red; daylight stars are grey and below-horizon bodies hollow. </w:t>
+      </w:r>
+      <w:r>
+        <w:rPr>
+          <w:rStyle w:val="Strong"/>
+        </w:rPr>
+        <w:t>Show ecliptic</w:t>
+      </w:r>
+      <w:r>
+        <w:rPr/>
+        <w:t xml:space="preserve"> draws the amber reference at that same instant. The blue </w:t>
+      </w:r>
+      <w:r>
+        <w:rPr>
+          <w:rStyle w:val="Strong"/>
+        </w:rPr>
+        <w:t>Show Moon path</w:t>
+      </w:r>
+      <w:r>
+        <w:rPr/>
+        <w:t xml:space="preserve"> overlay is available only on </w:t>
+      </w:r>
+      <w:r>
+        <w:rPr>
+          <w:rStyle w:val="Strong"/>
+        </w:rPr>
+        <w:t>SHA / Declination</w:t>
+      </w:r>
+      <w:r>
+        <w:rPr/>
+        <w:t>, where it shows motion relative to the stars over ±3, ±6 or ±12 hours with UTC labels at the start, selected time and end. Use the hour-step buttons to move the whole local sky together. The SHA chart includes the polar regions through ±90°.</w:t>
       </w:r>
     </w:p>
     <w:p>
@@ -6030,45 +6519,18 @@
         <w:rPr/>
       </w:pPr>
       <w:r>
-        <w:rPr>
-          <w:rStyle w:val="Strong"/>
-        </w:rPr>
-        <w:t>2.8.10 precision update:</w:t>
-      </w:r>
-      <w:r>
-        <w:rPr/>
-        <w:t xml:space="preserve"> a verified local DE440s kernel is used automatically for supported Sun, Moon, Mercury and Venus positions, including sights, planning and generated Almanacs. Moon–Sun, Moon–Mercury and Moon–Venus lunar pairs use it consistently. Automatic UTC handling starts in 1972 and requires a date within the kernel coverage. Other bodies, earlier dates and unavailable data retain the analytical fallback.</w:t>
-      </w:r>
-    </w:p>
-    <w:p>
-      <w:pPr>
-        <w:pStyle w:val="BodyText"/>
-        <w:bidi w:val="0"/>
-        <w:rPr/>
-      </w:pPr>
-      <w:r>
-        <w:rPr/>
-        <w:t xml:space="preserve">Install the optional kernel through </w:t>
-      </w:r>
-      <w:r>
-        <w:rPr>
-          <w:rStyle w:val="Strong"/>
-        </w:rPr>
-        <w:t>Eclipses… &gt; Download and install DE440s…</w:t>
-      </w:r>
-      <w:r>
-        <w:rPr/>
-        <w:t xml:space="preserve">, or import a local copy. Navigation still works offline without it. Neither lunar orientation nor LOLA terrain is required. The Almanac uses dated offline IERS DUT1 unless overridden and records sources and fallback on its </w:t>
-      </w:r>
-      <w:r>
-        <w:rPr>
-          <w:rStyle w:val="Strong"/>
-        </w:rPr>
-        <w:t>Sources and conventions</w:t>
-      </w:r>
-      <w:r>
-        <w:rPr/>
-        <w:t xml:space="preserve"> page. DE440s improves the ephemeris foundation, but exact agreement with a printed Almanac also depends on its conventions, time assumptions and rounding.</w:t>
+        <w:rPr/>
+        <w:t xml:space="preserve">When its checksum-verified local JPL DE440s kernel is installed and covers the sight date, Moon–Sun, Moon–Mercury and Moon–Venus calculations use it. Moon–star and other Moon–planet calculations use the bundled Compact engine by default for 1972–2100. Compact also supplies the fallback when DE440s is unavailable. In Lunar Tools → Advanced, disable </w:t>
+      </w:r>
+      <w:r>
+        <w:rPr>
+          <w:rStyle w:val="Strong"/>
+        </w:rPr>
+        <w:t>Use compact analytical fallback (recommended)</w:t>
+      </w:r>
+      <w:r>
+        <w:rPr/>
+        <w:t xml:space="preserve"> to retain classic analytical calculations. Classic also handles dates outside Compact coverage or unavailable Compact data. The corrected lunar solver remains active with every provider, and the result identifies the source used. DE440s is optional for navigation, no calculation downloads data, and LOLA terrain is unrelated to lunar-distance clearing.</w:t>
       </w:r>
     </w:p>
     <w:p>
@@ -6956,7 +7418,49 @@
       </w:r>
       <w:r>
         <w:rPr/>
-        <w:t xml:space="preserve"> orders pairs by the approximate UTC change corresponding to 0.1′ of lunar distance, shortest first, with below-horizon pairs last. It shows centre separation, signed distance rate in arcminutes per hour, Moon/body altitude and true azimuth, Moon illumination, body magnitude and which body is below the geometric horizon. A small time value indicates greater timing sensitivity. There is no combined quality score: use the measured quantities to assess visibility, sextant range and whether the pair is practical to observe.</w:t>
+        <w:t xml:space="preserve"> uses the same default ordering and optional timing-first choice as </w:t>
+      </w:r>
+      <w:r>
+        <w:rPr>
+          <w:rStyle w:val="Strong"/>
+        </w:rPr>
+        <w:t>Bodies &amp; Best Sights</w:t>
+      </w:r>
+      <w:r>
+        <w:rPr/>
+        <w:t>, with below-horizon pairs last and the same traditional/all-companion choice. It shows centre separation, signed distance rate in arcminutes per hour, Moon/body altitude and true azimuth, Moon illumination, body magnitude and which body is below the geometric horizon. A small time value indicates greater timing sensitivity. There is no combined quality score: use the measured quantities to assess visibility, sextant range and whether the pair is practical to observe.</w:t>
+      </w:r>
+    </w:p>
+    <w:p>
+      <w:pPr>
+        <w:pStyle w:val="BodyText"/>
+        <w:bidi w:val="0"/>
+        <w:rPr/>
+      </w:pPr>
+      <w:r>
+        <w:rPr/>
+        <w:t>In 2.9.0 this table also shows the companion's signed ecliptic latitude and guidance derived from the same planning model as the main planner.</w:t>
+      </w:r>
+    </w:p>
+    <w:p>
+      <w:pPr>
+        <w:pStyle w:val="BodyText"/>
+        <w:bidi w:val="0"/>
+        <w:rPr/>
+      </w:pPr>
+      <w:r>
+        <w:rPr/>
+        <w:t xml:space="preserve">When a lunar solution reports several candidate UTCs, even very close values are </w:t>
+      </w:r>
+      <w:r>
+        <w:rPr>
+          <w:rStyle w:val="Strong"/>
+        </w:rPr>
+        <w:t>unresolved alternatives, not measurements to average</w:t>
+      </w:r>
+      <w:r>
+        <w:rPr/>
+        <w:t>. Use another observation or independent position/time evidence to distinguish them. A preferred candidate chosen by proximity to DR or entered UTC does not establish that the ambiguity has been resolved.</w:t>
       </w:r>
     </w:p>
     <w:p>
@@ -7771,6 +8275,57 @@
       </w:pPr>
       <w:r>
         <w:rPr/>
+        <w:t xml:space="preserve">The Eclipse window displays the local astronomy-data directory and expected filenames: </w:t>
+      </w:r>
+      <w:r>
+        <w:rPr>
+          <w:rStyle w:val="SourceText"/>
+        </w:rPr>
+        <w:t>de440s.bsp</w:t>
+      </w:r>
+      <w:r>
+        <w:rPr/>
+        <w:t xml:space="preserve">, </w:t>
+      </w:r>
+      <w:r>
+        <w:rPr>
+          <w:rStyle w:val="SourceText"/>
+        </w:rPr>
+        <w:t>moon_pa_de440_200625.bpc</w:t>
+      </w:r>
+      <w:r>
+        <w:rPr/>
+        <w:t xml:space="preserve"> and </w:t>
+      </w:r>
+      <w:r>
+        <w:rPr>
+          <w:rStyle w:val="SourceText"/>
+        </w:rPr>
+        <w:t>lola64-pa.bin</w:t>
+      </w:r>
+      <w:r>
+        <w:rPr/>
+        <w:t xml:space="preserve">. </w:t>
+      </w:r>
+      <w:r>
+        <w:rPr>
+          <w:rStyle w:val="Strong"/>
+        </w:rPr>
+        <w:t>Open astronomy data folder…</w:t>
+      </w:r>
+      <w:r>
+        <w:rPr/>
+        <w:t xml:space="preserve"> opens that directory. Use the import controls to install and verify downloaded files; merely placing a file there does not establish that it is valid.</w:t>
+      </w:r>
+    </w:p>
+    <w:p>
+      <w:pPr>
+        <w:pStyle w:val="BodyText"/>
+        <w:bidi w:val="0"/>
+        <w:rPr/>
+      </w:pPr>
+      <w:r>
+        <w:rPr/>
         <w:t xml:space="preserve">Select </w:t>
       </w:r>
       <w:r>
@@ -8378,7 +8933,7 @@
             </w:pPr>
             <w:r>
               <w:rPr/>
-              <w:t>Labels favour bright bodies, are shared across compass quadrants and are suppressed when they would overlap. Enlarge the planner or use the sortable body table to identify and inspect every listed body.</w:t>
+              <w:t>Labels favour bright bodies and avoid overlaps. Choose Balanced or More, enlarge the planner, hover over a dot, or select its body in the table to give its name priority.</w:t>
             </w:r>
           </w:p>
         </w:tc>

</xml_diff>